<commit_message>
[ADD] Agregar segunda tarea.
</commit_message>
<xml_diff>
--- a/Fase 1/Evidencias Grupales/1.5_GuiaEstudiante_Fase 1_Definicion Proyecto APT (Español).docx
+++ b/Fase 1/Evidencias Grupales/1.5_GuiaEstudiante_Fase 1_Definicion Proyecto APT (Español).docx
@@ -133,7 +133,7 @@
                         <wps:spPr>
                           <a:xfrm>
                             <a:off x="0" y="0"/>
-                            <a:ext cx="1105560" cy="1486440"/>
+                            <a:ext cx="1104840" cy="1486440"/>
                           </a:xfrm>
                           <a:prstGeom prst="rect">
                             <a:avLst/>
@@ -243,7 +243,7 @@
                   </v:textbox>
                   <w10:wrap type="none"/>
                 </v:rect>
-                <v:rect id="shape_0" fillcolor="#203864" stroked="f" o:allowincell="f" style="position:absolute;left:-685;top:53;width:1740;height:2340;mso-wrap-style:none;v-text-anchor:middle;mso-position-horizontal-relative:margin">
+                <v:rect id="shape_0" fillcolor="#203864" stroked="f" o:allowincell="f" style="position:absolute;left:-685;top:53;width:1739;height:2340;mso-wrap-style:none;v-text-anchor:middle;mso-position-horizontal-relative:margin">
                   <v:fill o:detectmouseclick="t" type="solid" color2="#dfc79b"/>
                   <v:stroke color="#3465a4" weight="12600" joinstyle="miter" endcap="flat"/>
                   <w10:wrap type="none"/>
@@ -2597,8 +2597,8 @@
         <w:tblLook w:val="04a0" w:firstRow="1" w:noVBand="1" w:lastRow="0" w:firstColumn="1" w:lastColumn="0" w:noHBand="0"/>
       </w:tblPr>
       <w:tblGrid>
-        <w:gridCol w:w="2636"/>
-        <w:gridCol w:w="6862"/>
+        <w:gridCol w:w="2635"/>
+        <w:gridCol w:w="6863"/>
       </w:tblGrid>
       <w:tr>
         <w:trPr>
@@ -2606,7 +2606,7 @@
         </w:trPr>
         <w:tc>
           <w:tcPr>
-            <w:tcW w:w="2636" w:type="dxa"/>
+            <w:tcW w:w="2635" w:type="dxa"/>
             <w:tcBorders>
               <w:top w:val="single" w:sz="4" w:space="0" w:color="BFBFBF"/>
               <w:start w:val="single" w:sz="4" w:space="0" w:color="BFBFBF"/>
@@ -2640,7 +2640,7 @@
         </w:tc>
         <w:tc>
           <w:tcPr>
-            <w:tcW w:w="6862" w:type="dxa"/>
+            <w:tcW w:w="6863" w:type="dxa"/>
             <w:tcBorders>
               <w:top w:val="single" w:sz="4" w:space="0" w:color="BFBFBF"/>
               <w:start w:val="single" w:sz="4" w:space="0" w:color="BFBFBF"/>
@@ -2717,7 +2717,7 @@
         </w:trPr>
         <w:tc>
           <w:tcPr>
-            <w:tcW w:w="2636" w:type="dxa"/>
+            <w:tcW w:w="2635" w:type="dxa"/>
             <w:tcBorders>
               <w:top w:val="single" w:sz="4" w:space="0" w:color="BFBFBF"/>
               <w:start w:val="single" w:sz="4" w:space="0" w:color="BFBFBF"/>
@@ -2751,7 +2751,7 @@
         </w:tc>
         <w:tc>
           <w:tcPr>
-            <w:tcW w:w="6862" w:type="dxa"/>
+            <w:tcW w:w="6863" w:type="dxa"/>
             <w:tcBorders>
               <w:top w:val="single" w:sz="4" w:space="0" w:color="BFBFBF"/>
               <w:start w:val="single" w:sz="4" w:space="0" w:color="BFBFBF"/>
@@ -3282,7 +3282,37 @@
                 <w:szCs w:val="20"/>
                 <w:lang w:val="es-CL" w:eastAsia="es-CL" w:bidi="ar-SA"/>
               </w:rPr>
-              <w:t>Debido a que el equipo está compuesto por dos integrantes, ambos podrán participar transversalmente en distintas áreas del proyecto. Sin embargo, se establecerán responsabilidades principales. Ángel Rojas asumirá el rol de Líder Técnico y Desarrollador Principal, siendo responsable principalmente de la arquitectura de software, decisiones técnicas, programación, integración y rendimiento del sistema. Álvaro Castro asumirá el rol de Jefe de Proyecto, siendo responsable principalmente de la planificación, seguimiento del proyecto, gestión de riesgos, presupuesto, coordinación de playtests, comunicación con usuarios y gestión de los recursos necesarios para el desarrollo, incluyendo el área de diseño sonoro.</w:t>
+              <w:t xml:space="preserve">Debido a que el equipo está compuesto por dos integrantes, ambos podrán participar transversalmente en distintas áreas del proyecto. Sin embargo, se establecerán responsabilidades principales. </w:t>
+            </w:r>
+            <w:r>
+              <w:rPr>
+                <w:rFonts w:eastAsia="Calibri" w:cs="Arial"/>
+                <w:b w:val="false"/>
+                <w:bCs w:val="false"/>
+                <w:i w:val="false"/>
+                <w:iCs w:val="false"/>
+                <w:color w:val="000000"/>
+                <w:kern w:val="0"/>
+                <w:sz w:val="20"/>
+                <w:szCs w:val="20"/>
+                <w:lang w:val="es-CL" w:eastAsia="es-CL" w:bidi="ar-SA"/>
+              </w:rPr>
+              <w:t>A</w:t>
+            </w:r>
+            <w:r>
+              <w:rPr>
+                <w:rFonts w:eastAsia="Calibri" w:cs="Arial"/>
+                <w:b w:val="false"/>
+                <w:bCs w:val="false"/>
+                <w:i w:val="false"/>
+                <w:iCs w:val="false"/>
+                <w:color w:val="000000"/>
+                <w:kern w:val="0"/>
+                <w:sz w:val="20"/>
+                <w:szCs w:val="20"/>
+                <w:lang w:val="es-CL" w:eastAsia="es-CL" w:bidi="ar-SA"/>
+              </w:rPr>
+              <w:t>ngel Rojas asumirá el rol de Líder Técnico y Desarrollador Principal, siendo responsable principalmente de la arquitectura de software, decisiones técnicas, programación, integración y rendimiento del sistema. Álvaro Castro asumirá el rol de Jefe de Proyecto, siendo responsable principalmente de la planificación, seguimiento del proyecto, gestión de riesgos, presupuesto, coordinación de playtests, comunicación con usuarios y gestión de los recursos necesarios para el desarrollo, incluyendo el área de diseño sonoro.</w:t>
             </w:r>
           </w:p>
           <w:p>
@@ -3497,9 +3527,9 @@
         <w:tblLook w:val="04a0" w:firstRow="1" w:noVBand="1" w:lastRow="0" w:firstColumn="1" w:lastColumn="0" w:noHBand="0"/>
       </w:tblPr>
       <w:tblGrid>
-        <w:gridCol w:w="1874"/>
+        <w:gridCol w:w="1873"/>
         <w:gridCol w:w="2125"/>
-        <w:gridCol w:w="3026"/>
+        <w:gridCol w:w="3027"/>
         <w:gridCol w:w="3037"/>
       </w:tblGrid>
       <w:tr>
@@ -3508,7 +3538,7 @@
         </w:trPr>
         <w:tc>
           <w:tcPr>
-            <w:tcW w:w="1874" w:type="dxa"/>
+            <w:tcW w:w="1873" w:type="dxa"/>
             <w:tcBorders>
               <w:top w:val="single" w:sz="4" w:space="0" w:color="BFBFBF"/>
               <w:start w:val="single" w:sz="4" w:space="0" w:color="BFBFBF"/>
@@ -3604,7 +3634,7 @@
         </w:tc>
         <w:tc>
           <w:tcPr>
-            <w:tcW w:w="3026" w:type="dxa"/>
+            <w:tcW w:w="3027" w:type="dxa"/>
             <w:tcBorders>
               <w:top w:val="single" w:sz="4" w:space="0" w:color="BFBFBF"/>
               <w:start w:val="single" w:sz="4" w:space="0" w:color="BFBFBF"/>
@@ -3681,7 +3711,7 @@
         </w:trPr>
         <w:tc>
           <w:tcPr>
-            <w:tcW w:w="1874" w:type="dxa"/>
+            <w:tcW w:w="1873" w:type="dxa"/>
             <w:tcBorders>
               <w:top w:val="single" w:sz="4" w:space="0" w:color="BFBFBF"/>
               <w:start w:val="single" w:sz="4" w:space="0" w:color="BFBFBF"/>
@@ -3760,7 +3790,7 @@
         </w:tc>
         <w:tc>
           <w:tcPr>
-            <w:tcW w:w="3026" w:type="dxa"/>
+            <w:tcW w:w="3027" w:type="dxa"/>
             <w:tcBorders>
               <w:top w:val="single" w:sz="4" w:space="0" w:color="BFBFBF"/>
               <w:start w:val="single" w:sz="4" w:space="0" w:color="BFBFBF"/>
@@ -3844,7 +3874,7 @@
         </w:trPr>
         <w:tc>
           <w:tcPr>
-            <w:tcW w:w="1874" w:type="dxa"/>
+            <w:tcW w:w="1873" w:type="dxa"/>
             <w:tcBorders>
               <w:top w:val="single" w:sz="4" w:space="0" w:color="BFBFBF"/>
               <w:start w:val="single" w:sz="4" w:space="0" w:color="BFBFBF"/>
@@ -3923,7 +3953,7 @@
         </w:tc>
         <w:tc>
           <w:tcPr>
-            <w:tcW w:w="3026" w:type="dxa"/>
+            <w:tcW w:w="3027" w:type="dxa"/>
             <w:tcBorders>
               <w:top w:val="single" w:sz="4" w:space="0" w:color="BFBFBF"/>
               <w:start w:val="single" w:sz="4" w:space="0" w:color="BFBFBF"/>
@@ -4008,7 +4038,7 @@
         </w:trPr>
         <w:tc>
           <w:tcPr>
-            <w:tcW w:w="1874" w:type="dxa"/>
+            <w:tcW w:w="1873" w:type="dxa"/>
             <w:tcBorders>
               <w:top w:val="single" w:sz="4" w:space="0" w:color="BFBFBF"/>
               <w:start w:val="single" w:sz="4" w:space="0" w:color="BFBFBF"/>
@@ -4086,7 +4116,7 @@
         </w:tc>
         <w:tc>
           <w:tcPr>
-            <w:tcW w:w="3026" w:type="dxa"/>
+            <w:tcW w:w="3027" w:type="dxa"/>
             <w:tcBorders>
               <w:top w:val="single" w:sz="4" w:space="0" w:color="BFBFBF"/>
               <w:start w:val="single" w:sz="4" w:space="0" w:color="BFBFBF"/>
@@ -4171,7 +4201,7 @@
         </w:trPr>
         <w:tc>
           <w:tcPr>
-            <w:tcW w:w="1874" w:type="dxa"/>
+            <w:tcW w:w="1873" w:type="dxa"/>
             <w:tcBorders>
               <w:top w:val="single" w:sz="4" w:space="0" w:color="BFBFBF"/>
               <w:start w:val="single" w:sz="4" w:space="0" w:color="BFBFBF"/>
@@ -4249,7 +4279,7 @@
         </w:tc>
         <w:tc>
           <w:tcPr>
-            <w:tcW w:w="3026" w:type="dxa"/>
+            <w:tcW w:w="3027" w:type="dxa"/>
             <w:tcBorders>
               <w:top w:val="single" w:sz="4" w:space="0" w:color="BFBFBF"/>
               <w:start w:val="single" w:sz="4" w:space="0" w:color="BFBFBF"/>
@@ -4437,7 +4467,7 @@
     <w:tbl>
       <w:tblPr>
         <w:tblStyle w:val="Tablaconcuadrcula"/>
-        <w:tblW w:w="11061" w:type="dxa"/>
+        <w:tblW w:w="11060" w:type="dxa"/>
         <w:jc w:val="center"/>
         <w:tblInd w:w="0" w:type="dxa"/>
         <w:tblLayout w:type="fixed"/>
@@ -4450,11 +4480,11 @@
         <w:tblLook w:val="04a0" w:firstRow="1" w:noVBand="1" w:lastRow="0" w:firstColumn="1" w:lastColumn="0" w:noHBand="0"/>
       </w:tblPr>
       <w:tblGrid>
-        <w:gridCol w:w="1580"/>
-        <w:gridCol w:w="1580"/>
-        <w:gridCol w:w="1580"/>
-        <w:gridCol w:w="1580"/>
-        <w:gridCol w:w="1580"/>
+        <w:gridCol w:w="1579"/>
+        <w:gridCol w:w="1371"/>
+        <w:gridCol w:w="2150"/>
+        <w:gridCol w:w="1813"/>
+        <w:gridCol w:w="986"/>
         <w:gridCol w:w="1580"/>
         <w:gridCol w:w="1581"/>
       </w:tblGrid>
@@ -4462,7 +4492,7 @@
         <w:trPr/>
         <w:tc>
           <w:tcPr>
-            <w:tcW w:w="11061" w:type="dxa"/>
+            <w:tcW w:w="11060" w:type="dxa"/>
             <w:gridSpan w:val="7"/>
             <w:tcBorders>
               <w:top w:val="single" w:sz="4" w:space="0" w:color="BFBFBF"/>
@@ -4500,7 +4530,7 @@
         <w:trPr/>
         <w:tc>
           <w:tcPr>
-            <w:tcW w:w="1580" w:type="dxa"/>
+            <w:tcW w:w="1579" w:type="dxa"/>
             <w:tcBorders>
               <w:top w:val="single" w:sz="4" w:space="0" w:color="BFBFBF"/>
               <w:start w:val="single" w:sz="4" w:space="0" w:color="BFBFBF"/>
@@ -4535,7 +4565,7 @@
         </w:tc>
         <w:tc>
           <w:tcPr>
-            <w:tcW w:w="1580" w:type="dxa"/>
+            <w:tcW w:w="1371" w:type="dxa"/>
             <w:tcBorders>
               <w:top w:val="single" w:sz="4" w:space="0" w:color="BFBFBF"/>
               <w:start w:val="single" w:sz="4" w:space="0" w:color="BFBFBF"/>
@@ -4569,7 +4599,7 @@
         </w:tc>
         <w:tc>
           <w:tcPr>
-            <w:tcW w:w="1580" w:type="dxa"/>
+            <w:tcW w:w="2150" w:type="dxa"/>
             <w:tcBorders>
               <w:top w:val="single" w:sz="4" w:space="0" w:color="BFBFBF"/>
               <w:start w:val="single" w:sz="4" w:space="0" w:color="BFBFBF"/>
@@ -4603,7 +4633,7 @@
         </w:tc>
         <w:tc>
           <w:tcPr>
-            <w:tcW w:w="1580" w:type="dxa"/>
+            <w:tcW w:w="1813" w:type="dxa"/>
             <w:tcBorders>
               <w:top w:val="single" w:sz="4" w:space="0" w:color="BFBFBF"/>
               <w:start w:val="single" w:sz="4" w:space="0" w:color="BFBFBF"/>
@@ -4637,7 +4667,7 @@
         </w:tc>
         <w:tc>
           <w:tcPr>
-            <w:tcW w:w="1580" w:type="dxa"/>
+            <w:tcW w:w="986" w:type="dxa"/>
             <w:tcBorders>
               <w:top w:val="single" w:sz="4" w:space="0" w:color="BFBFBF"/>
               <w:start w:val="single" w:sz="4" w:space="0" w:color="BFBFBF"/>
@@ -4773,7 +4803,7 @@
         </w:trPr>
         <w:tc>
           <w:tcPr>
-            <w:tcW w:w="1580" w:type="dxa"/>
+            <w:tcW w:w="1579" w:type="dxa"/>
             <w:tcBorders>
               <w:top w:val="single" w:sz="4" w:space="0" w:color="BFBFBF"/>
               <w:start w:val="single" w:sz="4" w:space="0" w:color="BFBFBF"/>
@@ -4816,7 +4846,7 @@
         </w:tc>
         <w:tc>
           <w:tcPr>
-            <w:tcW w:w="1580" w:type="dxa"/>
+            <w:tcW w:w="1371" w:type="dxa"/>
             <w:tcBorders>
               <w:top w:val="single" w:sz="4" w:space="0" w:color="BFBFBF"/>
               <w:start w:val="single" w:sz="4" w:space="0" w:color="BFBFBF"/>
@@ -4859,7 +4889,7 @@
         </w:tc>
         <w:tc>
           <w:tcPr>
-            <w:tcW w:w="1580" w:type="dxa"/>
+            <w:tcW w:w="2150" w:type="dxa"/>
             <w:tcBorders>
               <w:top w:val="single" w:sz="4" w:space="0" w:color="BFBFBF"/>
               <w:start w:val="single" w:sz="4" w:space="0" w:color="BFBFBF"/>
@@ -4902,7 +4932,7 @@
         </w:tc>
         <w:tc>
           <w:tcPr>
-            <w:tcW w:w="1580" w:type="dxa"/>
+            <w:tcW w:w="1813" w:type="dxa"/>
             <w:tcBorders>
               <w:top w:val="single" w:sz="4" w:space="0" w:color="BFBFBF"/>
               <w:start w:val="single" w:sz="4" w:space="0" w:color="BFBFBF"/>
@@ -4945,7 +4975,7 @@
         </w:tc>
         <w:tc>
           <w:tcPr>
-            <w:tcW w:w="1580" w:type="dxa"/>
+            <w:tcW w:w="986" w:type="dxa"/>
             <w:tcBorders>
               <w:top w:val="single" w:sz="4" w:space="0" w:color="BFBFBF"/>
               <w:start w:val="single" w:sz="4" w:space="0" w:color="BFBFBF"/>
@@ -5081,19 +5111,20 @@
         <w:trPr/>
         <w:tc>
           <w:tcPr>
-            <w:tcW w:w="1580" w:type="dxa"/>
-            <w:tcBorders>
-              <w:top w:val="single" w:sz="4" w:space="0" w:color="BFBFBF"/>
-              <w:start w:val="single" w:sz="4" w:space="0" w:color="BFBFBF"/>
-              <w:bottom w:val="single" w:sz="4" w:space="0" w:color="BFBFBF"/>
-              <w:end w:val="single" w:sz="4" w:space="0" w:color="BFBFBF"/>
-            </w:tcBorders>
-          </w:tcPr>
-          <w:p>
-            <w:pPr>
-              <w:pStyle w:val="Normal"/>
-              <w:widowControl/>
-              <w:suppressAutoHyphens w:val="true"/>
+            <w:tcW w:w="1579" w:type="dxa"/>
+            <w:tcBorders>
+              <w:top w:val="single" w:sz="4" w:space="0" w:color="BFBFBF"/>
+              <w:start w:val="single" w:sz="4" w:space="0" w:color="BFBFBF"/>
+              <w:bottom w:val="single" w:sz="4" w:space="0" w:color="BFBFBF"/>
+              <w:end w:val="single" w:sz="4" w:space="0" w:color="BFBFBF"/>
+            </w:tcBorders>
+          </w:tcPr>
+          <w:p>
+            <w:pPr>
+              <w:pStyle w:val="Normal"/>
+              <w:widowControl/>
+              <w:suppressAutoHyphens w:val="true"/>
+              <w:bidi w:val="0"/>
               <w:spacing w:before="0" w:after="160"/>
               <w:jc w:val="start"/>
               <w:rPr>
@@ -5120,24 +5151,26 @@
                 <w:szCs w:val="20"/>
                 <w:lang w:eastAsia="es-CL"/>
               </w:rPr>
-            </w:r>
-          </w:p>
-        </w:tc>
-        <w:tc>
-          <w:tcPr>
-            <w:tcW w:w="1580" w:type="dxa"/>
-            <w:tcBorders>
-              <w:top w:val="single" w:sz="4" w:space="0" w:color="BFBFBF"/>
-              <w:start w:val="single" w:sz="4" w:space="0" w:color="BFBFBF"/>
-              <w:bottom w:val="single" w:sz="4" w:space="0" w:color="BFBFBF"/>
-              <w:end w:val="single" w:sz="4" w:space="0" w:color="BFBFBF"/>
-            </w:tcBorders>
-          </w:tcPr>
-          <w:p>
-            <w:pPr>
-              <w:pStyle w:val="Normal"/>
-              <w:widowControl/>
-              <w:suppressAutoHyphens w:val="true"/>
+              <w:t>Desarrollar una solución de software utilizando técnicas que permitan sistematizar el proceso de desarrollo y mantenimiento, asegurando el logro de los objetivos.</w:t>
+            </w:r>
+          </w:p>
+        </w:tc>
+        <w:tc>
+          <w:tcPr>
+            <w:tcW w:w="1371" w:type="dxa"/>
+            <w:tcBorders>
+              <w:top w:val="single" w:sz="4" w:space="0" w:color="BFBFBF"/>
+              <w:start w:val="single" w:sz="4" w:space="0" w:color="BFBFBF"/>
+              <w:bottom w:val="single" w:sz="4" w:space="0" w:color="BFBFBF"/>
+              <w:end w:val="single" w:sz="4" w:space="0" w:color="BFBFBF"/>
+            </w:tcBorders>
+          </w:tcPr>
+          <w:p>
+            <w:pPr>
+              <w:pStyle w:val="Normal"/>
+              <w:widowControl/>
+              <w:suppressAutoHyphens w:val="true"/>
+              <w:bidi w:val="0"/>
               <w:spacing w:before="0" w:after="160"/>
               <w:jc w:val="start"/>
               <w:rPr>
@@ -5164,24 +5197,26 @@
                 <w:szCs w:val="20"/>
                 <w:lang w:eastAsia="es-CL"/>
               </w:rPr>
-            </w:r>
-          </w:p>
-        </w:tc>
-        <w:tc>
-          <w:tcPr>
-            <w:tcW w:w="1580" w:type="dxa"/>
-            <w:tcBorders>
-              <w:top w:val="single" w:sz="4" w:space="0" w:color="BFBFBF"/>
-              <w:start w:val="single" w:sz="4" w:space="0" w:color="BFBFBF"/>
-              <w:bottom w:val="single" w:sz="4" w:space="0" w:color="BFBFBF"/>
-              <w:end w:val="single" w:sz="4" w:space="0" w:color="BFBFBF"/>
-            </w:tcBorders>
-          </w:tcPr>
-          <w:p>
-            <w:pPr>
-              <w:pStyle w:val="Normal"/>
-              <w:widowControl/>
-              <w:suppressAutoHyphens w:val="true"/>
+              <w:t>Diseño de arquitectura de software</w:t>
+            </w:r>
+          </w:p>
+        </w:tc>
+        <w:tc>
+          <w:tcPr>
+            <w:tcW w:w="2150" w:type="dxa"/>
+            <w:tcBorders>
+              <w:top w:val="single" w:sz="4" w:space="0" w:color="BFBFBF"/>
+              <w:start w:val="single" w:sz="4" w:space="0" w:color="BFBFBF"/>
+              <w:bottom w:val="single" w:sz="4" w:space="0" w:color="BFBFBF"/>
+              <w:end w:val="single" w:sz="4" w:space="0" w:color="BFBFBF"/>
+            </w:tcBorders>
+          </w:tcPr>
+          <w:p>
+            <w:pPr>
+              <w:pStyle w:val="Normal"/>
+              <w:widowControl/>
+              <w:suppressAutoHyphens w:val="true"/>
+              <w:bidi w:val="0"/>
               <w:spacing w:before="0" w:after="160"/>
               <w:jc w:val="start"/>
               <w:rPr>
@@ -5208,24 +5243,26 @@
                 <w:szCs w:val="20"/>
                 <w:lang w:eastAsia="es-CL"/>
               </w:rPr>
-            </w:r>
-          </w:p>
-        </w:tc>
-        <w:tc>
-          <w:tcPr>
-            <w:tcW w:w="1580" w:type="dxa"/>
-            <w:tcBorders>
-              <w:top w:val="single" w:sz="4" w:space="0" w:color="BFBFBF"/>
-              <w:start w:val="single" w:sz="4" w:space="0" w:color="BFBFBF"/>
-              <w:bottom w:val="single" w:sz="4" w:space="0" w:color="BFBFBF"/>
-              <w:end w:val="single" w:sz="4" w:space="0" w:color="BFBFBF"/>
-            </w:tcBorders>
-          </w:tcPr>
-          <w:p>
-            <w:pPr>
-              <w:pStyle w:val="Normal"/>
-              <w:widowControl/>
-              <w:suppressAutoHyphens w:val="true"/>
+              <w:t>Diseñar la arquitectura modular de Directiva, definiendo las principales capas del sistema, sus responsabilidades y mecanismos de comunicación. Se considerarán, entre otras, las capas de presentación visual, orquestación del juego, programación, intérprete y simulación, procurando mantener bajo acoplamiento entre componentes y facilitar su mantenimiento, prueba y eventual reemplazo o ampliación.</w:t>
+            </w:r>
+          </w:p>
+        </w:tc>
+        <w:tc>
+          <w:tcPr>
+            <w:tcW w:w="1813" w:type="dxa"/>
+            <w:tcBorders>
+              <w:top w:val="single" w:sz="4" w:space="0" w:color="BFBFBF"/>
+              <w:start w:val="single" w:sz="4" w:space="0" w:color="BFBFBF"/>
+              <w:bottom w:val="single" w:sz="4" w:space="0" w:color="BFBFBF"/>
+              <w:end w:val="single" w:sz="4" w:space="0" w:color="BFBFBF"/>
+            </w:tcBorders>
+          </w:tcPr>
+          <w:p>
+            <w:pPr>
+              <w:pStyle w:val="Normal"/>
+              <w:widowControl/>
+              <w:suppressAutoHyphens w:val="true"/>
+              <w:bidi w:val="0"/>
               <w:spacing w:before="0" w:after="160"/>
               <w:jc w:val="start"/>
               <w:rPr>
@@ -5252,12 +5289,13 @@
                 <w:szCs w:val="20"/>
                 <w:lang w:eastAsia="es-CL"/>
               </w:rPr>
-            </w:r>
-          </w:p>
-        </w:tc>
-        <w:tc>
-          <w:tcPr>
-            <w:tcW w:w="1580" w:type="dxa"/>
+              <w:t>Herramientas de diagramación y documentación, Unity, repositorio del proyecto, documentación técnica y reuniones de diseño del equipo.</w:t>
+            </w:r>
+          </w:p>
+        </w:tc>
+        <w:tc>
+          <w:tcPr>
+            <w:tcW w:w="986" w:type="dxa"/>
             <w:tcBorders>
               <w:top w:val="single" w:sz="4" w:space="0" w:color="BFBFBF"/>
               <w:start w:val="single" w:sz="4" w:space="0" w:color="BFBFBF"/>
@@ -5270,6 +5308,7 @@
               <w:pStyle w:val="Normal"/>
               <w:widowControl/>
               <w:suppressAutoHyphens w:val="true"/>
+              <w:bidi w:val="0"/>
               <w:spacing w:before="0" w:after="160"/>
               <w:jc w:val="start"/>
               <w:rPr>
@@ -5296,6 +5335,7 @@
                 <w:szCs w:val="20"/>
                 <w:lang w:eastAsia="es-CL"/>
               </w:rPr>
+              <w:t>Fase 1 y ajustes durante Fase 2</w:t>
             </w:r>
           </w:p>
         </w:tc>
@@ -5315,6 +5355,7 @@
               <w:pStyle w:val="Normal"/>
               <w:widowControl/>
               <w:suppressAutoHyphens w:val="true"/>
+              <w:bidi w:val="0"/>
               <w:spacing w:before="0" w:after="160"/>
               <w:jc w:val="start"/>
               <w:rPr>
@@ -5341,6 +5382,21 @@
                 <w:szCs w:val="20"/>
                 <w:lang w:eastAsia="es-CL"/>
               </w:rPr>
+              <w:t>A</w:t>
+            </w:r>
+            <w:r>
+              <w:rPr>
+                <w:rFonts w:cs="Arial"/>
+                <w:b w:val="false"/>
+                <w:bCs w:val="false"/>
+                <w:i w:val="false"/>
+                <w:iCs w:val="false"/>
+                <w:color w:val="000000"/>
+                <w:sz w:val="18"/>
+                <w:szCs w:val="20"/>
+                <w:lang w:eastAsia="es-CL"/>
+              </w:rPr>
+              <w:t>ngel Rojas</w:t>
             </w:r>
           </w:p>
         </w:tc>
@@ -5359,6 +5415,7 @@
               <w:pStyle w:val="Normal"/>
               <w:widowControl/>
               <w:suppressAutoHyphens w:val="true"/>
+              <w:bidi w:val="0"/>
               <w:spacing w:before="0" w:after="160"/>
               <w:jc w:val="start"/>
               <w:rPr>
@@ -5385,6 +5442,7 @@
                 <w:szCs w:val="20"/>
                 <w:lang w:eastAsia="es-CL"/>
               </w:rPr>
+              <w:t>La arquitectura será definida inicialmente durante la planificación, pero podrá ajustarse durante el desarrollo si aparecen nuevas necesidades técnicas. Como facilitador se cuenta con experiencia previa del responsable en desarrollo de software y Unity.</w:t>
             </w:r>
           </w:p>
         </w:tc>
@@ -5393,7 +5451,7 @@
         <w:trPr/>
         <w:tc>
           <w:tcPr>
-            <w:tcW w:w="1580" w:type="dxa"/>
+            <w:tcW w:w="1579" w:type="dxa"/>
             <w:tcBorders>
               <w:top w:val="single" w:sz="4" w:space="0" w:color="BFBFBF"/>
               <w:start w:val="single" w:sz="4" w:space="0" w:color="BFBFBF"/>
@@ -5437,7 +5495,7 @@
         </w:tc>
         <w:tc>
           <w:tcPr>
-            <w:tcW w:w="1580" w:type="dxa"/>
+            <w:tcW w:w="1371" w:type="dxa"/>
             <w:tcBorders>
               <w:top w:val="single" w:sz="4" w:space="0" w:color="BFBFBF"/>
               <w:start w:val="single" w:sz="4" w:space="0" w:color="BFBFBF"/>
@@ -5481,7 +5539,7 @@
         </w:tc>
         <w:tc>
           <w:tcPr>
-            <w:tcW w:w="1580" w:type="dxa"/>
+            <w:tcW w:w="2150" w:type="dxa"/>
             <w:tcBorders>
               <w:top w:val="single" w:sz="4" w:space="0" w:color="BFBFBF"/>
               <w:start w:val="single" w:sz="4" w:space="0" w:color="BFBFBF"/>
@@ -5525,7 +5583,7 @@
         </w:tc>
         <w:tc>
           <w:tcPr>
-            <w:tcW w:w="1580" w:type="dxa"/>
+            <w:tcW w:w="1813" w:type="dxa"/>
             <w:tcBorders>
               <w:top w:val="single" w:sz="4" w:space="0" w:color="BFBFBF"/>
               <w:start w:val="single" w:sz="4" w:space="0" w:color="BFBFBF"/>
@@ -5569,7 +5627,7 @@
         </w:tc>
         <w:tc>
           <w:tcPr>
-            <w:tcW w:w="1580" w:type="dxa"/>
+            <w:tcW w:w="986" w:type="dxa"/>
             <w:tcBorders>
               <w:top w:val="single" w:sz="4" w:space="0" w:color="BFBFBF"/>
               <w:start w:val="single" w:sz="4" w:space="0" w:color="BFBFBF"/>
@@ -5880,22 +5938,22 @@
       <w:tblGrid>
         <w:gridCol w:w="1351"/>
         <w:gridCol w:w="536"/>
-        <w:gridCol w:w="520"/>
+        <w:gridCol w:w="519"/>
         <w:gridCol w:w="523"/>
         <w:gridCol w:w="526"/>
-        <w:gridCol w:w="524"/>
+        <w:gridCol w:w="525"/>
         <w:gridCol w:w="524"/>
         <w:gridCol w:w="523"/>
         <w:gridCol w:w="523"/>
-        <w:gridCol w:w="521"/>
+        <w:gridCol w:w="520"/>
         <w:gridCol w:w="523"/>
-        <w:gridCol w:w="524"/>
+        <w:gridCol w:w="525"/>
         <w:gridCol w:w="524"/>
         <w:gridCol w:w="525"/>
         <w:gridCol w:w="525"/>
         <w:gridCol w:w="525"/>
-        <w:gridCol w:w="5"/>
-        <w:gridCol w:w="520"/>
+        <w:gridCol w:w="4"/>
+        <w:gridCol w:w="521"/>
         <w:gridCol w:w="525"/>
         <w:gridCol w:w="525"/>
         <w:gridCol w:w="10"/>
@@ -5943,7 +6001,7 @@
         </w:tc>
         <w:tc>
           <w:tcPr>
-            <w:tcW w:w="2105" w:type="dxa"/>
+            <w:tcW w:w="2104" w:type="dxa"/>
             <w:gridSpan w:val="4"/>
             <w:tcBorders>
               <w:top w:val="single" w:sz="4" w:space="0" w:color="BFBFBF"/>
@@ -6019,7 +6077,7 @@
         </w:tc>
         <w:tc>
           <w:tcPr>
-            <w:tcW w:w="1580" w:type="dxa"/>
+            <w:tcW w:w="1581" w:type="dxa"/>
             <w:gridSpan w:val="4"/>
             <w:tcBorders>
               <w:top w:val="single" w:sz="4" w:space="0" w:color="BFBFBF"/>
@@ -6132,7 +6190,7 @@
         </w:tc>
         <w:tc>
           <w:tcPr>
-            <w:tcW w:w="520" w:type="dxa"/>
+            <w:tcW w:w="519" w:type="dxa"/>
             <w:tcBorders>
               <w:top w:val="single" w:sz="4" w:space="0" w:color="BFBFBF"/>
               <w:start w:val="single" w:sz="4" w:space="0" w:color="BFBFBF"/>
@@ -6240,7 +6298,7 @@
         </w:tc>
         <w:tc>
           <w:tcPr>
-            <w:tcW w:w="524" w:type="dxa"/>
+            <w:tcW w:w="525" w:type="dxa"/>
             <w:tcBorders>
               <w:top w:val="single" w:sz="4" w:space="0" w:color="BFBFBF"/>
               <w:start w:val="single" w:sz="4" w:space="0" w:color="BFBFBF"/>
@@ -6384,7 +6442,7 @@
         </w:tc>
         <w:tc>
           <w:tcPr>
-            <w:tcW w:w="521" w:type="dxa"/>
+            <w:tcW w:w="520" w:type="dxa"/>
             <w:tcBorders>
               <w:top w:val="single" w:sz="4" w:space="0" w:color="BFBFBF"/>
               <w:start w:val="single" w:sz="4" w:space="0" w:color="BFBFBF"/>
@@ -6456,7 +6514,7 @@
         </w:tc>
         <w:tc>
           <w:tcPr>
-            <w:tcW w:w="524" w:type="dxa"/>
+            <w:tcW w:w="525" w:type="dxa"/>
             <w:tcBorders>
               <w:top w:val="single" w:sz="4" w:space="0" w:color="BFBFBF"/>
               <w:start w:val="single" w:sz="4" w:space="0" w:color="BFBFBF"/>
@@ -6847,7 +6905,7 @@
         </w:tc>
         <w:tc>
           <w:tcPr>
-            <w:tcW w:w="520" w:type="dxa"/>
+            <w:tcW w:w="519" w:type="dxa"/>
             <w:tcBorders>
               <w:top w:val="single" w:sz="4" w:space="0" w:color="BFBFBF"/>
               <w:start w:val="single" w:sz="4" w:space="0" w:color="BFBFBF"/>
@@ -6943,7 +7001,7 @@
         </w:tc>
         <w:tc>
           <w:tcPr>
-            <w:tcW w:w="524" w:type="dxa"/>
+            <w:tcW w:w="525" w:type="dxa"/>
             <w:tcBorders>
               <w:top w:val="single" w:sz="4" w:space="0" w:color="BFBFBF"/>
               <w:start w:val="single" w:sz="4" w:space="0" w:color="BFBFBF"/>
@@ -7071,7 +7129,7 @@
         </w:tc>
         <w:tc>
           <w:tcPr>
-            <w:tcW w:w="521" w:type="dxa"/>
+            <w:tcW w:w="520" w:type="dxa"/>
             <w:tcBorders>
               <w:top w:val="single" w:sz="4" w:space="0" w:color="BFBFBF"/>
               <w:start w:val="single" w:sz="4" w:space="0" w:color="BFBFBF"/>
@@ -7135,7 +7193,7 @@
         </w:tc>
         <w:tc>
           <w:tcPr>
-            <w:tcW w:w="524" w:type="dxa"/>
+            <w:tcW w:w="525" w:type="dxa"/>
             <w:tcBorders>
               <w:top w:val="single" w:sz="4" w:space="0" w:color="BFBFBF"/>
               <w:start w:val="single" w:sz="4" w:space="0" w:color="BFBFBF"/>
@@ -7489,7 +7547,7 @@
         </w:tc>
         <w:tc>
           <w:tcPr>
-            <w:tcW w:w="520" w:type="dxa"/>
+            <w:tcW w:w="519" w:type="dxa"/>
             <w:tcBorders>
               <w:top w:val="single" w:sz="4" w:space="0" w:color="BFBFBF"/>
               <w:start w:val="single" w:sz="4" w:space="0" w:color="BFBFBF"/>
@@ -7585,7 +7643,7 @@
         </w:tc>
         <w:tc>
           <w:tcPr>
-            <w:tcW w:w="524" w:type="dxa"/>
+            <w:tcW w:w="525" w:type="dxa"/>
             <w:tcBorders>
               <w:top w:val="single" w:sz="4" w:space="0" w:color="BFBFBF"/>
               <w:start w:val="single" w:sz="4" w:space="0" w:color="BFBFBF"/>
@@ -7713,7 +7771,7 @@
         </w:tc>
         <w:tc>
           <w:tcPr>
-            <w:tcW w:w="521" w:type="dxa"/>
+            <w:tcW w:w="520" w:type="dxa"/>
             <w:tcBorders>
               <w:top w:val="single" w:sz="4" w:space="0" w:color="BFBFBF"/>
               <w:start w:val="single" w:sz="4" w:space="0" w:color="BFBFBF"/>
@@ -7777,7 +7835,7 @@
         </w:tc>
         <w:tc>
           <w:tcPr>
-            <w:tcW w:w="524" w:type="dxa"/>
+            <w:tcW w:w="525" w:type="dxa"/>
             <w:tcBorders>
               <w:top w:val="single" w:sz="4" w:space="0" w:color="BFBFBF"/>
               <w:start w:val="single" w:sz="4" w:space="0" w:color="BFBFBF"/>
@@ -8131,7 +8189,7 @@
         </w:tc>
         <w:tc>
           <w:tcPr>
-            <w:tcW w:w="520" w:type="dxa"/>
+            <w:tcW w:w="519" w:type="dxa"/>
             <w:tcBorders>
               <w:top w:val="single" w:sz="4" w:space="0" w:color="BFBFBF"/>
               <w:start w:val="single" w:sz="4" w:space="0" w:color="BFBFBF"/>
@@ -8227,7 +8285,7 @@
         </w:tc>
         <w:tc>
           <w:tcPr>
-            <w:tcW w:w="524" w:type="dxa"/>
+            <w:tcW w:w="525" w:type="dxa"/>
             <w:tcBorders>
               <w:top w:val="single" w:sz="4" w:space="0" w:color="BFBFBF"/>
               <w:start w:val="single" w:sz="4" w:space="0" w:color="BFBFBF"/>
@@ -8355,7 +8413,7 @@
         </w:tc>
         <w:tc>
           <w:tcPr>
-            <w:tcW w:w="521" w:type="dxa"/>
+            <w:tcW w:w="520" w:type="dxa"/>
             <w:tcBorders>
               <w:top w:val="single" w:sz="4" w:space="0" w:color="BFBFBF"/>
               <w:start w:val="single" w:sz="4" w:space="0" w:color="BFBFBF"/>
@@ -8419,7 +8477,7 @@
         </w:tc>
         <w:tc>
           <w:tcPr>
-            <w:tcW w:w="524" w:type="dxa"/>
+            <w:tcW w:w="525" w:type="dxa"/>
             <w:tcBorders>
               <w:top w:val="single" w:sz="4" w:space="0" w:color="BFBFBF"/>
               <w:start w:val="single" w:sz="4" w:space="0" w:color="BFBFBF"/>
@@ -8815,8 +8873,8 @@
       <w:tblLook w:val="04a0" w:firstRow="1" w:noVBand="1" w:lastRow="0" w:firstColumn="1" w:lastColumn="0" w:noHBand="0"/>
     </w:tblPr>
     <w:tblGrid>
-      <w:gridCol w:w="5705"/>
-      <w:gridCol w:w="4218"/>
+      <w:gridCol w:w="5704"/>
+      <w:gridCol w:w="4219"/>
     </w:tblGrid>
     <w:tr>
       <w:trPr>
@@ -8824,7 +8882,7 @@
       </w:trPr>
       <w:tc>
         <w:tcPr>
-          <w:tcW w:w="5705" w:type="dxa"/>
+          <w:tcW w:w="5704" w:type="dxa"/>
           <w:tcBorders>
             <w:top w:val="nil"/>
             <w:start w:val="nil"/>
@@ -8891,7 +8949,7 @@
       </w:tc>
       <w:tc>
         <w:tcPr>
-          <w:tcW w:w="4218" w:type="dxa"/>
+          <w:tcW w:w="4219" w:type="dxa"/>
           <w:tcBorders>
             <w:top w:val="nil"/>
             <w:start w:val="nil"/>
@@ -8989,8 +9047,8 @@
       <w:tblLook w:val="04a0" w:firstRow="1" w:noVBand="1" w:lastRow="0" w:firstColumn="1" w:lastColumn="0" w:noHBand="0"/>
     </w:tblPr>
     <w:tblGrid>
-      <w:gridCol w:w="5705"/>
-      <w:gridCol w:w="4218"/>
+      <w:gridCol w:w="5704"/>
+      <w:gridCol w:w="4219"/>
     </w:tblGrid>
     <w:tr>
       <w:trPr>
@@ -8998,7 +9056,7 @@
       </w:trPr>
       <w:tc>
         <w:tcPr>
-          <w:tcW w:w="5705" w:type="dxa"/>
+          <w:tcW w:w="5704" w:type="dxa"/>
           <w:tcBorders>
             <w:top w:val="nil"/>
             <w:start w:val="nil"/>
@@ -9065,7 +9123,7 @@
       </w:tc>
       <w:tc>
         <w:tcPr>
-          <w:tcW w:w="4218" w:type="dxa"/>
+          <w:tcW w:w="4219" w:type="dxa"/>
           <w:tcBorders>
             <w:top w:val="nil"/>
             <w:start w:val="nil"/>
@@ -10002,17 +10060,16 @@
       <w:lang w:val="es-ES"/>
     </w:rPr>
   </w:style>
-  <w:style w:type="character" w:styleId="FootnoteCharactersuser">
-    <w:name w:val="Footnote Characters (user)"/>
-    <w:basedOn w:val="DefaultParagraphFont"/>
+  <w:style w:type="character" w:styleId="FootnoteCharacters">
+    <w:name w:val="Footnote Characters"/>
     <w:unhideWhenUsed/>
     <w:rsid w:val="00d110ec"/>
     <w:rPr>
       <w:vertAlign w:val="superscript"/>
     </w:rPr>
   </w:style>
-  <w:style w:type="character" w:styleId="FootnoteCharacters">
-    <w:name w:val="Footnote Characters"/>
+  <w:style w:type="character" w:styleId="FootnoteCharactersuser">
+    <w:name w:val="Footnote Characters (user)"/>
     <w:rPr>
       <w:vertAlign w:val="superscript"/>
     </w:rPr>
@@ -10095,21 +10152,21 @@
     <w:name w:val="Numbering Symbols"/>
     <w:rPr/>
   </w:style>
-  <w:style w:type="character" w:styleId="EndnoteCharacters">
-    <w:name w:val="Endnote Characters"/>
+  <w:style w:type="character" w:styleId="EndnoteCharactersuser">
+    <w:name w:val="Endnote Characters (user)"/>
     <w:rPr>
       <w:vertAlign w:val="superscript"/>
     </w:rPr>
+  </w:style>
+  <w:style w:type="character" w:styleId="EndnoteCharacters">
+    <w:name w:val="Endnote Characters"/>
+    <w:rPr/>
   </w:style>
   <w:style w:type="character" w:styleId="EndnoteReference">
     <w:name w:val="endnote reference"/>
     <w:rPr>
       <w:vertAlign w:val="superscript"/>
     </w:rPr>
-  </w:style>
-  <w:style w:type="character" w:styleId="EndnoteCharactersuser">
-    <w:name w:val="Endnote Characters (user)"/>
-    <w:rPr/>
   </w:style>
   <w:style w:type="paragraph" w:styleId="Heading">
     <w:name w:val="Heading"/>
@@ -10284,8 +10341,8 @@
       <w:bCs/>
     </w:rPr>
   </w:style>
-  <w:style w:type="paragraph" w:styleId="FrameContentsuser">
-    <w:name w:val="Frame Contents (user)"/>
+  <w:style w:type="paragraph" w:styleId="FrameContents">
+    <w:name w:val="Frame Contents"/>
     <w:basedOn w:val="Normal"/>
     <w:pPr/>
     <w:rPr/>
@@ -10311,8 +10368,8 @@
       <w:bCs/>
     </w:rPr>
   </w:style>
-  <w:style w:type="paragraph" w:styleId="FrameContents">
-    <w:name w:val="Frame Contents"/>
+  <w:style w:type="paragraph" w:styleId="FrameContentsuser">
+    <w:name w:val="Frame Contents (user)"/>
     <w:basedOn w:val="Normal"/>
     <w:pPr/>
     <w:rPr/>

</xml_diff>

<commit_message>
[ADD] Agregar cada tarea sin descripciones
</commit_message>
<xml_diff>
--- a/Fase 1/Evidencias Grupales/1.5_GuiaEstudiante_Fase 1_Definicion Proyecto APT (Español).docx
+++ b/Fase 1/Evidencias Grupales/1.5_GuiaEstudiante_Fase 1_Definicion Proyecto APT (Español).docx
@@ -11,7 +11,7 @@
         <mc:AlternateContent>
           <mc:Choice Requires="wpg">
             <w:drawing>
-              <wp:anchor distT="0" distB="0" distL="0" distR="0" simplePos="0" relativeHeight="11" behindDoc="0" locked="0" layoutInCell="0" allowOverlap="1" wp14:anchorId="2D7FCADB">
+              <wp:anchor distT="0" distB="0" distL="0" distR="0" simplePos="0" relativeHeight="13" behindDoc="0" locked="0" layoutInCell="0" allowOverlap="1" wp14:anchorId="2D7FCADB">
                 <wp:simplePos x="0" y="0"/>
                 <wp:positionH relativeFrom="margin">
                   <wp:posOffset>-434975</wp:posOffset>
@@ -133,7 +133,7 @@
                         <wps:spPr>
                           <a:xfrm>
                             <a:off x="0" y="0"/>
-                            <a:ext cx="1104840" cy="1486440"/>
+                            <a:ext cx="1104120" cy="1486440"/>
                           </a:xfrm>
                           <a:prstGeom prst="rect">
                             <a:avLst/>
@@ -243,7 +243,7 @@
                   </v:textbox>
                   <w10:wrap type="none"/>
                 </v:rect>
-                <v:rect id="shape_0" fillcolor="#203864" stroked="f" o:allowincell="f" style="position:absolute;left:-685;top:53;width:1739;height:2340;mso-wrap-style:none;v-text-anchor:middle;mso-position-horizontal-relative:margin">
+                <v:rect id="shape_0" fillcolor="#203864" stroked="f" o:allowincell="f" style="position:absolute;left:-685;top:53;width:1738;height:2340;mso-wrap-style:none;v-text-anchor:middle;mso-position-horizontal-relative:margin">
                   <v:fill o:detectmouseclick="t" type="solid" color2="#dfc79b"/>
                   <v:stroke color="#3465a4" weight="12600" joinstyle="miter" endcap="flat"/>
                   <w10:wrap type="none"/>
@@ -2597,8 +2597,8 @@
         <w:tblLook w:val="04a0" w:firstRow="1" w:noVBand="1" w:lastRow="0" w:firstColumn="1" w:lastColumn="0" w:noHBand="0"/>
       </w:tblPr>
       <w:tblGrid>
-        <w:gridCol w:w="2635"/>
-        <w:gridCol w:w="6863"/>
+        <w:gridCol w:w="2634"/>
+        <w:gridCol w:w="6864"/>
       </w:tblGrid>
       <w:tr>
         <w:trPr>
@@ -2606,7 +2606,7 @@
         </w:trPr>
         <w:tc>
           <w:tcPr>
-            <w:tcW w:w="2635" w:type="dxa"/>
+            <w:tcW w:w="2634" w:type="dxa"/>
             <w:tcBorders>
               <w:top w:val="single" w:sz="4" w:space="0" w:color="BFBFBF"/>
               <w:start w:val="single" w:sz="4" w:space="0" w:color="BFBFBF"/>
@@ -2640,7 +2640,7 @@
         </w:tc>
         <w:tc>
           <w:tcPr>
-            <w:tcW w:w="6863" w:type="dxa"/>
+            <w:tcW w:w="6864" w:type="dxa"/>
             <w:tcBorders>
               <w:top w:val="single" w:sz="4" w:space="0" w:color="BFBFBF"/>
               <w:start w:val="single" w:sz="4" w:space="0" w:color="BFBFBF"/>
@@ -2717,7 +2717,7 @@
         </w:trPr>
         <w:tc>
           <w:tcPr>
-            <w:tcW w:w="2635" w:type="dxa"/>
+            <w:tcW w:w="2634" w:type="dxa"/>
             <w:tcBorders>
               <w:top w:val="single" w:sz="4" w:space="0" w:color="BFBFBF"/>
               <w:start w:val="single" w:sz="4" w:space="0" w:color="BFBFBF"/>
@@ -2751,7 +2751,7 @@
         </w:tc>
         <w:tc>
           <w:tcPr>
-            <w:tcW w:w="6863" w:type="dxa"/>
+            <w:tcW w:w="6864" w:type="dxa"/>
             <w:tcBorders>
               <w:top w:val="single" w:sz="4" w:space="0" w:color="BFBFBF"/>
               <w:start w:val="single" w:sz="4" w:space="0" w:color="BFBFBF"/>
@@ -3282,37 +3282,7 @@
                 <w:szCs w:val="20"/>
                 <w:lang w:val="es-CL" w:eastAsia="es-CL" w:bidi="ar-SA"/>
               </w:rPr>
-              <w:t xml:space="preserve">Debido a que el equipo está compuesto por dos integrantes, ambos podrán participar transversalmente en distintas áreas del proyecto. Sin embargo, se establecerán responsabilidades principales. </w:t>
-            </w:r>
-            <w:r>
-              <w:rPr>
-                <w:rFonts w:eastAsia="Calibri" w:cs="Arial"/>
-                <w:b w:val="false"/>
-                <w:bCs w:val="false"/>
-                <w:i w:val="false"/>
-                <w:iCs w:val="false"/>
-                <w:color w:val="000000"/>
-                <w:kern w:val="0"/>
-                <w:sz w:val="20"/>
-                <w:szCs w:val="20"/>
-                <w:lang w:val="es-CL" w:eastAsia="es-CL" w:bidi="ar-SA"/>
-              </w:rPr>
-              <w:t>A</w:t>
-            </w:r>
-            <w:r>
-              <w:rPr>
-                <w:rFonts w:eastAsia="Calibri" w:cs="Arial"/>
-                <w:b w:val="false"/>
-                <w:bCs w:val="false"/>
-                <w:i w:val="false"/>
-                <w:iCs w:val="false"/>
-                <w:color w:val="000000"/>
-                <w:kern w:val="0"/>
-                <w:sz w:val="20"/>
-                <w:szCs w:val="20"/>
-                <w:lang w:val="es-CL" w:eastAsia="es-CL" w:bidi="ar-SA"/>
-              </w:rPr>
-              <w:t>ngel Rojas asumirá el rol de Líder Técnico y Desarrollador Principal, siendo responsable principalmente de la arquitectura de software, decisiones técnicas, programación, integración y rendimiento del sistema. Álvaro Castro asumirá el rol de Jefe de Proyecto, siendo responsable principalmente de la planificación, seguimiento del proyecto, gestión de riesgos, presupuesto, coordinación de playtests, comunicación con usuarios y gestión de los recursos necesarios para el desarrollo, incluyendo el área de diseño sonoro.</w:t>
+              <w:t>Debido a que el equipo está compuesto por dos integrantes, ambos podrán participar transversalmente en distintas áreas del proyecto. Sin embargo, se establecerán responsabilidades principales. Angel Rojas asumirá el rol de Líder Técnico y Desarrollador Principal, siendo responsable principalmente de la arquitectura de software, decisiones técnicas, programación, integración y rendimiento del sistema. Álvaro Castro asumirá el rol de Jefe de Proyecto, siendo responsable principalmente de la planificación, seguimiento del proyecto, gestión de riesgos, presupuesto, coordinación de playtests, comunicación con usuarios y gestión de los recursos necesarios para el desarrollo, incluyendo el área de diseño sonoro.</w:t>
             </w:r>
           </w:p>
           <w:p>
@@ -3527,9 +3497,9 @@
         <w:tblLook w:val="04a0" w:firstRow="1" w:noVBand="1" w:lastRow="0" w:firstColumn="1" w:lastColumn="0" w:noHBand="0"/>
       </w:tblPr>
       <w:tblGrid>
-        <w:gridCol w:w="1873"/>
+        <w:gridCol w:w="1872"/>
         <w:gridCol w:w="2125"/>
-        <w:gridCol w:w="3027"/>
+        <w:gridCol w:w="3028"/>
         <w:gridCol w:w="3037"/>
       </w:tblGrid>
       <w:tr>
@@ -3538,7 +3508,7 @@
         </w:trPr>
         <w:tc>
           <w:tcPr>
-            <w:tcW w:w="1873" w:type="dxa"/>
+            <w:tcW w:w="1872" w:type="dxa"/>
             <w:tcBorders>
               <w:top w:val="single" w:sz="4" w:space="0" w:color="BFBFBF"/>
               <w:start w:val="single" w:sz="4" w:space="0" w:color="BFBFBF"/>
@@ -3634,7 +3604,7 @@
         </w:tc>
         <w:tc>
           <w:tcPr>
-            <w:tcW w:w="3027" w:type="dxa"/>
+            <w:tcW w:w="3028" w:type="dxa"/>
             <w:tcBorders>
               <w:top w:val="single" w:sz="4" w:space="0" w:color="BFBFBF"/>
               <w:start w:val="single" w:sz="4" w:space="0" w:color="BFBFBF"/>
@@ -3711,7 +3681,7 @@
         </w:trPr>
         <w:tc>
           <w:tcPr>
-            <w:tcW w:w="1873" w:type="dxa"/>
+            <w:tcW w:w="1872" w:type="dxa"/>
             <w:tcBorders>
               <w:top w:val="single" w:sz="4" w:space="0" w:color="BFBFBF"/>
               <w:start w:val="single" w:sz="4" w:space="0" w:color="BFBFBF"/>
@@ -3790,7 +3760,7 @@
         </w:tc>
         <w:tc>
           <w:tcPr>
-            <w:tcW w:w="3027" w:type="dxa"/>
+            <w:tcW w:w="3028" w:type="dxa"/>
             <w:tcBorders>
               <w:top w:val="single" w:sz="4" w:space="0" w:color="BFBFBF"/>
               <w:start w:val="single" w:sz="4" w:space="0" w:color="BFBFBF"/>
@@ -3874,7 +3844,7 @@
         </w:trPr>
         <w:tc>
           <w:tcPr>
-            <w:tcW w:w="1873" w:type="dxa"/>
+            <w:tcW w:w="1872" w:type="dxa"/>
             <w:tcBorders>
               <w:top w:val="single" w:sz="4" w:space="0" w:color="BFBFBF"/>
               <w:start w:val="single" w:sz="4" w:space="0" w:color="BFBFBF"/>
@@ -3953,7 +3923,7 @@
         </w:tc>
         <w:tc>
           <w:tcPr>
-            <w:tcW w:w="3027" w:type="dxa"/>
+            <w:tcW w:w="3028" w:type="dxa"/>
             <w:tcBorders>
               <w:top w:val="single" w:sz="4" w:space="0" w:color="BFBFBF"/>
               <w:start w:val="single" w:sz="4" w:space="0" w:color="BFBFBF"/>
@@ -4038,7 +4008,7 @@
         </w:trPr>
         <w:tc>
           <w:tcPr>
-            <w:tcW w:w="1873" w:type="dxa"/>
+            <w:tcW w:w="1872" w:type="dxa"/>
             <w:tcBorders>
               <w:top w:val="single" w:sz="4" w:space="0" w:color="BFBFBF"/>
               <w:start w:val="single" w:sz="4" w:space="0" w:color="BFBFBF"/>
@@ -4116,7 +4086,7 @@
         </w:tc>
         <w:tc>
           <w:tcPr>
-            <w:tcW w:w="3027" w:type="dxa"/>
+            <w:tcW w:w="3028" w:type="dxa"/>
             <w:tcBorders>
               <w:top w:val="single" w:sz="4" w:space="0" w:color="BFBFBF"/>
               <w:start w:val="single" w:sz="4" w:space="0" w:color="BFBFBF"/>
@@ -4201,7 +4171,7 @@
         </w:trPr>
         <w:tc>
           <w:tcPr>
-            <w:tcW w:w="1873" w:type="dxa"/>
+            <w:tcW w:w="1872" w:type="dxa"/>
             <w:tcBorders>
               <w:top w:val="single" w:sz="4" w:space="0" w:color="BFBFBF"/>
               <w:start w:val="single" w:sz="4" w:space="0" w:color="BFBFBF"/>
@@ -4279,7 +4249,7 @@
         </w:tc>
         <w:tc>
           <w:tcPr>
-            <w:tcW w:w="3027" w:type="dxa"/>
+            <w:tcW w:w="3028" w:type="dxa"/>
             <w:tcBorders>
               <w:top w:val="single" w:sz="4" w:space="0" w:color="BFBFBF"/>
               <w:start w:val="single" w:sz="4" w:space="0" w:color="BFBFBF"/>
@@ -4481,10 +4451,10 @@
       </w:tblPr>
       <w:tblGrid>
         <w:gridCol w:w="1579"/>
-        <w:gridCol w:w="1371"/>
+        <w:gridCol w:w="1370"/>
         <w:gridCol w:w="2150"/>
         <w:gridCol w:w="1813"/>
-        <w:gridCol w:w="986"/>
+        <w:gridCol w:w="987"/>
         <w:gridCol w:w="1580"/>
         <w:gridCol w:w="1581"/>
       </w:tblGrid>
@@ -4565,7 +4535,7 @@
         </w:tc>
         <w:tc>
           <w:tcPr>
-            <w:tcW w:w="1371" w:type="dxa"/>
+            <w:tcW w:w="1370" w:type="dxa"/>
             <w:tcBorders>
               <w:top w:val="single" w:sz="4" w:space="0" w:color="BFBFBF"/>
               <w:start w:val="single" w:sz="4" w:space="0" w:color="BFBFBF"/>
@@ -4667,7 +4637,7 @@
         </w:tc>
         <w:tc>
           <w:tcPr>
-            <w:tcW w:w="986" w:type="dxa"/>
+            <w:tcW w:w="987" w:type="dxa"/>
             <w:tcBorders>
               <w:top w:val="single" w:sz="4" w:space="0" w:color="BFBFBF"/>
               <w:start w:val="single" w:sz="4" w:space="0" w:color="BFBFBF"/>
@@ -4846,7 +4816,7 @@
         </w:tc>
         <w:tc>
           <w:tcPr>
-            <w:tcW w:w="1371" w:type="dxa"/>
+            <w:tcW w:w="1370" w:type="dxa"/>
             <w:tcBorders>
               <w:top w:val="single" w:sz="4" w:space="0" w:color="BFBFBF"/>
               <w:start w:val="single" w:sz="4" w:space="0" w:color="BFBFBF"/>
@@ -4975,7 +4945,7 @@
         </w:tc>
         <w:tc>
           <w:tcPr>
-            <w:tcW w:w="986" w:type="dxa"/>
+            <w:tcW w:w="987" w:type="dxa"/>
             <w:tcBorders>
               <w:top w:val="single" w:sz="4" w:space="0" w:color="BFBFBF"/>
               <w:start w:val="single" w:sz="4" w:space="0" w:color="BFBFBF"/>
@@ -5157,7 +5127,7 @@
         </w:tc>
         <w:tc>
           <w:tcPr>
-            <w:tcW w:w="1371" w:type="dxa"/>
+            <w:tcW w:w="1370" w:type="dxa"/>
             <w:tcBorders>
               <w:top w:val="single" w:sz="4" w:space="0" w:color="BFBFBF"/>
               <w:start w:val="single" w:sz="4" w:space="0" w:color="BFBFBF"/>
@@ -5295,7 +5265,7 @@
         </w:tc>
         <w:tc>
           <w:tcPr>
-            <w:tcW w:w="986" w:type="dxa"/>
+            <w:tcW w:w="987" w:type="dxa"/>
             <w:tcBorders>
               <w:top w:val="single" w:sz="4" w:space="0" w:color="BFBFBF"/>
               <w:start w:val="single" w:sz="4" w:space="0" w:color="BFBFBF"/>
@@ -5382,21 +5352,7 @@
                 <w:szCs w:val="20"/>
                 <w:lang w:eastAsia="es-CL"/>
               </w:rPr>
-              <w:t>A</w:t>
-            </w:r>
-            <w:r>
-              <w:rPr>
-                <w:rFonts w:cs="Arial"/>
-                <w:b w:val="false"/>
-                <w:bCs w:val="false"/>
-                <w:i w:val="false"/>
-                <w:iCs w:val="false"/>
-                <w:color w:val="000000"/>
-                <w:sz w:val="18"/>
-                <w:szCs w:val="20"/>
-                <w:lang w:eastAsia="es-CL"/>
-              </w:rPr>
-              <w:t>ngel Rojas</w:t>
+              <w:t>Angel Rojas</w:t>
             </w:r>
           </w:p>
         </w:tc>
@@ -5464,6 +5420,7 @@
               <w:pStyle w:val="Normal"/>
               <w:widowControl/>
               <w:suppressAutoHyphens w:val="true"/>
+              <w:bidi w:val="0"/>
               <w:spacing w:before="0" w:after="160"/>
               <w:jc w:val="start"/>
               <w:rPr>
@@ -5490,24 +5447,26 @@
                 <w:szCs w:val="20"/>
                 <w:lang w:eastAsia="es-CL"/>
               </w:rPr>
-            </w:r>
-          </w:p>
-        </w:tc>
-        <w:tc>
-          <w:tcPr>
-            <w:tcW w:w="1371" w:type="dxa"/>
-            <w:tcBorders>
-              <w:top w:val="single" w:sz="4" w:space="0" w:color="BFBFBF"/>
-              <w:start w:val="single" w:sz="4" w:space="0" w:color="BFBFBF"/>
-              <w:bottom w:val="single" w:sz="4" w:space="0" w:color="BFBFBF"/>
-              <w:end w:val="single" w:sz="4" w:space="0" w:color="BFBFBF"/>
-            </w:tcBorders>
-          </w:tcPr>
-          <w:p>
-            <w:pPr>
-              <w:pStyle w:val="Normal"/>
-              <w:widowControl/>
-              <w:suppressAutoHyphens w:val="true"/>
+              <w:t>Desarrollar una solución de software utilizando técnicas que permitan sistematizar el proceso de desarrollo y mantenimiento, asegurando el logro de los objetivos.</w:t>
+            </w:r>
+          </w:p>
+        </w:tc>
+        <w:tc>
+          <w:tcPr>
+            <w:tcW w:w="1370" w:type="dxa"/>
+            <w:tcBorders>
+              <w:top w:val="single" w:sz="4" w:space="0" w:color="BFBFBF"/>
+              <w:start w:val="single" w:sz="4" w:space="0" w:color="BFBFBF"/>
+              <w:bottom w:val="single" w:sz="4" w:space="0" w:color="BFBFBF"/>
+              <w:end w:val="single" w:sz="4" w:space="0" w:color="BFBFBF"/>
+            </w:tcBorders>
+          </w:tcPr>
+          <w:p>
+            <w:pPr>
+              <w:pStyle w:val="Normal"/>
+              <w:widowControl/>
+              <w:suppressAutoHyphens w:val="true"/>
+              <w:bidi w:val="0"/>
               <w:spacing w:before="0" w:after="160"/>
               <w:jc w:val="start"/>
               <w:rPr>
@@ -5534,6 +5493,7 @@
                 <w:szCs w:val="20"/>
                 <w:lang w:eastAsia="es-CL"/>
               </w:rPr>
+              <w:t>Diseño e implementación del lenguaje de programación e intérprete base</w:t>
             </w:r>
           </w:p>
         </w:tc>
@@ -5552,6 +5512,7 @@
               <w:pStyle w:val="Normal"/>
               <w:widowControl/>
               <w:suppressAutoHyphens w:val="true"/>
+              <w:bidi w:val="0"/>
               <w:spacing w:before="0" w:after="160"/>
               <w:jc w:val="start"/>
               <w:rPr>
@@ -5578,6 +5539,7 @@
                 <w:szCs w:val="20"/>
                 <w:lang w:eastAsia="es-CL"/>
               </w:rPr>
+              <w:t>Diseñar e implementar el lenguaje de programación utilizado por Directiva, con sintaxis inspirada en Python. El sistema incluirá variables, tipos de datos básicos, operaciones, estructuras de control, funciones, colecciones, importación de scripts y funciones predefinidas para consultar y actuar sobre el entorno. También se desarrollará el intérprete o máquina virtual encargado de procesar y ejecutar los programas de los Agentes y del Nexo.</w:t>
             </w:r>
           </w:p>
         </w:tc>
@@ -5596,6 +5558,7 @@
               <w:pStyle w:val="Normal"/>
               <w:widowControl/>
               <w:suppressAutoHyphens w:val="true"/>
+              <w:bidi w:val="0"/>
               <w:spacing w:before="0" w:after="160"/>
               <w:jc w:val="start"/>
               <w:rPr>
@@ -5622,12 +5585,13 @@
                 <w:szCs w:val="20"/>
                 <w:lang w:eastAsia="es-CL"/>
               </w:rPr>
-            </w:r>
-          </w:p>
-        </w:tc>
-        <w:tc>
-          <w:tcPr>
-            <w:tcW w:w="986" w:type="dxa"/>
+              <w:t>Entorno de desarrollo C#, Unity, repositorio del proyecto, documentación técnica, herramientas de pruebas y usuarios de prueba con conocimientos de programación.</w:t>
+            </w:r>
+          </w:p>
+        </w:tc>
+        <w:tc>
+          <w:tcPr>
+            <w:tcW w:w="987" w:type="dxa"/>
             <w:tcBorders>
               <w:top w:val="single" w:sz="4" w:space="0" w:color="BFBFBF"/>
               <w:start w:val="single" w:sz="4" w:space="0" w:color="BFBFBF"/>
@@ -5640,6 +5604,7 @@
               <w:pStyle w:val="Normal"/>
               <w:widowControl/>
               <w:suppressAutoHyphens w:val="true"/>
+              <w:bidi w:val="0"/>
               <w:spacing w:before="0" w:after="160"/>
               <w:jc w:val="start"/>
               <w:rPr>
@@ -5666,6 +5631,7 @@
                 <w:szCs w:val="20"/>
                 <w:lang w:eastAsia="es-CL"/>
               </w:rPr>
+              <w:t>2 semanas al inicio de la Fase 2</w:t>
             </w:r>
           </w:p>
         </w:tc>
@@ -5685,6 +5651,7 @@
               <w:pStyle w:val="Normal"/>
               <w:widowControl/>
               <w:suppressAutoHyphens w:val="true"/>
+              <w:bidi w:val="0"/>
               <w:spacing w:before="0" w:after="160"/>
               <w:jc w:val="start"/>
               <w:rPr>
@@ -5711,6 +5678,7 @@
                 <w:szCs w:val="20"/>
                 <w:lang w:eastAsia="es-CL"/>
               </w:rPr>
+              <w:t>Ángel Rojas</w:t>
             </w:r>
           </w:p>
         </w:tc>
@@ -5729,6 +5697,3208 @@
               <w:pStyle w:val="Normal"/>
               <w:widowControl/>
               <w:suppressAutoHyphens w:val="true"/>
+              <w:bidi w:val="0"/>
+              <w:spacing w:before="0" w:after="160"/>
+              <w:jc w:val="start"/>
+              <w:rPr>
+                <w:rFonts w:ascii="Calibri" w:hAnsi="Calibri" w:cs="Arial"/>
+                <w:b w:val="false"/>
+                <w:bCs w:val="false"/>
+                <w:i w:val="false"/>
+                <w:iCs w:val="false"/>
+                <w:color w:val="000000"/>
+                <w:sz w:val="18"/>
+                <w:szCs w:val="20"/>
+                <w:lang w:eastAsia="es-CL"/>
+              </w:rPr>
+            </w:pPr>
+            <w:r>
+              <w:rPr>
+                <w:rFonts w:cs="Arial"/>
+                <w:b w:val="false"/>
+                <w:bCs w:val="false"/>
+                <w:i w:val="false"/>
+                <w:iCs w:val="false"/>
+                <w:color w:val="000000"/>
+                <w:sz w:val="18"/>
+                <w:szCs w:val="20"/>
+                <w:lang w:eastAsia="es-CL"/>
+              </w:rPr>
+              <w:t>Esta actividad se priorizará al inicio del desarrollo por representar uno de los componentes técnicos centrales del proyecto. Se buscará obtener tempranamente una versión funcional del lenguaje que pueda ser probada de forma aislada por usuarios con conocimientos de programación, permitiendo detectar errores y problemas de diseño antes de integrarlo completamente con la simulación.</w:t>
+            </w:r>
+          </w:p>
+        </w:tc>
+      </w:tr>
+      <w:tr>
+        <w:trPr/>
+        <w:tc>
+          <w:tcPr>
+            <w:tcW w:w="1579" w:type="dxa"/>
+            <w:tcBorders>
+              <w:top w:val="nil"/>
+              <w:start w:val="single" w:sz="4" w:space="0" w:color="BFBFBF"/>
+              <w:bottom w:val="single" w:sz="4" w:space="0" w:color="BFBFBF"/>
+              <w:end w:val="single" w:sz="4" w:space="0" w:color="BFBFBF"/>
+            </w:tcBorders>
+          </w:tcPr>
+          <w:p>
+            <w:pPr>
+              <w:pStyle w:val="Normal"/>
+              <w:widowControl/>
+              <w:suppressAutoHyphens w:val="true"/>
+              <w:bidi w:val="0"/>
+              <w:spacing w:before="0" w:after="160"/>
+              <w:jc w:val="start"/>
+              <w:rPr>
+                <w:rFonts w:ascii="Calibri" w:hAnsi="Calibri" w:cs="Arial"/>
+                <w:b w:val="false"/>
+                <w:bCs w:val="false"/>
+                <w:i w:val="false"/>
+                <w:iCs w:val="false"/>
+                <w:color w:val="000000"/>
+                <w:sz w:val="18"/>
+                <w:szCs w:val="20"/>
+                <w:lang w:eastAsia="es-CL"/>
+              </w:rPr>
+            </w:pPr>
+            <w:r>
+              <w:rPr>
+                <w:rFonts w:cs="Arial"/>
+                <w:b w:val="false"/>
+                <w:bCs w:val="false"/>
+                <w:i w:val="false"/>
+                <w:iCs w:val="false"/>
+                <w:color w:val="000000"/>
+                <w:sz w:val="18"/>
+                <w:szCs w:val="20"/>
+                <w:lang w:eastAsia="es-CL"/>
+              </w:rPr>
+            </w:r>
+          </w:p>
+        </w:tc>
+        <w:tc>
+          <w:tcPr>
+            <w:tcW w:w="1370" w:type="dxa"/>
+            <w:tcBorders>
+              <w:top w:val="nil"/>
+              <w:start w:val="single" w:sz="4" w:space="0" w:color="BFBFBF"/>
+              <w:bottom w:val="single" w:sz="4" w:space="0" w:color="BFBFBF"/>
+              <w:end w:val="single" w:sz="4" w:space="0" w:color="BFBFBF"/>
+            </w:tcBorders>
+          </w:tcPr>
+          <w:p>
+            <w:pPr>
+              <w:pStyle w:val="Normal"/>
+              <w:widowControl/>
+              <w:suppressAutoHyphens w:val="true"/>
+              <w:bidi w:val="0"/>
+              <w:spacing w:before="0" w:after="160"/>
+              <w:jc w:val="start"/>
+              <w:rPr>
+                <w:rFonts w:ascii="Calibri" w:hAnsi="Calibri" w:cs="Arial"/>
+                <w:b w:val="false"/>
+                <w:bCs w:val="false"/>
+                <w:i w:val="false"/>
+                <w:iCs w:val="false"/>
+                <w:color w:val="000000"/>
+                <w:sz w:val="18"/>
+                <w:szCs w:val="20"/>
+                <w:lang w:eastAsia="es-CL"/>
+              </w:rPr>
+            </w:pPr>
+            <w:r>
+              <w:rPr>
+                <w:rFonts w:cs="Arial"/>
+                <w:b w:val="false"/>
+                <w:bCs w:val="false"/>
+                <w:i w:val="false"/>
+                <w:iCs w:val="false"/>
+                <w:color w:val="000000"/>
+                <w:sz w:val="18"/>
+                <w:szCs w:val="20"/>
+                <w:lang w:eastAsia="es-CL"/>
+              </w:rPr>
+              <w:t>Desarrollo del núcleo de simulación</w:t>
+            </w:r>
+          </w:p>
+        </w:tc>
+        <w:tc>
+          <w:tcPr>
+            <w:tcW w:w="2150" w:type="dxa"/>
+            <w:tcBorders>
+              <w:top w:val="nil"/>
+              <w:start w:val="single" w:sz="4" w:space="0" w:color="BFBFBF"/>
+              <w:bottom w:val="single" w:sz="4" w:space="0" w:color="BFBFBF"/>
+              <w:end w:val="single" w:sz="4" w:space="0" w:color="BFBFBF"/>
+            </w:tcBorders>
+          </w:tcPr>
+          <w:p>
+            <w:pPr>
+              <w:pStyle w:val="Normal"/>
+              <w:widowControl/>
+              <w:suppressAutoHyphens w:val="true"/>
+              <w:bidi w:val="0"/>
+              <w:spacing w:before="0" w:after="160"/>
+              <w:jc w:val="start"/>
+              <w:rPr>
+                <w:rFonts w:ascii="Calibri" w:hAnsi="Calibri" w:cs="Arial"/>
+                <w:b w:val="false"/>
+                <w:bCs w:val="false"/>
+                <w:i w:val="false"/>
+                <w:iCs w:val="false"/>
+                <w:color w:val="000000"/>
+                <w:sz w:val="18"/>
+                <w:szCs w:val="20"/>
+                <w:lang w:eastAsia="es-CL"/>
+              </w:rPr>
+            </w:pPr>
+            <w:r>
+              <w:rPr>
+                <w:rFonts w:cs="Arial"/>
+                <w:b w:val="false"/>
+                <w:bCs w:val="false"/>
+                <w:i w:val="false"/>
+                <w:iCs w:val="false"/>
+                <w:color w:val="000000"/>
+                <w:sz w:val="18"/>
+                <w:szCs w:val="20"/>
+                <w:lang w:eastAsia="es-CL"/>
+              </w:rPr>
+            </w:r>
+          </w:p>
+        </w:tc>
+        <w:tc>
+          <w:tcPr>
+            <w:tcW w:w="1813" w:type="dxa"/>
+            <w:tcBorders>
+              <w:top w:val="nil"/>
+              <w:start w:val="single" w:sz="4" w:space="0" w:color="BFBFBF"/>
+              <w:bottom w:val="single" w:sz="4" w:space="0" w:color="BFBFBF"/>
+              <w:end w:val="single" w:sz="4" w:space="0" w:color="BFBFBF"/>
+            </w:tcBorders>
+          </w:tcPr>
+          <w:p>
+            <w:pPr>
+              <w:pStyle w:val="Normal"/>
+              <w:widowControl/>
+              <w:suppressAutoHyphens w:val="true"/>
+              <w:bidi w:val="0"/>
+              <w:spacing w:before="0" w:after="160"/>
+              <w:jc w:val="start"/>
+              <w:rPr>
+                <w:rFonts w:ascii="Calibri" w:hAnsi="Calibri" w:cs="Arial"/>
+                <w:b w:val="false"/>
+                <w:bCs w:val="false"/>
+                <w:i w:val="false"/>
+                <w:iCs w:val="false"/>
+                <w:color w:val="000000"/>
+                <w:sz w:val="18"/>
+                <w:szCs w:val="20"/>
+                <w:lang w:eastAsia="es-CL"/>
+              </w:rPr>
+            </w:pPr>
+            <w:r>
+              <w:rPr>
+                <w:rFonts w:cs="Arial"/>
+                <w:b w:val="false"/>
+                <w:bCs w:val="false"/>
+                <w:i w:val="false"/>
+                <w:iCs w:val="false"/>
+                <w:color w:val="000000"/>
+                <w:sz w:val="18"/>
+                <w:szCs w:val="20"/>
+                <w:lang w:eastAsia="es-CL"/>
+              </w:rPr>
+            </w:r>
+          </w:p>
+        </w:tc>
+        <w:tc>
+          <w:tcPr>
+            <w:tcW w:w="987" w:type="dxa"/>
+            <w:tcBorders>
+              <w:top w:val="nil"/>
+              <w:start w:val="single" w:sz="4" w:space="0" w:color="BFBFBF"/>
+              <w:bottom w:val="single" w:sz="4" w:space="0" w:color="BFBFBF"/>
+              <w:end w:val="single" w:sz="4" w:space="0" w:color="FFFFFF"/>
+            </w:tcBorders>
+          </w:tcPr>
+          <w:p>
+            <w:pPr>
+              <w:pStyle w:val="Normal"/>
+              <w:widowControl/>
+              <w:suppressAutoHyphens w:val="true"/>
+              <w:bidi w:val="0"/>
+              <w:spacing w:before="0" w:after="160"/>
+              <w:jc w:val="start"/>
+              <w:rPr>
+                <w:rFonts w:ascii="Calibri" w:hAnsi="Calibri" w:cs="Arial"/>
+                <w:b w:val="false"/>
+                <w:bCs w:val="false"/>
+                <w:i w:val="false"/>
+                <w:iCs w:val="false"/>
+                <w:color w:val="000000"/>
+                <w:sz w:val="18"/>
+                <w:szCs w:val="20"/>
+                <w:lang w:eastAsia="es-CL"/>
+              </w:rPr>
+            </w:pPr>
+            <w:r>
+              <w:rPr>
+                <w:rFonts w:cs="Arial"/>
+                <w:b w:val="false"/>
+                <w:bCs w:val="false"/>
+                <w:i w:val="false"/>
+                <w:iCs w:val="false"/>
+                <w:color w:val="000000"/>
+                <w:sz w:val="18"/>
+                <w:szCs w:val="20"/>
+                <w:lang w:eastAsia="es-CL"/>
+              </w:rPr>
+            </w:r>
+          </w:p>
+        </w:tc>
+        <w:tc>
+          <w:tcPr>
+            <w:tcW w:w="1580" w:type="dxa"/>
+            <w:tcBorders>
+              <w:top w:val="nil"/>
+              <w:start w:val="single" w:sz="4" w:space="0" w:color="FFFFFF"/>
+              <w:bottom w:val="single" w:sz="4" w:space="0" w:color="BFBFBF"/>
+              <w:end w:val="single" w:sz="4" w:space="0" w:color="BFBFBF"/>
+            </w:tcBorders>
+            <w:shd w:color="auto" w:fill="D9D9D9" w:themeFill="background1" w:themeFillShade="d9" w:val="clear"/>
+          </w:tcPr>
+          <w:p>
+            <w:pPr>
+              <w:pStyle w:val="Normal"/>
+              <w:widowControl/>
+              <w:suppressAutoHyphens w:val="true"/>
+              <w:bidi w:val="0"/>
+              <w:spacing w:before="0" w:after="160"/>
+              <w:jc w:val="start"/>
+              <w:rPr>
+                <w:rFonts w:ascii="Calibri" w:hAnsi="Calibri" w:cs="Arial"/>
+                <w:b w:val="false"/>
+                <w:bCs w:val="false"/>
+                <w:i w:val="false"/>
+                <w:iCs w:val="false"/>
+                <w:color w:val="000000"/>
+                <w:sz w:val="18"/>
+                <w:szCs w:val="20"/>
+                <w:lang w:eastAsia="es-CL"/>
+              </w:rPr>
+            </w:pPr>
+            <w:r>
+              <w:rPr>
+                <w:rFonts w:cs="Arial"/>
+                <w:b w:val="false"/>
+                <w:bCs w:val="false"/>
+                <w:i w:val="false"/>
+                <w:iCs w:val="false"/>
+                <w:color w:val="000000"/>
+                <w:sz w:val="18"/>
+                <w:szCs w:val="20"/>
+                <w:lang w:eastAsia="es-CL"/>
+              </w:rPr>
+            </w:r>
+          </w:p>
+        </w:tc>
+        <w:tc>
+          <w:tcPr>
+            <w:tcW w:w="1581" w:type="dxa"/>
+            <w:tcBorders>
+              <w:top w:val="nil"/>
+              <w:start w:val="single" w:sz="4" w:space="0" w:color="BFBFBF"/>
+              <w:bottom w:val="single" w:sz="4" w:space="0" w:color="BFBFBF"/>
+              <w:end w:val="single" w:sz="4" w:space="0" w:color="BFBFBF"/>
+            </w:tcBorders>
+          </w:tcPr>
+          <w:p>
+            <w:pPr>
+              <w:pStyle w:val="Normal"/>
+              <w:widowControl/>
+              <w:suppressAutoHyphens w:val="true"/>
+              <w:bidi w:val="0"/>
+              <w:spacing w:before="0" w:after="160"/>
+              <w:jc w:val="start"/>
+              <w:rPr>
+                <w:rFonts w:ascii="Calibri" w:hAnsi="Calibri" w:cs="Arial"/>
+                <w:b w:val="false"/>
+                <w:bCs w:val="false"/>
+                <w:i w:val="false"/>
+                <w:iCs w:val="false"/>
+                <w:color w:val="000000"/>
+                <w:sz w:val="18"/>
+                <w:szCs w:val="20"/>
+                <w:lang w:eastAsia="es-CL"/>
+              </w:rPr>
+            </w:pPr>
+            <w:r>
+              <w:rPr>
+                <w:rFonts w:cs="Arial"/>
+                <w:b w:val="false"/>
+                <w:bCs w:val="false"/>
+                <w:i w:val="false"/>
+                <w:iCs w:val="false"/>
+                <w:color w:val="000000"/>
+                <w:sz w:val="18"/>
+                <w:szCs w:val="20"/>
+                <w:lang w:eastAsia="es-CL"/>
+              </w:rPr>
+            </w:r>
+          </w:p>
+        </w:tc>
+      </w:tr>
+      <w:tr>
+        <w:trPr/>
+        <w:tc>
+          <w:tcPr>
+            <w:tcW w:w="1579" w:type="dxa"/>
+            <w:tcBorders>
+              <w:top w:val="nil"/>
+              <w:start w:val="single" w:sz="4" w:space="0" w:color="BFBFBF"/>
+              <w:bottom w:val="single" w:sz="4" w:space="0" w:color="BFBFBF"/>
+              <w:end w:val="single" w:sz="4" w:space="0" w:color="BFBFBF"/>
+            </w:tcBorders>
+          </w:tcPr>
+          <w:p>
+            <w:pPr>
+              <w:pStyle w:val="Normal"/>
+              <w:widowControl/>
+              <w:suppressAutoHyphens w:val="true"/>
+              <w:bidi w:val="0"/>
+              <w:spacing w:before="0" w:after="160"/>
+              <w:jc w:val="start"/>
+              <w:rPr>
+                <w:rFonts w:ascii="Calibri" w:hAnsi="Calibri" w:cs="Arial"/>
+                <w:b w:val="false"/>
+                <w:bCs w:val="false"/>
+                <w:i w:val="false"/>
+                <w:iCs w:val="false"/>
+                <w:color w:val="000000"/>
+                <w:sz w:val="18"/>
+                <w:szCs w:val="20"/>
+                <w:lang w:eastAsia="es-CL"/>
+              </w:rPr>
+            </w:pPr>
+            <w:r>
+              <w:rPr>
+                <w:rFonts w:cs="Arial"/>
+                <w:b w:val="false"/>
+                <w:bCs w:val="false"/>
+                <w:i w:val="false"/>
+                <w:iCs w:val="false"/>
+                <w:color w:val="000000"/>
+                <w:sz w:val="18"/>
+                <w:szCs w:val="20"/>
+                <w:lang w:eastAsia="es-CL"/>
+              </w:rPr>
+            </w:r>
+          </w:p>
+        </w:tc>
+        <w:tc>
+          <w:tcPr>
+            <w:tcW w:w="1370" w:type="dxa"/>
+            <w:tcBorders>
+              <w:top w:val="nil"/>
+              <w:start w:val="single" w:sz="4" w:space="0" w:color="BFBFBF"/>
+              <w:bottom w:val="single" w:sz="4" w:space="0" w:color="BFBFBF"/>
+              <w:end w:val="single" w:sz="4" w:space="0" w:color="BFBFBF"/>
+            </w:tcBorders>
+          </w:tcPr>
+          <w:p>
+            <w:pPr>
+              <w:pStyle w:val="Normal"/>
+              <w:widowControl/>
+              <w:suppressAutoHyphens w:val="true"/>
+              <w:bidi w:val="0"/>
+              <w:spacing w:before="0" w:after="160"/>
+              <w:jc w:val="start"/>
+              <w:rPr>
+                <w:rFonts w:ascii="Calibri" w:hAnsi="Calibri" w:cs="Arial"/>
+                <w:b w:val="false"/>
+                <w:bCs w:val="false"/>
+                <w:i w:val="false"/>
+                <w:iCs w:val="false"/>
+                <w:color w:val="000000"/>
+                <w:sz w:val="18"/>
+                <w:szCs w:val="20"/>
+                <w:lang w:eastAsia="es-CL"/>
+              </w:rPr>
+            </w:pPr>
+            <w:r>
+              <w:rPr>
+                <w:rFonts w:cs="Arial"/>
+                <w:b w:val="false"/>
+                <w:bCs w:val="false"/>
+                <w:i w:val="false"/>
+                <w:iCs w:val="false"/>
+                <w:color w:val="000000"/>
+                <w:sz w:val="18"/>
+                <w:szCs w:val="20"/>
+                <w:lang w:eastAsia="es-CL"/>
+              </w:rPr>
+              <w:t>Desarrollo del orquestador y flujo general del juego</w:t>
+            </w:r>
+          </w:p>
+        </w:tc>
+        <w:tc>
+          <w:tcPr>
+            <w:tcW w:w="2150" w:type="dxa"/>
+            <w:tcBorders>
+              <w:top w:val="nil"/>
+              <w:start w:val="single" w:sz="4" w:space="0" w:color="BFBFBF"/>
+              <w:bottom w:val="single" w:sz="4" w:space="0" w:color="BFBFBF"/>
+              <w:end w:val="single" w:sz="4" w:space="0" w:color="BFBFBF"/>
+            </w:tcBorders>
+          </w:tcPr>
+          <w:p>
+            <w:pPr>
+              <w:pStyle w:val="Normal"/>
+              <w:widowControl/>
+              <w:suppressAutoHyphens w:val="true"/>
+              <w:bidi w:val="0"/>
+              <w:spacing w:before="0" w:after="160"/>
+              <w:jc w:val="start"/>
+              <w:rPr>
+                <w:rFonts w:ascii="Calibri" w:hAnsi="Calibri" w:cs="Arial"/>
+                <w:b w:val="false"/>
+                <w:bCs w:val="false"/>
+                <w:i w:val="false"/>
+                <w:iCs w:val="false"/>
+                <w:color w:val="000000"/>
+                <w:sz w:val="18"/>
+                <w:szCs w:val="20"/>
+                <w:lang w:eastAsia="es-CL"/>
+              </w:rPr>
+            </w:pPr>
+            <w:r>
+              <w:rPr>
+                <w:rFonts w:cs="Arial"/>
+                <w:b w:val="false"/>
+                <w:bCs w:val="false"/>
+                <w:i w:val="false"/>
+                <w:iCs w:val="false"/>
+                <w:color w:val="000000"/>
+                <w:sz w:val="18"/>
+                <w:szCs w:val="20"/>
+                <w:lang w:eastAsia="es-CL"/>
+              </w:rPr>
+            </w:r>
+          </w:p>
+        </w:tc>
+        <w:tc>
+          <w:tcPr>
+            <w:tcW w:w="1813" w:type="dxa"/>
+            <w:tcBorders>
+              <w:top w:val="nil"/>
+              <w:start w:val="single" w:sz="4" w:space="0" w:color="BFBFBF"/>
+              <w:bottom w:val="single" w:sz="4" w:space="0" w:color="BFBFBF"/>
+              <w:end w:val="single" w:sz="4" w:space="0" w:color="BFBFBF"/>
+            </w:tcBorders>
+          </w:tcPr>
+          <w:p>
+            <w:pPr>
+              <w:pStyle w:val="Normal"/>
+              <w:widowControl/>
+              <w:suppressAutoHyphens w:val="true"/>
+              <w:bidi w:val="0"/>
+              <w:spacing w:before="0" w:after="160"/>
+              <w:jc w:val="start"/>
+              <w:rPr>
+                <w:rFonts w:ascii="Calibri" w:hAnsi="Calibri" w:cs="Arial"/>
+                <w:b w:val="false"/>
+                <w:bCs w:val="false"/>
+                <w:i w:val="false"/>
+                <w:iCs w:val="false"/>
+                <w:color w:val="000000"/>
+                <w:sz w:val="18"/>
+                <w:szCs w:val="20"/>
+                <w:lang w:eastAsia="es-CL"/>
+              </w:rPr>
+            </w:pPr>
+            <w:r>
+              <w:rPr>
+                <w:rFonts w:cs="Arial"/>
+                <w:b w:val="false"/>
+                <w:bCs w:val="false"/>
+                <w:i w:val="false"/>
+                <w:iCs w:val="false"/>
+                <w:color w:val="000000"/>
+                <w:sz w:val="18"/>
+                <w:szCs w:val="20"/>
+                <w:lang w:eastAsia="es-CL"/>
+              </w:rPr>
+            </w:r>
+          </w:p>
+        </w:tc>
+        <w:tc>
+          <w:tcPr>
+            <w:tcW w:w="987" w:type="dxa"/>
+            <w:tcBorders>
+              <w:top w:val="nil"/>
+              <w:start w:val="single" w:sz="4" w:space="0" w:color="BFBFBF"/>
+              <w:bottom w:val="single" w:sz="4" w:space="0" w:color="BFBFBF"/>
+              <w:end w:val="single" w:sz="4" w:space="0" w:color="FFFFFF"/>
+            </w:tcBorders>
+          </w:tcPr>
+          <w:p>
+            <w:pPr>
+              <w:pStyle w:val="Normal"/>
+              <w:widowControl/>
+              <w:suppressAutoHyphens w:val="true"/>
+              <w:bidi w:val="0"/>
+              <w:spacing w:before="0" w:after="160"/>
+              <w:jc w:val="start"/>
+              <w:rPr>
+                <w:rFonts w:ascii="Calibri" w:hAnsi="Calibri" w:cs="Arial"/>
+                <w:b w:val="false"/>
+                <w:bCs w:val="false"/>
+                <w:i w:val="false"/>
+                <w:iCs w:val="false"/>
+                <w:color w:val="000000"/>
+                <w:sz w:val="18"/>
+                <w:szCs w:val="20"/>
+                <w:lang w:eastAsia="es-CL"/>
+              </w:rPr>
+            </w:pPr>
+            <w:r>
+              <w:rPr>
+                <w:rFonts w:cs="Arial"/>
+                <w:b w:val="false"/>
+                <w:bCs w:val="false"/>
+                <w:i w:val="false"/>
+                <w:iCs w:val="false"/>
+                <w:color w:val="000000"/>
+                <w:sz w:val="18"/>
+                <w:szCs w:val="20"/>
+                <w:lang w:eastAsia="es-CL"/>
+              </w:rPr>
+            </w:r>
+          </w:p>
+        </w:tc>
+        <w:tc>
+          <w:tcPr>
+            <w:tcW w:w="1580" w:type="dxa"/>
+            <w:tcBorders>
+              <w:top w:val="nil"/>
+              <w:start w:val="single" w:sz="4" w:space="0" w:color="FFFFFF"/>
+              <w:bottom w:val="single" w:sz="4" w:space="0" w:color="BFBFBF"/>
+              <w:end w:val="single" w:sz="4" w:space="0" w:color="BFBFBF"/>
+            </w:tcBorders>
+            <w:shd w:color="auto" w:fill="D9D9D9" w:themeFill="background1" w:themeFillShade="d9" w:val="clear"/>
+          </w:tcPr>
+          <w:p>
+            <w:pPr>
+              <w:pStyle w:val="Normal"/>
+              <w:widowControl/>
+              <w:suppressAutoHyphens w:val="true"/>
+              <w:bidi w:val="0"/>
+              <w:spacing w:before="0" w:after="160"/>
+              <w:jc w:val="start"/>
+              <w:rPr>
+                <w:rFonts w:ascii="Calibri" w:hAnsi="Calibri" w:cs="Arial"/>
+                <w:b w:val="false"/>
+                <w:bCs w:val="false"/>
+                <w:i w:val="false"/>
+                <w:iCs w:val="false"/>
+                <w:color w:val="000000"/>
+                <w:sz w:val="18"/>
+                <w:szCs w:val="20"/>
+                <w:lang w:eastAsia="es-CL"/>
+              </w:rPr>
+            </w:pPr>
+            <w:r>
+              <w:rPr>
+                <w:rFonts w:cs="Arial"/>
+                <w:b w:val="false"/>
+                <w:bCs w:val="false"/>
+                <w:i w:val="false"/>
+                <w:iCs w:val="false"/>
+                <w:color w:val="000000"/>
+                <w:sz w:val="18"/>
+                <w:szCs w:val="20"/>
+                <w:lang w:eastAsia="es-CL"/>
+              </w:rPr>
+            </w:r>
+          </w:p>
+        </w:tc>
+        <w:tc>
+          <w:tcPr>
+            <w:tcW w:w="1581" w:type="dxa"/>
+            <w:tcBorders>
+              <w:top w:val="nil"/>
+              <w:start w:val="single" w:sz="4" w:space="0" w:color="BFBFBF"/>
+              <w:bottom w:val="single" w:sz="4" w:space="0" w:color="BFBFBF"/>
+              <w:end w:val="single" w:sz="4" w:space="0" w:color="BFBFBF"/>
+            </w:tcBorders>
+          </w:tcPr>
+          <w:p>
+            <w:pPr>
+              <w:pStyle w:val="Normal"/>
+              <w:widowControl/>
+              <w:suppressAutoHyphens w:val="true"/>
+              <w:bidi w:val="0"/>
+              <w:spacing w:before="0" w:after="160"/>
+              <w:jc w:val="start"/>
+              <w:rPr>
+                <w:rFonts w:ascii="Calibri" w:hAnsi="Calibri" w:cs="Arial"/>
+                <w:b w:val="false"/>
+                <w:bCs w:val="false"/>
+                <w:i w:val="false"/>
+                <w:iCs w:val="false"/>
+                <w:color w:val="000000"/>
+                <w:sz w:val="18"/>
+                <w:szCs w:val="20"/>
+                <w:lang w:eastAsia="es-CL"/>
+              </w:rPr>
+            </w:pPr>
+            <w:r>
+              <w:rPr>
+                <w:rFonts w:cs="Arial"/>
+                <w:b w:val="false"/>
+                <w:bCs w:val="false"/>
+                <w:i w:val="false"/>
+                <w:iCs w:val="false"/>
+                <w:color w:val="000000"/>
+                <w:sz w:val="18"/>
+                <w:szCs w:val="20"/>
+                <w:lang w:eastAsia="es-CL"/>
+              </w:rPr>
+            </w:r>
+          </w:p>
+        </w:tc>
+      </w:tr>
+      <w:tr>
+        <w:trPr/>
+        <w:tc>
+          <w:tcPr>
+            <w:tcW w:w="1579" w:type="dxa"/>
+            <w:tcBorders>
+              <w:top w:val="nil"/>
+              <w:start w:val="single" w:sz="4" w:space="0" w:color="BFBFBF"/>
+              <w:bottom w:val="single" w:sz="4" w:space="0" w:color="BFBFBF"/>
+              <w:end w:val="single" w:sz="4" w:space="0" w:color="BFBFBF"/>
+            </w:tcBorders>
+          </w:tcPr>
+          <w:p>
+            <w:pPr>
+              <w:pStyle w:val="Normal"/>
+              <w:widowControl/>
+              <w:suppressAutoHyphens w:val="true"/>
+              <w:bidi w:val="0"/>
+              <w:spacing w:before="0" w:after="160"/>
+              <w:jc w:val="start"/>
+              <w:rPr>
+                <w:rFonts w:ascii="Calibri" w:hAnsi="Calibri" w:cs="Arial"/>
+                <w:b w:val="false"/>
+                <w:bCs w:val="false"/>
+                <w:i w:val="false"/>
+                <w:iCs w:val="false"/>
+                <w:color w:val="000000"/>
+                <w:sz w:val="18"/>
+                <w:szCs w:val="20"/>
+                <w:lang w:eastAsia="es-CL"/>
+              </w:rPr>
+            </w:pPr>
+            <w:r>
+              <w:rPr>
+                <w:rFonts w:cs="Arial"/>
+                <w:b w:val="false"/>
+                <w:bCs w:val="false"/>
+                <w:i w:val="false"/>
+                <w:iCs w:val="false"/>
+                <w:color w:val="000000"/>
+                <w:sz w:val="18"/>
+                <w:szCs w:val="20"/>
+                <w:lang w:eastAsia="es-CL"/>
+              </w:rPr>
+            </w:r>
+          </w:p>
+        </w:tc>
+        <w:tc>
+          <w:tcPr>
+            <w:tcW w:w="1370" w:type="dxa"/>
+            <w:tcBorders>
+              <w:top w:val="nil"/>
+              <w:start w:val="single" w:sz="4" w:space="0" w:color="BFBFBF"/>
+              <w:bottom w:val="single" w:sz="4" w:space="0" w:color="BFBFBF"/>
+              <w:end w:val="single" w:sz="4" w:space="0" w:color="BFBFBF"/>
+            </w:tcBorders>
+          </w:tcPr>
+          <w:p>
+            <w:pPr>
+              <w:pStyle w:val="Normal"/>
+              <w:widowControl/>
+              <w:suppressAutoHyphens w:val="true"/>
+              <w:bidi w:val="0"/>
+              <w:spacing w:before="0" w:after="160"/>
+              <w:jc w:val="start"/>
+              <w:rPr>
+                <w:rFonts w:ascii="Calibri" w:hAnsi="Calibri" w:cs="Arial"/>
+                <w:b w:val="false"/>
+                <w:bCs w:val="false"/>
+                <w:i w:val="false"/>
+                <w:iCs w:val="false"/>
+                <w:color w:val="000000"/>
+                <w:sz w:val="18"/>
+                <w:szCs w:val="20"/>
+                <w:lang w:eastAsia="es-CL"/>
+              </w:rPr>
+            </w:pPr>
+            <w:r>
+              <w:rPr>
+                <w:rFonts w:cs="Arial"/>
+                <w:b w:val="false"/>
+                <w:bCs w:val="false"/>
+                <w:i w:val="false"/>
+                <w:iCs w:val="false"/>
+                <w:color w:val="000000"/>
+                <w:sz w:val="18"/>
+                <w:szCs w:val="20"/>
+                <w:lang w:eastAsia="es-CL"/>
+              </w:rPr>
+              <w:t>Desarrollo de la interfaz de usuario y sistema de programación</w:t>
+            </w:r>
+          </w:p>
+        </w:tc>
+        <w:tc>
+          <w:tcPr>
+            <w:tcW w:w="2150" w:type="dxa"/>
+            <w:tcBorders>
+              <w:top w:val="nil"/>
+              <w:start w:val="single" w:sz="4" w:space="0" w:color="BFBFBF"/>
+              <w:bottom w:val="single" w:sz="4" w:space="0" w:color="BFBFBF"/>
+              <w:end w:val="single" w:sz="4" w:space="0" w:color="BFBFBF"/>
+            </w:tcBorders>
+          </w:tcPr>
+          <w:p>
+            <w:pPr>
+              <w:pStyle w:val="Normal"/>
+              <w:widowControl/>
+              <w:suppressAutoHyphens w:val="true"/>
+              <w:bidi w:val="0"/>
+              <w:spacing w:before="0" w:after="160"/>
+              <w:jc w:val="start"/>
+              <w:rPr>
+                <w:rFonts w:ascii="Calibri" w:hAnsi="Calibri" w:cs="Arial"/>
+                <w:b w:val="false"/>
+                <w:bCs w:val="false"/>
+                <w:i w:val="false"/>
+                <w:iCs w:val="false"/>
+                <w:color w:val="000000"/>
+                <w:sz w:val="18"/>
+                <w:szCs w:val="20"/>
+                <w:lang w:eastAsia="es-CL"/>
+              </w:rPr>
+            </w:pPr>
+            <w:r>
+              <w:rPr>
+                <w:rFonts w:cs="Arial"/>
+                <w:b w:val="false"/>
+                <w:bCs w:val="false"/>
+                <w:i w:val="false"/>
+                <w:iCs w:val="false"/>
+                <w:color w:val="000000"/>
+                <w:sz w:val="18"/>
+                <w:szCs w:val="20"/>
+                <w:lang w:eastAsia="es-CL"/>
+              </w:rPr>
+            </w:r>
+          </w:p>
+        </w:tc>
+        <w:tc>
+          <w:tcPr>
+            <w:tcW w:w="1813" w:type="dxa"/>
+            <w:tcBorders>
+              <w:top w:val="nil"/>
+              <w:start w:val="single" w:sz="4" w:space="0" w:color="BFBFBF"/>
+              <w:bottom w:val="single" w:sz="4" w:space="0" w:color="BFBFBF"/>
+              <w:end w:val="single" w:sz="4" w:space="0" w:color="BFBFBF"/>
+            </w:tcBorders>
+          </w:tcPr>
+          <w:p>
+            <w:pPr>
+              <w:pStyle w:val="Normal"/>
+              <w:widowControl/>
+              <w:suppressAutoHyphens w:val="true"/>
+              <w:bidi w:val="0"/>
+              <w:spacing w:before="0" w:after="160"/>
+              <w:jc w:val="start"/>
+              <w:rPr>
+                <w:rFonts w:ascii="Calibri" w:hAnsi="Calibri" w:cs="Arial"/>
+                <w:b w:val="false"/>
+                <w:bCs w:val="false"/>
+                <w:i w:val="false"/>
+                <w:iCs w:val="false"/>
+                <w:color w:val="000000"/>
+                <w:sz w:val="18"/>
+                <w:szCs w:val="20"/>
+                <w:lang w:eastAsia="es-CL"/>
+              </w:rPr>
+            </w:pPr>
+            <w:r>
+              <w:rPr>
+                <w:rFonts w:cs="Arial"/>
+                <w:b w:val="false"/>
+                <w:bCs w:val="false"/>
+                <w:i w:val="false"/>
+                <w:iCs w:val="false"/>
+                <w:color w:val="000000"/>
+                <w:sz w:val="18"/>
+                <w:szCs w:val="20"/>
+                <w:lang w:eastAsia="es-CL"/>
+              </w:rPr>
+            </w:r>
+          </w:p>
+        </w:tc>
+        <w:tc>
+          <w:tcPr>
+            <w:tcW w:w="987" w:type="dxa"/>
+            <w:tcBorders>
+              <w:top w:val="nil"/>
+              <w:start w:val="single" w:sz="4" w:space="0" w:color="BFBFBF"/>
+              <w:bottom w:val="single" w:sz="4" w:space="0" w:color="BFBFBF"/>
+              <w:end w:val="single" w:sz="4" w:space="0" w:color="FFFFFF"/>
+            </w:tcBorders>
+          </w:tcPr>
+          <w:p>
+            <w:pPr>
+              <w:pStyle w:val="Normal"/>
+              <w:widowControl/>
+              <w:suppressAutoHyphens w:val="true"/>
+              <w:bidi w:val="0"/>
+              <w:spacing w:before="0" w:after="160"/>
+              <w:jc w:val="start"/>
+              <w:rPr>
+                <w:rFonts w:ascii="Calibri" w:hAnsi="Calibri" w:cs="Arial"/>
+                <w:b w:val="false"/>
+                <w:bCs w:val="false"/>
+                <w:i w:val="false"/>
+                <w:iCs w:val="false"/>
+                <w:color w:val="000000"/>
+                <w:sz w:val="18"/>
+                <w:szCs w:val="20"/>
+                <w:lang w:eastAsia="es-CL"/>
+              </w:rPr>
+            </w:pPr>
+            <w:r>
+              <w:rPr>
+                <w:rFonts w:cs="Arial"/>
+                <w:b w:val="false"/>
+                <w:bCs w:val="false"/>
+                <w:i w:val="false"/>
+                <w:iCs w:val="false"/>
+                <w:color w:val="000000"/>
+                <w:sz w:val="18"/>
+                <w:szCs w:val="20"/>
+                <w:lang w:eastAsia="es-CL"/>
+              </w:rPr>
+            </w:r>
+          </w:p>
+        </w:tc>
+        <w:tc>
+          <w:tcPr>
+            <w:tcW w:w="1580" w:type="dxa"/>
+            <w:tcBorders>
+              <w:top w:val="nil"/>
+              <w:start w:val="single" w:sz="4" w:space="0" w:color="FFFFFF"/>
+              <w:bottom w:val="single" w:sz="4" w:space="0" w:color="BFBFBF"/>
+              <w:end w:val="single" w:sz="4" w:space="0" w:color="BFBFBF"/>
+            </w:tcBorders>
+            <w:shd w:color="auto" w:fill="D9D9D9" w:themeFill="background1" w:themeFillShade="d9" w:val="clear"/>
+          </w:tcPr>
+          <w:p>
+            <w:pPr>
+              <w:pStyle w:val="Normal"/>
+              <w:widowControl/>
+              <w:suppressAutoHyphens w:val="true"/>
+              <w:bidi w:val="0"/>
+              <w:spacing w:before="0" w:after="160"/>
+              <w:jc w:val="start"/>
+              <w:rPr>
+                <w:rFonts w:ascii="Calibri" w:hAnsi="Calibri" w:cs="Arial"/>
+                <w:b w:val="false"/>
+                <w:bCs w:val="false"/>
+                <w:i w:val="false"/>
+                <w:iCs w:val="false"/>
+                <w:color w:val="000000"/>
+                <w:sz w:val="18"/>
+                <w:szCs w:val="20"/>
+                <w:lang w:eastAsia="es-CL"/>
+              </w:rPr>
+            </w:pPr>
+            <w:r>
+              <w:rPr>
+                <w:rFonts w:cs="Arial"/>
+                <w:b w:val="false"/>
+                <w:bCs w:val="false"/>
+                <w:i w:val="false"/>
+                <w:iCs w:val="false"/>
+                <w:color w:val="000000"/>
+                <w:sz w:val="18"/>
+                <w:szCs w:val="20"/>
+                <w:lang w:eastAsia="es-CL"/>
+              </w:rPr>
+            </w:r>
+          </w:p>
+        </w:tc>
+        <w:tc>
+          <w:tcPr>
+            <w:tcW w:w="1581" w:type="dxa"/>
+            <w:tcBorders>
+              <w:top w:val="nil"/>
+              <w:start w:val="single" w:sz="4" w:space="0" w:color="BFBFBF"/>
+              <w:bottom w:val="single" w:sz="4" w:space="0" w:color="BFBFBF"/>
+              <w:end w:val="single" w:sz="4" w:space="0" w:color="BFBFBF"/>
+            </w:tcBorders>
+          </w:tcPr>
+          <w:p>
+            <w:pPr>
+              <w:pStyle w:val="Normal"/>
+              <w:widowControl/>
+              <w:suppressAutoHyphens w:val="true"/>
+              <w:bidi w:val="0"/>
+              <w:spacing w:before="0" w:after="160"/>
+              <w:jc w:val="start"/>
+              <w:rPr>
+                <w:rFonts w:ascii="Calibri" w:hAnsi="Calibri" w:cs="Arial"/>
+                <w:b w:val="false"/>
+                <w:bCs w:val="false"/>
+                <w:i w:val="false"/>
+                <w:iCs w:val="false"/>
+                <w:color w:val="000000"/>
+                <w:sz w:val="18"/>
+                <w:szCs w:val="20"/>
+                <w:lang w:eastAsia="es-CL"/>
+              </w:rPr>
+            </w:pPr>
+            <w:r>
+              <w:rPr>
+                <w:rFonts w:cs="Arial"/>
+                <w:b w:val="false"/>
+                <w:bCs w:val="false"/>
+                <w:i w:val="false"/>
+                <w:iCs w:val="false"/>
+                <w:color w:val="000000"/>
+                <w:sz w:val="18"/>
+                <w:szCs w:val="20"/>
+                <w:lang w:eastAsia="es-CL"/>
+              </w:rPr>
+            </w:r>
+          </w:p>
+        </w:tc>
+      </w:tr>
+      <w:tr>
+        <w:trPr/>
+        <w:tc>
+          <w:tcPr>
+            <w:tcW w:w="1579" w:type="dxa"/>
+            <w:tcBorders>
+              <w:top w:val="nil"/>
+              <w:start w:val="single" w:sz="4" w:space="0" w:color="BFBFBF"/>
+              <w:bottom w:val="single" w:sz="4" w:space="0" w:color="BFBFBF"/>
+              <w:end w:val="single" w:sz="4" w:space="0" w:color="BFBFBF"/>
+            </w:tcBorders>
+          </w:tcPr>
+          <w:p>
+            <w:pPr>
+              <w:pStyle w:val="Normal"/>
+              <w:widowControl/>
+              <w:suppressAutoHyphens w:val="true"/>
+              <w:bidi w:val="0"/>
+              <w:spacing w:before="0" w:after="160"/>
+              <w:jc w:val="start"/>
+              <w:rPr>
+                <w:rFonts w:ascii="Calibri" w:hAnsi="Calibri" w:cs="Arial"/>
+                <w:b w:val="false"/>
+                <w:bCs w:val="false"/>
+                <w:i w:val="false"/>
+                <w:iCs w:val="false"/>
+                <w:color w:val="000000"/>
+                <w:sz w:val="18"/>
+                <w:szCs w:val="20"/>
+                <w:lang w:eastAsia="es-CL"/>
+              </w:rPr>
+            </w:pPr>
+            <w:r>
+              <w:rPr>
+                <w:rFonts w:cs="Arial"/>
+                <w:b w:val="false"/>
+                <w:bCs w:val="false"/>
+                <w:i w:val="false"/>
+                <w:iCs w:val="false"/>
+                <w:color w:val="000000"/>
+                <w:sz w:val="18"/>
+                <w:szCs w:val="20"/>
+                <w:lang w:eastAsia="es-CL"/>
+              </w:rPr>
+            </w:r>
+          </w:p>
+        </w:tc>
+        <w:tc>
+          <w:tcPr>
+            <w:tcW w:w="1370" w:type="dxa"/>
+            <w:tcBorders>
+              <w:top w:val="nil"/>
+              <w:start w:val="single" w:sz="4" w:space="0" w:color="BFBFBF"/>
+              <w:bottom w:val="single" w:sz="4" w:space="0" w:color="BFBFBF"/>
+              <w:end w:val="single" w:sz="4" w:space="0" w:color="BFBFBF"/>
+            </w:tcBorders>
+          </w:tcPr>
+          <w:p>
+            <w:pPr>
+              <w:pStyle w:val="Normal"/>
+              <w:widowControl/>
+              <w:suppressAutoHyphens w:val="true"/>
+              <w:bidi w:val="0"/>
+              <w:spacing w:before="0" w:after="160"/>
+              <w:jc w:val="start"/>
+              <w:rPr>
+                <w:rFonts w:ascii="Calibri" w:hAnsi="Calibri" w:cs="Arial"/>
+                <w:b w:val="false"/>
+                <w:bCs w:val="false"/>
+                <w:i w:val="false"/>
+                <w:iCs w:val="false"/>
+                <w:color w:val="000000"/>
+                <w:sz w:val="18"/>
+                <w:szCs w:val="20"/>
+                <w:lang w:eastAsia="es-CL"/>
+              </w:rPr>
+            </w:pPr>
+            <w:r>
+              <w:rPr>
+                <w:rFonts w:cs="Arial"/>
+                <w:b w:val="false"/>
+                <w:bCs w:val="false"/>
+                <w:i w:val="false"/>
+                <w:iCs w:val="false"/>
+                <w:color w:val="000000"/>
+                <w:sz w:val="18"/>
+                <w:szCs w:val="20"/>
+                <w:lang w:eastAsia="es-CL"/>
+              </w:rPr>
+              <w:t>Desarrollo de la representación visual de la simulación</w:t>
+            </w:r>
+          </w:p>
+        </w:tc>
+        <w:tc>
+          <w:tcPr>
+            <w:tcW w:w="2150" w:type="dxa"/>
+            <w:tcBorders>
+              <w:top w:val="nil"/>
+              <w:start w:val="single" w:sz="4" w:space="0" w:color="BFBFBF"/>
+              <w:bottom w:val="single" w:sz="4" w:space="0" w:color="BFBFBF"/>
+              <w:end w:val="single" w:sz="4" w:space="0" w:color="BFBFBF"/>
+            </w:tcBorders>
+          </w:tcPr>
+          <w:p>
+            <w:pPr>
+              <w:pStyle w:val="Normal"/>
+              <w:widowControl/>
+              <w:suppressAutoHyphens w:val="true"/>
+              <w:bidi w:val="0"/>
+              <w:spacing w:before="0" w:after="160"/>
+              <w:jc w:val="start"/>
+              <w:rPr>
+                <w:rFonts w:ascii="Calibri" w:hAnsi="Calibri" w:cs="Arial"/>
+                <w:b w:val="false"/>
+                <w:bCs w:val="false"/>
+                <w:i w:val="false"/>
+                <w:iCs w:val="false"/>
+                <w:color w:val="000000"/>
+                <w:sz w:val="18"/>
+                <w:szCs w:val="20"/>
+                <w:lang w:eastAsia="es-CL"/>
+              </w:rPr>
+            </w:pPr>
+            <w:r>
+              <w:rPr>
+                <w:rFonts w:cs="Arial"/>
+                <w:b w:val="false"/>
+                <w:bCs w:val="false"/>
+                <w:i w:val="false"/>
+                <w:iCs w:val="false"/>
+                <w:color w:val="000000"/>
+                <w:sz w:val="18"/>
+                <w:szCs w:val="20"/>
+                <w:lang w:eastAsia="es-CL"/>
+              </w:rPr>
+            </w:r>
+          </w:p>
+        </w:tc>
+        <w:tc>
+          <w:tcPr>
+            <w:tcW w:w="1813" w:type="dxa"/>
+            <w:tcBorders>
+              <w:top w:val="nil"/>
+              <w:start w:val="single" w:sz="4" w:space="0" w:color="BFBFBF"/>
+              <w:bottom w:val="single" w:sz="4" w:space="0" w:color="BFBFBF"/>
+              <w:end w:val="single" w:sz="4" w:space="0" w:color="BFBFBF"/>
+            </w:tcBorders>
+          </w:tcPr>
+          <w:p>
+            <w:pPr>
+              <w:pStyle w:val="Normal"/>
+              <w:widowControl/>
+              <w:suppressAutoHyphens w:val="true"/>
+              <w:bidi w:val="0"/>
+              <w:spacing w:before="0" w:after="160"/>
+              <w:jc w:val="start"/>
+              <w:rPr>
+                <w:rFonts w:ascii="Calibri" w:hAnsi="Calibri" w:cs="Arial"/>
+                <w:b w:val="false"/>
+                <w:bCs w:val="false"/>
+                <w:i w:val="false"/>
+                <w:iCs w:val="false"/>
+                <w:color w:val="000000"/>
+                <w:sz w:val="18"/>
+                <w:szCs w:val="20"/>
+                <w:lang w:eastAsia="es-CL"/>
+              </w:rPr>
+            </w:pPr>
+            <w:r>
+              <w:rPr>
+                <w:rFonts w:cs="Arial"/>
+                <w:b w:val="false"/>
+                <w:bCs w:val="false"/>
+                <w:i w:val="false"/>
+                <w:iCs w:val="false"/>
+                <w:color w:val="000000"/>
+                <w:sz w:val="18"/>
+                <w:szCs w:val="20"/>
+                <w:lang w:eastAsia="es-CL"/>
+              </w:rPr>
+            </w:r>
+          </w:p>
+        </w:tc>
+        <w:tc>
+          <w:tcPr>
+            <w:tcW w:w="987" w:type="dxa"/>
+            <w:tcBorders>
+              <w:top w:val="nil"/>
+              <w:start w:val="single" w:sz="4" w:space="0" w:color="BFBFBF"/>
+              <w:bottom w:val="single" w:sz="4" w:space="0" w:color="BFBFBF"/>
+              <w:end w:val="single" w:sz="4" w:space="0" w:color="FFFFFF"/>
+            </w:tcBorders>
+          </w:tcPr>
+          <w:p>
+            <w:pPr>
+              <w:pStyle w:val="Normal"/>
+              <w:widowControl/>
+              <w:suppressAutoHyphens w:val="true"/>
+              <w:bidi w:val="0"/>
+              <w:spacing w:before="0" w:after="160"/>
+              <w:jc w:val="start"/>
+              <w:rPr>
+                <w:rFonts w:ascii="Calibri" w:hAnsi="Calibri" w:cs="Arial"/>
+                <w:b w:val="false"/>
+                <w:bCs w:val="false"/>
+                <w:i w:val="false"/>
+                <w:iCs w:val="false"/>
+                <w:color w:val="000000"/>
+                <w:sz w:val="18"/>
+                <w:szCs w:val="20"/>
+                <w:lang w:eastAsia="es-CL"/>
+              </w:rPr>
+            </w:pPr>
+            <w:r>
+              <w:rPr>
+                <w:rFonts w:cs="Arial"/>
+                <w:b w:val="false"/>
+                <w:bCs w:val="false"/>
+                <w:i w:val="false"/>
+                <w:iCs w:val="false"/>
+                <w:color w:val="000000"/>
+                <w:sz w:val="18"/>
+                <w:szCs w:val="20"/>
+                <w:lang w:eastAsia="es-CL"/>
+              </w:rPr>
+            </w:r>
+          </w:p>
+        </w:tc>
+        <w:tc>
+          <w:tcPr>
+            <w:tcW w:w="1580" w:type="dxa"/>
+            <w:tcBorders>
+              <w:top w:val="nil"/>
+              <w:start w:val="single" w:sz="4" w:space="0" w:color="FFFFFF"/>
+              <w:bottom w:val="single" w:sz="4" w:space="0" w:color="BFBFBF"/>
+              <w:end w:val="single" w:sz="4" w:space="0" w:color="BFBFBF"/>
+            </w:tcBorders>
+            <w:shd w:color="auto" w:fill="D9D9D9" w:themeFill="background1" w:themeFillShade="d9" w:val="clear"/>
+          </w:tcPr>
+          <w:p>
+            <w:pPr>
+              <w:pStyle w:val="Normal"/>
+              <w:widowControl/>
+              <w:suppressAutoHyphens w:val="true"/>
+              <w:bidi w:val="0"/>
+              <w:spacing w:before="0" w:after="160"/>
+              <w:jc w:val="start"/>
+              <w:rPr>
+                <w:rFonts w:ascii="Calibri" w:hAnsi="Calibri" w:cs="Arial"/>
+                <w:b w:val="false"/>
+                <w:bCs w:val="false"/>
+                <w:i w:val="false"/>
+                <w:iCs w:val="false"/>
+                <w:color w:val="000000"/>
+                <w:sz w:val="18"/>
+                <w:szCs w:val="20"/>
+                <w:lang w:eastAsia="es-CL"/>
+              </w:rPr>
+            </w:pPr>
+            <w:r>
+              <w:rPr>
+                <w:rFonts w:cs="Arial"/>
+                <w:b w:val="false"/>
+                <w:bCs w:val="false"/>
+                <w:i w:val="false"/>
+                <w:iCs w:val="false"/>
+                <w:color w:val="000000"/>
+                <w:sz w:val="18"/>
+                <w:szCs w:val="20"/>
+                <w:lang w:eastAsia="es-CL"/>
+              </w:rPr>
+            </w:r>
+          </w:p>
+        </w:tc>
+        <w:tc>
+          <w:tcPr>
+            <w:tcW w:w="1581" w:type="dxa"/>
+            <w:tcBorders>
+              <w:top w:val="nil"/>
+              <w:start w:val="single" w:sz="4" w:space="0" w:color="BFBFBF"/>
+              <w:bottom w:val="single" w:sz="4" w:space="0" w:color="BFBFBF"/>
+              <w:end w:val="single" w:sz="4" w:space="0" w:color="BFBFBF"/>
+            </w:tcBorders>
+          </w:tcPr>
+          <w:p>
+            <w:pPr>
+              <w:pStyle w:val="Normal"/>
+              <w:widowControl/>
+              <w:suppressAutoHyphens w:val="true"/>
+              <w:bidi w:val="0"/>
+              <w:spacing w:before="0" w:after="160"/>
+              <w:jc w:val="start"/>
+              <w:rPr>
+                <w:rFonts w:ascii="Calibri" w:hAnsi="Calibri" w:cs="Arial"/>
+                <w:b w:val="false"/>
+                <w:bCs w:val="false"/>
+                <w:i w:val="false"/>
+                <w:iCs w:val="false"/>
+                <w:color w:val="000000"/>
+                <w:sz w:val="18"/>
+                <w:szCs w:val="20"/>
+                <w:lang w:eastAsia="es-CL"/>
+              </w:rPr>
+            </w:pPr>
+            <w:r>
+              <w:rPr>
+                <w:rFonts w:cs="Arial"/>
+                <w:b w:val="false"/>
+                <w:bCs w:val="false"/>
+                <w:i w:val="false"/>
+                <w:iCs w:val="false"/>
+                <w:color w:val="000000"/>
+                <w:sz w:val="18"/>
+                <w:szCs w:val="20"/>
+                <w:lang w:eastAsia="es-CL"/>
+              </w:rPr>
+            </w:r>
+          </w:p>
+        </w:tc>
+      </w:tr>
+      <w:tr>
+        <w:trPr/>
+        <w:tc>
+          <w:tcPr>
+            <w:tcW w:w="1579" w:type="dxa"/>
+            <w:tcBorders>
+              <w:top w:val="nil"/>
+              <w:start w:val="single" w:sz="4" w:space="0" w:color="BFBFBF"/>
+              <w:bottom w:val="single" w:sz="4" w:space="0" w:color="BFBFBF"/>
+              <w:end w:val="single" w:sz="4" w:space="0" w:color="BFBFBF"/>
+            </w:tcBorders>
+          </w:tcPr>
+          <w:p>
+            <w:pPr>
+              <w:pStyle w:val="Normal"/>
+              <w:widowControl/>
+              <w:suppressAutoHyphens w:val="true"/>
+              <w:bidi w:val="0"/>
+              <w:spacing w:before="0" w:after="160"/>
+              <w:jc w:val="start"/>
+              <w:rPr>
+                <w:rFonts w:ascii="Calibri" w:hAnsi="Calibri" w:cs="Arial"/>
+                <w:b w:val="false"/>
+                <w:bCs w:val="false"/>
+                <w:i w:val="false"/>
+                <w:iCs w:val="false"/>
+                <w:color w:val="000000"/>
+                <w:sz w:val="18"/>
+                <w:szCs w:val="20"/>
+                <w:lang w:eastAsia="es-CL"/>
+              </w:rPr>
+            </w:pPr>
+            <w:r>
+              <w:rPr>
+                <w:rFonts w:cs="Arial"/>
+                <w:b w:val="false"/>
+                <w:bCs w:val="false"/>
+                <w:i w:val="false"/>
+                <w:iCs w:val="false"/>
+                <w:color w:val="000000"/>
+                <w:sz w:val="18"/>
+                <w:szCs w:val="20"/>
+                <w:lang w:eastAsia="es-CL"/>
+              </w:rPr>
+            </w:r>
+          </w:p>
+        </w:tc>
+        <w:tc>
+          <w:tcPr>
+            <w:tcW w:w="1370" w:type="dxa"/>
+            <w:tcBorders>
+              <w:top w:val="nil"/>
+              <w:start w:val="single" w:sz="4" w:space="0" w:color="BFBFBF"/>
+              <w:bottom w:val="single" w:sz="4" w:space="0" w:color="BFBFBF"/>
+              <w:end w:val="single" w:sz="4" w:space="0" w:color="BFBFBF"/>
+            </w:tcBorders>
+          </w:tcPr>
+          <w:p>
+            <w:pPr>
+              <w:pStyle w:val="Normal"/>
+              <w:widowControl/>
+              <w:suppressAutoHyphens w:val="true"/>
+              <w:bidi w:val="0"/>
+              <w:spacing w:before="0" w:after="160"/>
+              <w:jc w:val="start"/>
+              <w:rPr>
+                <w:rFonts w:ascii="Calibri" w:hAnsi="Calibri" w:cs="Arial"/>
+                <w:b w:val="false"/>
+                <w:bCs w:val="false"/>
+                <w:i w:val="false"/>
+                <w:iCs w:val="false"/>
+                <w:color w:val="000000"/>
+                <w:sz w:val="18"/>
+                <w:szCs w:val="20"/>
+                <w:lang w:eastAsia="es-CL"/>
+              </w:rPr>
+            </w:pPr>
+            <w:r>
+              <w:rPr>
+                <w:rFonts w:cs="Arial"/>
+                <w:b w:val="false"/>
+                <w:bCs w:val="false"/>
+                <w:i w:val="false"/>
+                <w:iCs w:val="false"/>
+                <w:color w:val="000000"/>
+                <w:sz w:val="18"/>
+                <w:szCs w:val="20"/>
+                <w:lang w:eastAsia="es-CL"/>
+              </w:rPr>
+              <w:t>Integración de sistemas y desarrollo de niveles</w:t>
+            </w:r>
+          </w:p>
+        </w:tc>
+        <w:tc>
+          <w:tcPr>
+            <w:tcW w:w="2150" w:type="dxa"/>
+            <w:tcBorders>
+              <w:top w:val="nil"/>
+              <w:start w:val="single" w:sz="4" w:space="0" w:color="BFBFBF"/>
+              <w:bottom w:val="single" w:sz="4" w:space="0" w:color="BFBFBF"/>
+              <w:end w:val="single" w:sz="4" w:space="0" w:color="BFBFBF"/>
+            </w:tcBorders>
+          </w:tcPr>
+          <w:p>
+            <w:pPr>
+              <w:pStyle w:val="Normal"/>
+              <w:widowControl/>
+              <w:suppressAutoHyphens w:val="true"/>
+              <w:bidi w:val="0"/>
+              <w:spacing w:before="0" w:after="160"/>
+              <w:jc w:val="start"/>
+              <w:rPr>
+                <w:rFonts w:ascii="Calibri" w:hAnsi="Calibri" w:cs="Arial"/>
+                <w:b w:val="false"/>
+                <w:bCs w:val="false"/>
+                <w:i w:val="false"/>
+                <w:iCs w:val="false"/>
+                <w:color w:val="000000"/>
+                <w:sz w:val="18"/>
+                <w:szCs w:val="20"/>
+                <w:lang w:eastAsia="es-CL"/>
+              </w:rPr>
+            </w:pPr>
+            <w:r>
+              <w:rPr>
+                <w:rFonts w:cs="Arial"/>
+                <w:b w:val="false"/>
+                <w:bCs w:val="false"/>
+                <w:i w:val="false"/>
+                <w:iCs w:val="false"/>
+                <w:color w:val="000000"/>
+                <w:sz w:val="18"/>
+                <w:szCs w:val="20"/>
+                <w:lang w:eastAsia="es-CL"/>
+              </w:rPr>
+            </w:r>
+          </w:p>
+        </w:tc>
+        <w:tc>
+          <w:tcPr>
+            <w:tcW w:w="1813" w:type="dxa"/>
+            <w:tcBorders>
+              <w:top w:val="nil"/>
+              <w:start w:val="single" w:sz="4" w:space="0" w:color="BFBFBF"/>
+              <w:bottom w:val="single" w:sz="4" w:space="0" w:color="BFBFBF"/>
+              <w:end w:val="single" w:sz="4" w:space="0" w:color="BFBFBF"/>
+            </w:tcBorders>
+          </w:tcPr>
+          <w:p>
+            <w:pPr>
+              <w:pStyle w:val="Normal"/>
+              <w:widowControl/>
+              <w:suppressAutoHyphens w:val="true"/>
+              <w:bidi w:val="0"/>
+              <w:spacing w:before="0" w:after="160"/>
+              <w:jc w:val="start"/>
+              <w:rPr>
+                <w:rFonts w:ascii="Calibri" w:hAnsi="Calibri" w:cs="Arial"/>
+                <w:b w:val="false"/>
+                <w:bCs w:val="false"/>
+                <w:i w:val="false"/>
+                <w:iCs w:val="false"/>
+                <w:color w:val="000000"/>
+                <w:sz w:val="18"/>
+                <w:szCs w:val="20"/>
+                <w:lang w:eastAsia="es-CL"/>
+              </w:rPr>
+            </w:pPr>
+            <w:r>
+              <w:rPr>
+                <w:rFonts w:cs="Arial"/>
+                <w:b w:val="false"/>
+                <w:bCs w:val="false"/>
+                <w:i w:val="false"/>
+                <w:iCs w:val="false"/>
+                <w:color w:val="000000"/>
+                <w:sz w:val="18"/>
+                <w:szCs w:val="20"/>
+                <w:lang w:eastAsia="es-CL"/>
+              </w:rPr>
+            </w:r>
+          </w:p>
+        </w:tc>
+        <w:tc>
+          <w:tcPr>
+            <w:tcW w:w="987" w:type="dxa"/>
+            <w:tcBorders>
+              <w:top w:val="nil"/>
+              <w:start w:val="single" w:sz="4" w:space="0" w:color="BFBFBF"/>
+              <w:bottom w:val="single" w:sz="4" w:space="0" w:color="BFBFBF"/>
+              <w:end w:val="single" w:sz="4" w:space="0" w:color="FFFFFF"/>
+            </w:tcBorders>
+          </w:tcPr>
+          <w:p>
+            <w:pPr>
+              <w:pStyle w:val="Normal"/>
+              <w:widowControl/>
+              <w:suppressAutoHyphens w:val="true"/>
+              <w:bidi w:val="0"/>
+              <w:spacing w:before="0" w:after="160"/>
+              <w:jc w:val="start"/>
+              <w:rPr>
+                <w:rFonts w:ascii="Calibri" w:hAnsi="Calibri" w:cs="Arial"/>
+                <w:b w:val="false"/>
+                <w:bCs w:val="false"/>
+                <w:i w:val="false"/>
+                <w:iCs w:val="false"/>
+                <w:color w:val="000000"/>
+                <w:sz w:val="18"/>
+                <w:szCs w:val="20"/>
+                <w:lang w:eastAsia="es-CL"/>
+              </w:rPr>
+            </w:pPr>
+            <w:r>
+              <w:rPr>
+                <w:rFonts w:cs="Arial"/>
+                <w:b w:val="false"/>
+                <w:bCs w:val="false"/>
+                <w:i w:val="false"/>
+                <w:iCs w:val="false"/>
+                <w:color w:val="000000"/>
+                <w:sz w:val="18"/>
+                <w:szCs w:val="20"/>
+                <w:lang w:eastAsia="es-CL"/>
+              </w:rPr>
+            </w:r>
+          </w:p>
+        </w:tc>
+        <w:tc>
+          <w:tcPr>
+            <w:tcW w:w="1580" w:type="dxa"/>
+            <w:tcBorders>
+              <w:top w:val="nil"/>
+              <w:start w:val="single" w:sz="4" w:space="0" w:color="FFFFFF"/>
+              <w:bottom w:val="single" w:sz="4" w:space="0" w:color="BFBFBF"/>
+              <w:end w:val="single" w:sz="4" w:space="0" w:color="BFBFBF"/>
+            </w:tcBorders>
+            <w:shd w:color="auto" w:fill="D9D9D9" w:themeFill="background1" w:themeFillShade="d9" w:val="clear"/>
+          </w:tcPr>
+          <w:p>
+            <w:pPr>
+              <w:pStyle w:val="Normal"/>
+              <w:widowControl/>
+              <w:suppressAutoHyphens w:val="true"/>
+              <w:bidi w:val="0"/>
+              <w:spacing w:before="0" w:after="160"/>
+              <w:jc w:val="start"/>
+              <w:rPr>
+                <w:rFonts w:ascii="Calibri" w:hAnsi="Calibri" w:cs="Arial"/>
+                <w:b w:val="false"/>
+                <w:bCs w:val="false"/>
+                <w:i w:val="false"/>
+                <w:iCs w:val="false"/>
+                <w:color w:val="000000"/>
+                <w:sz w:val="18"/>
+                <w:szCs w:val="20"/>
+                <w:lang w:eastAsia="es-CL"/>
+              </w:rPr>
+            </w:pPr>
+            <w:r>
+              <w:rPr>
+                <w:rFonts w:cs="Arial"/>
+                <w:b w:val="false"/>
+                <w:bCs w:val="false"/>
+                <w:i w:val="false"/>
+                <w:iCs w:val="false"/>
+                <w:color w:val="000000"/>
+                <w:sz w:val="18"/>
+                <w:szCs w:val="20"/>
+                <w:lang w:eastAsia="es-CL"/>
+              </w:rPr>
+            </w:r>
+          </w:p>
+        </w:tc>
+        <w:tc>
+          <w:tcPr>
+            <w:tcW w:w="1581" w:type="dxa"/>
+            <w:tcBorders>
+              <w:top w:val="nil"/>
+              <w:start w:val="single" w:sz="4" w:space="0" w:color="BFBFBF"/>
+              <w:bottom w:val="single" w:sz="4" w:space="0" w:color="BFBFBF"/>
+              <w:end w:val="single" w:sz="4" w:space="0" w:color="BFBFBF"/>
+            </w:tcBorders>
+          </w:tcPr>
+          <w:p>
+            <w:pPr>
+              <w:pStyle w:val="Normal"/>
+              <w:widowControl/>
+              <w:suppressAutoHyphens w:val="true"/>
+              <w:bidi w:val="0"/>
+              <w:spacing w:before="0" w:after="160"/>
+              <w:jc w:val="start"/>
+              <w:rPr>
+                <w:rFonts w:ascii="Calibri" w:hAnsi="Calibri" w:cs="Arial"/>
+                <w:b w:val="false"/>
+                <w:bCs w:val="false"/>
+                <w:i w:val="false"/>
+                <w:iCs w:val="false"/>
+                <w:color w:val="000000"/>
+                <w:sz w:val="18"/>
+                <w:szCs w:val="20"/>
+                <w:lang w:eastAsia="es-CL"/>
+              </w:rPr>
+            </w:pPr>
+            <w:r>
+              <w:rPr>
+                <w:rFonts w:cs="Arial"/>
+                <w:b w:val="false"/>
+                <w:bCs w:val="false"/>
+                <w:i w:val="false"/>
+                <w:iCs w:val="false"/>
+                <w:color w:val="000000"/>
+                <w:sz w:val="18"/>
+                <w:szCs w:val="20"/>
+                <w:lang w:eastAsia="es-CL"/>
+              </w:rPr>
+            </w:r>
+          </w:p>
+        </w:tc>
+      </w:tr>
+      <w:tr>
+        <w:trPr/>
+        <w:tc>
+          <w:tcPr>
+            <w:tcW w:w="1579" w:type="dxa"/>
+            <w:tcBorders>
+              <w:top w:val="nil"/>
+              <w:start w:val="single" w:sz="4" w:space="0" w:color="BFBFBF"/>
+              <w:bottom w:val="single" w:sz="4" w:space="0" w:color="BFBFBF"/>
+              <w:end w:val="single" w:sz="4" w:space="0" w:color="BFBFBF"/>
+            </w:tcBorders>
+          </w:tcPr>
+          <w:p>
+            <w:pPr>
+              <w:pStyle w:val="Normal"/>
+              <w:widowControl/>
+              <w:suppressAutoHyphens w:val="true"/>
+              <w:bidi w:val="0"/>
+              <w:spacing w:before="0" w:after="160"/>
+              <w:jc w:val="start"/>
+              <w:rPr>
+                <w:rFonts w:ascii="Calibri" w:hAnsi="Calibri" w:cs="Arial"/>
+                <w:b w:val="false"/>
+                <w:bCs w:val="false"/>
+                <w:i w:val="false"/>
+                <w:iCs w:val="false"/>
+                <w:color w:val="000000"/>
+                <w:sz w:val="18"/>
+                <w:szCs w:val="20"/>
+                <w:lang w:eastAsia="es-CL"/>
+              </w:rPr>
+            </w:pPr>
+            <w:r>
+              <w:rPr>
+                <w:rFonts w:cs="Arial"/>
+                <w:b w:val="false"/>
+                <w:bCs w:val="false"/>
+                <w:i w:val="false"/>
+                <w:iCs w:val="false"/>
+                <w:color w:val="000000"/>
+                <w:sz w:val="18"/>
+                <w:szCs w:val="20"/>
+                <w:lang w:eastAsia="es-CL"/>
+              </w:rPr>
+            </w:r>
+          </w:p>
+        </w:tc>
+        <w:tc>
+          <w:tcPr>
+            <w:tcW w:w="1370" w:type="dxa"/>
+            <w:tcBorders>
+              <w:top w:val="nil"/>
+              <w:start w:val="single" w:sz="4" w:space="0" w:color="BFBFBF"/>
+              <w:bottom w:val="single" w:sz="4" w:space="0" w:color="BFBFBF"/>
+              <w:end w:val="single" w:sz="4" w:space="0" w:color="BFBFBF"/>
+            </w:tcBorders>
+          </w:tcPr>
+          <w:p>
+            <w:pPr>
+              <w:pStyle w:val="Normal"/>
+              <w:widowControl/>
+              <w:suppressAutoHyphens w:val="true"/>
+              <w:bidi w:val="0"/>
+              <w:spacing w:before="0" w:after="160"/>
+              <w:jc w:val="start"/>
+              <w:rPr>
+                <w:rFonts w:ascii="Calibri" w:hAnsi="Calibri" w:cs="Arial"/>
+                <w:b w:val="false"/>
+                <w:bCs w:val="false"/>
+                <w:i w:val="false"/>
+                <w:iCs w:val="false"/>
+                <w:color w:val="000000"/>
+                <w:sz w:val="18"/>
+                <w:szCs w:val="20"/>
+                <w:lang w:eastAsia="es-CL"/>
+              </w:rPr>
+            </w:pPr>
+            <w:r>
+              <w:rPr>
+                <w:rFonts w:cs="Arial"/>
+                <w:b w:val="false"/>
+                <w:bCs w:val="false"/>
+                <w:i w:val="false"/>
+                <w:iCs w:val="false"/>
+                <w:color w:val="000000"/>
+                <w:sz w:val="18"/>
+                <w:szCs w:val="20"/>
+                <w:lang w:eastAsia="es-CL"/>
+              </w:rPr>
+              <w:t>Diseño e integración audiovisual</w:t>
+            </w:r>
+          </w:p>
+        </w:tc>
+        <w:tc>
+          <w:tcPr>
+            <w:tcW w:w="2150" w:type="dxa"/>
+            <w:tcBorders>
+              <w:top w:val="nil"/>
+              <w:start w:val="single" w:sz="4" w:space="0" w:color="BFBFBF"/>
+              <w:bottom w:val="single" w:sz="4" w:space="0" w:color="BFBFBF"/>
+              <w:end w:val="single" w:sz="4" w:space="0" w:color="BFBFBF"/>
+            </w:tcBorders>
+          </w:tcPr>
+          <w:p>
+            <w:pPr>
+              <w:pStyle w:val="Normal"/>
+              <w:widowControl/>
+              <w:suppressAutoHyphens w:val="true"/>
+              <w:bidi w:val="0"/>
+              <w:spacing w:before="0" w:after="160"/>
+              <w:jc w:val="start"/>
+              <w:rPr>
+                <w:rFonts w:ascii="Calibri" w:hAnsi="Calibri" w:cs="Arial"/>
+                <w:b w:val="false"/>
+                <w:bCs w:val="false"/>
+                <w:i w:val="false"/>
+                <w:iCs w:val="false"/>
+                <w:color w:val="000000"/>
+                <w:sz w:val="18"/>
+                <w:szCs w:val="20"/>
+                <w:lang w:eastAsia="es-CL"/>
+              </w:rPr>
+            </w:pPr>
+            <w:r>
+              <w:rPr>
+                <w:rFonts w:cs="Arial"/>
+                <w:b w:val="false"/>
+                <w:bCs w:val="false"/>
+                <w:i w:val="false"/>
+                <w:iCs w:val="false"/>
+                <w:color w:val="000000"/>
+                <w:sz w:val="18"/>
+                <w:szCs w:val="20"/>
+                <w:lang w:eastAsia="es-CL"/>
+              </w:rPr>
+            </w:r>
+          </w:p>
+        </w:tc>
+        <w:tc>
+          <w:tcPr>
+            <w:tcW w:w="1813" w:type="dxa"/>
+            <w:tcBorders>
+              <w:top w:val="nil"/>
+              <w:start w:val="single" w:sz="4" w:space="0" w:color="BFBFBF"/>
+              <w:bottom w:val="single" w:sz="4" w:space="0" w:color="BFBFBF"/>
+              <w:end w:val="single" w:sz="4" w:space="0" w:color="BFBFBF"/>
+            </w:tcBorders>
+          </w:tcPr>
+          <w:p>
+            <w:pPr>
+              <w:pStyle w:val="Normal"/>
+              <w:widowControl/>
+              <w:suppressAutoHyphens w:val="true"/>
+              <w:bidi w:val="0"/>
+              <w:spacing w:before="0" w:after="160"/>
+              <w:jc w:val="start"/>
+              <w:rPr>
+                <w:rFonts w:ascii="Calibri" w:hAnsi="Calibri" w:cs="Arial"/>
+                <w:b w:val="false"/>
+                <w:bCs w:val="false"/>
+                <w:i w:val="false"/>
+                <w:iCs w:val="false"/>
+                <w:color w:val="000000"/>
+                <w:sz w:val="18"/>
+                <w:szCs w:val="20"/>
+                <w:lang w:eastAsia="es-CL"/>
+              </w:rPr>
+            </w:pPr>
+            <w:r>
+              <w:rPr>
+                <w:rFonts w:cs="Arial"/>
+                <w:b w:val="false"/>
+                <w:bCs w:val="false"/>
+                <w:i w:val="false"/>
+                <w:iCs w:val="false"/>
+                <w:color w:val="000000"/>
+                <w:sz w:val="18"/>
+                <w:szCs w:val="20"/>
+                <w:lang w:eastAsia="es-CL"/>
+              </w:rPr>
+            </w:r>
+          </w:p>
+        </w:tc>
+        <w:tc>
+          <w:tcPr>
+            <w:tcW w:w="987" w:type="dxa"/>
+            <w:tcBorders>
+              <w:top w:val="nil"/>
+              <w:start w:val="single" w:sz="4" w:space="0" w:color="BFBFBF"/>
+              <w:bottom w:val="single" w:sz="4" w:space="0" w:color="BFBFBF"/>
+              <w:end w:val="single" w:sz="4" w:space="0" w:color="FFFFFF"/>
+            </w:tcBorders>
+          </w:tcPr>
+          <w:p>
+            <w:pPr>
+              <w:pStyle w:val="Normal"/>
+              <w:widowControl/>
+              <w:suppressAutoHyphens w:val="true"/>
+              <w:bidi w:val="0"/>
+              <w:spacing w:before="0" w:after="160"/>
+              <w:jc w:val="start"/>
+              <w:rPr>
+                <w:rFonts w:ascii="Calibri" w:hAnsi="Calibri" w:cs="Arial"/>
+                <w:b w:val="false"/>
+                <w:bCs w:val="false"/>
+                <w:i w:val="false"/>
+                <w:iCs w:val="false"/>
+                <w:color w:val="000000"/>
+                <w:sz w:val="18"/>
+                <w:szCs w:val="20"/>
+                <w:lang w:eastAsia="es-CL"/>
+              </w:rPr>
+            </w:pPr>
+            <w:r>
+              <w:rPr>
+                <w:rFonts w:cs="Arial"/>
+                <w:b w:val="false"/>
+                <w:bCs w:val="false"/>
+                <w:i w:val="false"/>
+                <w:iCs w:val="false"/>
+                <w:color w:val="000000"/>
+                <w:sz w:val="18"/>
+                <w:szCs w:val="20"/>
+                <w:lang w:eastAsia="es-CL"/>
+              </w:rPr>
+            </w:r>
+          </w:p>
+        </w:tc>
+        <w:tc>
+          <w:tcPr>
+            <w:tcW w:w="1580" w:type="dxa"/>
+            <w:tcBorders>
+              <w:top w:val="nil"/>
+              <w:start w:val="single" w:sz="4" w:space="0" w:color="FFFFFF"/>
+              <w:bottom w:val="single" w:sz="4" w:space="0" w:color="BFBFBF"/>
+              <w:end w:val="single" w:sz="4" w:space="0" w:color="BFBFBF"/>
+            </w:tcBorders>
+            <w:shd w:color="auto" w:fill="D9D9D9" w:themeFill="background1" w:themeFillShade="d9" w:val="clear"/>
+          </w:tcPr>
+          <w:p>
+            <w:pPr>
+              <w:pStyle w:val="Normal"/>
+              <w:widowControl/>
+              <w:suppressAutoHyphens w:val="true"/>
+              <w:bidi w:val="0"/>
+              <w:spacing w:before="0" w:after="160"/>
+              <w:jc w:val="start"/>
+              <w:rPr>
+                <w:rFonts w:ascii="Calibri" w:hAnsi="Calibri" w:cs="Arial"/>
+                <w:b w:val="false"/>
+                <w:bCs w:val="false"/>
+                <w:i w:val="false"/>
+                <w:iCs w:val="false"/>
+                <w:color w:val="000000"/>
+                <w:sz w:val="18"/>
+                <w:szCs w:val="20"/>
+                <w:lang w:eastAsia="es-CL"/>
+              </w:rPr>
+            </w:pPr>
+            <w:r>
+              <w:rPr>
+                <w:rFonts w:cs="Arial"/>
+                <w:b w:val="false"/>
+                <w:bCs w:val="false"/>
+                <w:i w:val="false"/>
+                <w:iCs w:val="false"/>
+                <w:color w:val="000000"/>
+                <w:sz w:val="18"/>
+                <w:szCs w:val="20"/>
+                <w:lang w:eastAsia="es-CL"/>
+              </w:rPr>
+            </w:r>
+          </w:p>
+        </w:tc>
+        <w:tc>
+          <w:tcPr>
+            <w:tcW w:w="1581" w:type="dxa"/>
+            <w:tcBorders>
+              <w:top w:val="nil"/>
+              <w:start w:val="single" w:sz="4" w:space="0" w:color="BFBFBF"/>
+              <w:bottom w:val="single" w:sz="4" w:space="0" w:color="BFBFBF"/>
+              <w:end w:val="single" w:sz="4" w:space="0" w:color="BFBFBF"/>
+            </w:tcBorders>
+          </w:tcPr>
+          <w:p>
+            <w:pPr>
+              <w:pStyle w:val="Normal"/>
+              <w:widowControl/>
+              <w:suppressAutoHyphens w:val="true"/>
+              <w:bidi w:val="0"/>
+              <w:spacing w:before="0" w:after="160"/>
+              <w:jc w:val="start"/>
+              <w:rPr>
+                <w:rFonts w:ascii="Calibri" w:hAnsi="Calibri" w:cs="Arial"/>
+                <w:b w:val="false"/>
+                <w:bCs w:val="false"/>
+                <w:i w:val="false"/>
+                <w:iCs w:val="false"/>
+                <w:color w:val="000000"/>
+                <w:sz w:val="18"/>
+                <w:szCs w:val="20"/>
+                <w:lang w:eastAsia="es-CL"/>
+              </w:rPr>
+            </w:pPr>
+            <w:r>
+              <w:rPr>
+                <w:rFonts w:cs="Arial"/>
+                <w:b w:val="false"/>
+                <w:bCs w:val="false"/>
+                <w:i w:val="false"/>
+                <w:iCs w:val="false"/>
+                <w:color w:val="000000"/>
+                <w:sz w:val="18"/>
+                <w:szCs w:val="20"/>
+                <w:lang w:eastAsia="es-CL"/>
+              </w:rPr>
+            </w:r>
+          </w:p>
+        </w:tc>
+      </w:tr>
+      <w:tr>
+        <w:trPr/>
+        <w:tc>
+          <w:tcPr>
+            <w:tcW w:w="1579" w:type="dxa"/>
+            <w:tcBorders>
+              <w:top w:val="nil"/>
+              <w:start w:val="single" w:sz="4" w:space="0" w:color="BFBFBF"/>
+              <w:bottom w:val="single" w:sz="4" w:space="0" w:color="BFBFBF"/>
+              <w:end w:val="single" w:sz="4" w:space="0" w:color="BFBFBF"/>
+            </w:tcBorders>
+          </w:tcPr>
+          <w:p>
+            <w:pPr>
+              <w:pStyle w:val="Normal"/>
+              <w:widowControl/>
+              <w:suppressAutoHyphens w:val="true"/>
+              <w:bidi w:val="0"/>
+              <w:spacing w:before="0" w:after="160"/>
+              <w:jc w:val="start"/>
+              <w:rPr>
+                <w:rFonts w:ascii="Calibri" w:hAnsi="Calibri" w:cs="Arial"/>
+                <w:b w:val="false"/>
+                <w:bCs w:val="false"/>
+                <w:i w:val="false"/>
+                <w:iCs w:val="false"/>
+                <w:color w:val="000000"/>
+                <w:sz w:val="18"/>
+                <w:szCs w:val="20"/>
+                <w:lang w:eastAsia="es-CL"/>
+              </w:rPr>
+            </w:pPr>
+            <w:r>
+              <w:rPr>
+                <w:rFonts w:cs="Arial"/>
+                <w:b w:val="false"/>
+                <w:bCs w:val="false"/>
+                <w:i w:val="false"/>
+                <w:iCs w:val="false"/>
+                <w:color w:val="000000"/>
+                <w:sz w:val="18"/>
+                <w:szCs w:val="20"/>
+                <w:lang w:eastAsia="es-CL"/>
+              </w:rPr>
+            </w:r>
+          </w:p>
+        </w:tc>
+        <w:tc>
+          <w:tcPr>
+            <w:tcW w:w="1370" w:type="dxa"/>
+            <w:tcBorders>
+              <w:top w:val="nil"/>
+              <w:start w:val="single" w:sz="4" w:space="0" w:color="BFBFBF"/>
+              <w:bottom w:val="single" w:sz="4" w:space="0" w:color="BFBFBF"/>
+              <w:end w:val="single" w:sz="4" w:space="0" w:color="BFBFBF"/>
+            </w:tcBorders>
+          </w:tcPr>
+          <w:p>
+            <w:pPr>
+              <w:pStyle w:val="Normal"/>
+              <w:widowControl/>
+              <w:suppressAutoHyphens w:val="true"/>
+              <w:bidi w:val="0"/>
+              <w:spacing w:before="0" w:after="160"/>
+              <w:jc w:val="start"/>
+              <w:rPr>
+                <w:rFonts w:ascii="Calibri" w:hAnsi="Calibri" w:cs="Arial"/>
+                <w:b w:val="false"/>
+                <w:bCs w:val="false"/>
+                <w:i w:val="false"/>
+                <w:iCs w:val="false"/>
+                <w:color w:val="000000"/>
+                <w:sz w:val="18"/>
+                <w:szCs w:val="20"/>
+                <w:lang w:eastAsia="es-CL"/>
+              </w:rPr>
+            </w:pPr>
+            <w:r>
+              <w:rPr>
+                <w:rFonts w:cs="Arial"/>
+                <w:b w:val="false"/>
+                <w:bCs w:val="false"/>
+                <w:i w:val="false"/>
+                <w:iCs w:val="false"/>
+                <w:color w:val="000000"/>
+                <w:sz w:val="18"/>
+                <w:szCs w:val="20"/>
+                <w:lang w:eastAsia="es-CL"/>
+              </w:rPr>
+              <w:t>Pruebas funcionales y validación técnica</w:t>
+            </w:r>
+          </w:p>
+        </w:tc>
+        <w:tc>
+          <w:tcPr>
+            <w:tcW w:w="2150" w:type="dxa"/>
+            <w:tcBorders>
+              <w:top w:val="nil"/>
+              <w:start w:val="single" w:sz="4" w:space="0" w:color="BFBFBF"/>
+              <w:bottom w:val="single" w:sz="4" w:space="0" w:color="BFBFBF"/>
+              <w:end w:val="single" w:sz="4" w:space="0" w:color="BFBFBF"/>
+            </w:tcBorders>
+          </w:tcPr>
+          <w:p>
+            <w:pPr>
+              <w:pStyle w:val="Normal"/>
+              <w:widowControl/>
+              <w:suppressAutoHyphens w:val="true"/>
+              <w:bidi w:val="0"/>
+              <w:spacing w:before="0" w:after="160"/>
+              <w:jc w:val="start"/>
+              <w:rPr>
+                <w:rFonts w:ascii="Calibri" w:hAnsi="Calibri" w:cs="Arial"/>
+                <w:b w:val="false"/>
+                <w:bCs w:val="false"/>
+                <w:i w:val="false"/>
+                <w:iCs w:val="false"/>
+                <w:color w:val="000000"/>
+                <w:sz w:val="18"/>
+                <w:szCs w:val="20"/>
+                <w:lang w:eastAsia="es-CL"/>
+              </w:rPr>
+            </w:pPr>
+            <w:r>
+              <w:rPr>
+                <w:rFonts w:cs="Arial"/>
+                <w:b w:val="false"/>
+                <w:bCs w:val="false"/>
+                <w:i w:val="false"/>
+                <w:iCs w:val="false"/>
+                <w:color w:val="000000"/>
+                <w:sz w:val="18"/>
+                <w:szCs w:val="20"/>
+                <w:lang w:eastAsia="es-CL"/>
+              </w:rPr>
+            </w:r>
+          </w:p>
+        </w:tc>
+        <w:tc>
+          <w:tcPr>
+            <w:tcW w:w="1813" w:type="dxa"/>
+            <w:tcBorders>
+              <w:top w:val="nil"/>
+              <w:start w:val="single" w:sz="4" w:space="0" w:color="BFBFBF"/>
+              <w:bottom w:val="single" w:sz="4" w:space="0" w:color="BFBFBF"/>
+              <w:end w:val="single" w:sz="4" w:space="0" w:color="BFBFBF"/>
+            </w:tcBorders>
+          </w:tcPr>
+          <w:p>
+            <w:pPr>
+              <w:pStyle w:val="Normal"/>
+              <w:widowControl/>
+              <w:suppressAutoHyphens w:val="true"/>
+              <w:bidi w:val="0"/>
+              <w:spacing w:before="0" w:after="160"/>
+              <w:jc w:val="start"/>
+              <w:rPr>
+                <w:rFonts w:ascii="Calibri" w:hAnsi="Calibri" w:cs="Arial"/>
+                <w:b w:val="false"/>
+                <w:bCs w:val="false"/>
+                <w:i w:val="false"/>
+                <w:iCs w:val="false"/>
+                <w:color w:val="000000"/>
+                <w:sz w:val="18"/>
+                <w:szCs w:val="20"/>
+                <w:lang w:eastAsia="es-CL"/>
+              </w:rPr>
+            </w:pPr>
+            <w:r>
+              <w:rPr>
+                <w:rFonts w:cs="Arial"/>
+                <w:b w:val="false"/>
+                <w:bCs w:val="false"/>
+                <w:i w:val="false"/>
+                <w:iCs w:val="false"/>
+                <w:color w:val="000000"/>
+                <w:sz w:val="18"/>
+                <w:szCs w:val="20"/>
+                <w:lang w:eastAsia="es-CL"/>
+              </w:rPr>
+            </w:r>
+          </w:p>
+        </w:tc>
+        <w:tc>
+          <w:tcPr>
+            <w:tcW w:w="987" w:type="dxa"/>
+            <w:tcBorders>
+              <w:top w:val="nil"/>
+              <w:start w:val="single" w:sz="4" w:space="0" w:color="BFBFBF"/>
+              <w:bottom w:val="single" w:sz="4" w:space="0" w:color="BFBFBF"/>
+              <w:end w:val="single" w:sz="4" w:space="0" w:color="FFFFFF"/>
+            </w:tcBorders>
+          </w:tcPr>
+          <w:p>
+            <w:pPr>
+              <w:pStyle w:val="Normal"/>
+              <w:widowControl/>
+              <w:suppressAutoHyphens w:val="true"/>
+              <w:bidi w:val="0"/>
+              <w:spacing w:before="0" w:after="160"/>
+              <w:jc w:val="start"/>
+              <w:rPr>
+                <w:rFonts w:ascii="Calibri" w:hAnsi="Calibri" w:cs="Arial"/>
+                <w:b w:val="false"/>
+                <w:bCs w:val="false"/>
+                <w:i w:val="false"/>
+                <w:iCs w:val="false"/>
+                <w:color w:val="000000"/>
+                <w:sz w:val="18"/>
+                <w:szCs w:val="20"/>
+                <w:lang w:eastAsia="es-CL"/>
+              </w:rPr>
+            </w:pPr>
+            <w:r>
+              <w:rPr>
+                <w:rFonts w:cs="Arial"/>
+                <w:b w:val="false"/>
+                <w:bCs w:val="false"/>
+                <w:i w:val="false"/>
+                <w:iCs w:val="false"/>
+                <w:color w:val="000000"/>
+                <w:sz w:val="18"/>
+                <w:szCs w:val="20"/>
+                <w:lang w:eastAsia="es-CL"/>
+              </w:rPr>
+            </w:r>
+          </w:p>
+        </w:tc>
+        <w:tc>
+          <w:tcPr>
+            <w:tcW w:w="1580" w:type="dxa"/>
+            <w:tcBorders>
+              <w:top w:val="nil"/>
+              <w:start w:val="single" w:sz="4" w:space="0" w:color="FFFFFF"/>
+              <w:bottom w:val="single" w:sz="4" w:space="0" w:color="BFBFBF"/>
+              <w:end w:val="single" w:sz="4" w:space="0" w:color="BFBFBF"/>
+            </w:tcBorders>
+            <w:shd w:color="auto" w:fill="D9D9D9" w:themeFill="background1" w:themeFillShade="d9" w:val="clear"/>
+          </w:tcPr>
+          <w:p>
+            <w:pPr>
+              <w:pStyle w:val="Normal"/>
+              <w:widowControl/>
+              <w:suppressAutoHyphens w:val="true"/>
+              <w:bidi w:val="0"/>
+              <w:spacing w:before="0" w:after="160"/>
+              <w:jc w:val="start"/>
+              <w:rPr>
+                <w:rFonts w:ascii="Calibri" w:hAnsi="Calibri" w:cs="Arial"/>
+                <w:b w:val="false"/>
+                <w:bCs w:val="false"/>
+                <w:i w:val="false"/>
+                <w:iCs w:val="false"/>
+                <w:color w:val="000000"/>
+                <w:sz w:val="18"/>
+                <w:szCs w:val="20"/>
+                <w:lang w:eastAsia="es-CL"/>
+              </w:rPr>
+            </w:pPr>
+            <w:r>
+              <w:rPr>
+                <w:rFonts w:cs="Arial"/>
+                <w:b w:val="false"/>
+                <w:bCs w:val="false"/>
+                <w:i w:val="false"/>
+                <w:iCs w:val="false"/>
+                <w:color w:val="000000"/>
+                <w:sz w:val="18"/>
+                <w:szCs w:val="20"/>
+                <w:lang w:eastAsia="es-CL"/>
+              </w:rPr>
+            </w:r>
+          </w:p>
+        </w:tc>
+        <w:tc>
+          <w:tcPr>
+            <w:tcW w:w="1581" w:type="dxa"/>
+            <w:tcBorders>
+              <w:top w:val="nil"/>
+              <w:start w:val="single" w:sz="4" w:space="0" w:color="BFBFBF"/>
+              <w:bottom w:val="single" w:sz="4" w:space="0" w:color="BFBFBF"/>
+              <w:end w:val="single" w:sz="4" w:space="0" w:color="BFBFBF"/>
+            </w:tcBorders>
+          </w:tcPr>
+          <w:p>
+            <w:pPr>
+              <w:pStyle w:val="Normal"/>
+              <w:widowControl/>
+              <w:suppressAutoHyphens w:val="true"/>
+              <w:bidi w:val="0"/>
+              <w:spacing w:before="0" w:after="160"/>
+              <w:jc w:val="start"/>
+              <w:rPr>
+                <w:rFonts w:ascii="Calibri" w:hAnsi="Calibri" w:cs="Arial"/>
+                <w:b w:val="false"/>
+                <w:bCs w:val="false"/>
+                <w:i w:val="false"/>
+                <w:iCs w:val="false"/>
+                <w:color w:val="000000"/>
+                <w:sz w:val="18"/>
+                <w:szCs w:val="20"/>
+                <w:lang w:eastAsia="es-CL"/>
+              </w:rPr>
+            </w:pPr>
+            <w:r>
+              <w:rPr>
+                <w:rFonts w:cs="Arial"/>
+                <w:b w:val="false"/>
+                <w:bCs w:val="false"/>
+                <w:i w:val="false"/>
+                <w:iCs w:val="false"/>
+                <w:color w:val="000000"/>
+                <w:sz w:val="18"/>
+                <w:szCs w:val="20"/>
+                <w:lang w:eastAsia="es-CL"/>
+              </w:rPr>
+            </w:r>
+          </w:p>
+        </w:tc>
+      </w:tr>
+      <w:tr>
+        <w:trPr/>
+        <w:tc>
+          <w:tcPr>
+            <w:tcW w:w="1579" w:type="dxa"/>
+            <w:tcBorders>
+              <w:top w:val="nil"/>
+              <w:start w:val="single" w:sz="4" w:space="0" w:color="BFBFBF"/>
+              <w:bottom w:val="single" w:sz="4" w:space="0" w:color="BFBFBF"/>
+              <w:end w:val="single" w:sz="4" w:space="0" w:color="BFBFBF"/>
+            </w:tcBorders>
+          </w:tcPr>
+          <w:p>
+            <w:pPr>
+              <w:pStyle w:val="Normal"/>
+              <w:widowControl/>
+              <w:suppressAutoHyphens w:val="true"/>
+              <w:bidi w:val="0"/>
+              <w:spacing w:before="0" w:after="160"/>
+              <w:jc w:val="start"/>
+              <w:rPr>
+                <w:rFonts w:ascii="Calibri" w:hAnsi="Calibri" w:cs="Arial"/>
+                <w:b w:val="false"/>
+                <w:bCs w:val="false"/>
+                <w:i w:val="false"/>
+                <w:iCs w:val="false"/>
+                <w:color w:val="000000"/>
+                <w:sz w:val="18"/>
+                <w:szCs w:val="20"/>
+                <w:lang w:eastAsia="es-CL"/>
+              </w:rPr>
+            </w:pPr>
+            <w:r>
+              <w:rPr>
+                <w:rFonts w:cs="Arial"/>
+                <w:b w:val="false"/>
+                <w:bCs w:val="false"/>
+                <w:i w:val="false"/>
+                <w:iCs w:val="false"/>
+                <w:color w:val="000000"/>
+                <w:sz w:val="18"/>
+                <w:szCs w:val="20"/>
+                <w:lang w:eastAsia="es-CL"/>
+              </w:rPr>
+            </w:r>
+          </w:p>
+        </w:tc>
+        <w:tc>
+          <w:tcPr>
+            <w:tcW w:w="1370" w:type="dxa"/>
+            <w:tcBorders>
+              <w:top w:val="nil"/>
+              <w:start w:val="single" w:sz="4" w:space="0" w:color="BFBFBF"/>
+              <w:bottom w:val="single" w:sz="4" w:space="0" w:color="BFBFBF"/>
+              <w:end w:val="single" w:sz="4" w:space="0" w:color="BFBFBF"/>
+            </w:tcBorders>
+          </w:tcPr>
+          <w:p>
+            <w:pPr>
+              <w:pStyle w:val="Normal"/>
+              <w:widowControl/>
+              <w:suppressAutoHyphens w:val="true"/>
+              <w:bidi w:val="0"/>
+              <w:spacing w:before="0" w:after="160"/>
+              <w:jc w:val="start"/>
+              <w:rPr>
+                <w:rFonts w:ascii="Calibri" w:hAnsi="Calibri" w:cs="Arial"/>
+                <w:b w:val="false"/>
+                <w:bCs w:val="false"/>
+                <w:i w:val="false"/>
+                <w:iCs w:val="false"/>
+                <w:color w:val="000000"/>
+                <w:sz w:val="18"/>
+                <w:szCs w:val="20"/>
+                <w:lang w:eastAsia="es-CL"/>
+              </w:rPr>
+            </w:pPr>
+            <w:r>
+              <w:rPr>
+                <w:rFonts w:cs="Arial"/>
+                <w:b w:val="false"/>
+                <w:bCs w:val="false"/>
+                <w:i w:val="false"/>
+                <w:iCs w:val="false"/>
+                <w:color w:val="000000"/>
+                <w:sz w:val="18"/>
+                <w:szCs w:val="20"/>
+                <w:lang w:eastAsia="es-CL"/>
+              </w:rPr>
+              <w:t>Playtests e iteración del producto</w:t>
+            </w:r>
+          </w:p>
+        </w:tc>
+        <w:tc>
+          <w:tcPr>
+            <w:tcW w:w="2150" w:type="dxa"/>
+            <w:tcBorders>
+              <w:top w:val="nil"/>
+              <w:start w:val="single" w:sz="4" w:space="0" w:color="BFBFBF"/>
+              <w:bottom w:val="single" w:sz="4" w:space="0" w:color="BFBFBF"/>
+              <w:end w:val="single" w:sz="4" w:space="0" w:color="BFBFBF"/>
+            </w:tcBorders>
+          </w:tcPr>
+          <w:p>
+            <w:pPr>
+              <w:pStyle w:val="Normal"/>
+              <w:widowControl/>
+              <w:suppressAutoHyphens w:val="true"/>
+              <w:bidi w:val="0"/>
+              <w:spacing w:before="0" w:after="160"/>
+              <w:jc w:val="start"/>
+              <w:rPr>
+                <w:rFonts w:ascii="Calibri" w:hAnsi="Calibri" w:cs="Arial"/>
+                <w:b w:val="false"/>
+                <w:bCs w:val="false"/>
+                <w:i w:val="false"/>
+                <w:iCs w:val="false"/>
+                <w:color w:val="000000"/>
+                <w:sz w:val="18"/>
+                <w:szCs w:val="20"/>
+                <w:lang w:eastAsia="es-CL"/>
+              </w:rPr>
+            </w:pPr>
+            <w:r>
+              <w:rPr>
+                <w:rFonts w:cs="Arial"/>
+                <w:b w:val="false"/>
+                <w:bCs w:val="false"/>
+                <w:i w:val="false"/>
+                <w:iCs w:val="false"/>
+                <w:color w:val="000000"/>
+                <w:sz w:val="18"/>
+                <w:szCs w:val="20"/>
+                <w:lang w:eastAsia="es-CL"/>
+              </w:rPr>
+            </w:r>
+          </w:p>
+        </w:tc>
+        <w:tc>
+          <w:tcPr>
+            <w:tcW w:w="1813" w:type="dxa"/>
+            <w:tcBorders>
+              <w:top w:val="nil"/>
+              <w:start w:val="single" w:sz="4" w:space="0" w:color="BFBFBF"/>
+              <w:bottom w:val="single" w:sz="4" w:space="0" w:color="BFBFBF"/>
+              <w:end w:val="single" w:sz="4" w:space="0" w:color="BFBFBF"/>
+            </w:tcBorders>
+          </w:tcPr>
+          <w:p>
+            <w:pPr>
+              <w:pStyle w:val="Normal"/>
+              <w:widowControl/>
+              <w:suppressAutoHyphens w:val="true"/>
+              <w:bidi w:val="0"/>
+              <w:spacing w:before="0" w:after="160"/>
+              <w:jc w:val="start"/>
+              <w:rPr>
+                <w:rFonts w:ascii="Calibri" w:hAnsi="Calibri" w:cs="Arial"/>
+                <w:b w:val="false"/>
+                <w:bCs w:val="false"/>
+                <w:i w:val="false"/>
+                <w:iCs w:val="false"/>
+                <w:color w:val="000000"/>
+                <w:sz w:val="18"/>
+                <w:szCs w:val="20"/>
+                <w:lang w:eastAsia="es-CL"/>
+              </w:rPr>
+            </w:pPr>
+            <w:r>
+              <w:rPr>
+                <w:rFonts w:cs="Arial"/>
+                <w:b w:val="false"/>
+                <w:bCs w:val="false"/>
+                <w:i w:val="false"/>
+                <w:iCs w:val="false"/>
+                <w:color w:val="000000"/>
+                <w:sz w:val="18"/>
+                <w:szCs w:val="20"/>
+                <w:lang w:eastAsia="es-CL"/>
+              </w:rPr>
+            </w:r>
+          </w:p>
+        </w:tc>
+        <w:tc>
+          <w:tcPr>
+            <w:tcW w:w="987" w:type="dxa"/>
+            <w:tcBorders>
+              <w:top w:val="nil"/>
+              <w:start w:val="single" w:sz="4" w:space="0" w:color="BFBFBF"/>
+              <w:bottom w:val="single" w:sz="4" w:space="0" w:color="BFBFBF"/>
+              <w:end w:val="single" w:sz="4" w:space="0" w:color="FFFFFF"/>
+            </w:tcBorders>
+          </w:tcPr>
+          <w:p>
+            <w:pPr>
+              <w:pStyle w:val="Normal"/>
+              <w:widowControl/>
+              <w:suppressAutoHyphens w:val="true"/>
+              <w:bidi w:val="0"/>
+              <w:spacing w:before="0" w:after="160"/>
+              <w:jc w:val="start"/>
+              <w:rPr>
+                <w:rFonts w:ascii="Calibri" w:hAnsi="Calibri" w:cs="Arial"/>
+                <w:b w:val="false"/>
+                <w:bCs w:val="false"/>
+                <w:i w:val="false"/>
+                <w:iCs w:val="false"/>
+                <w:color w:val="000000"/>
+                <w:sz w:val="18"/>
+                <w:szCs w:val="20"/>
+                <w:lang w:eastAsia="es-CL"/>
+              </w:rPr>
+            </w:pPr>
+            <w:r>
+              <w:rPr>
+                <w:rFonts w:cs="Arial"/>
+                <w:b w:val="false"/>
+                <w:bCs w:val="false"/>
+                <w:i w:val="false"/>
+                <w:iCs w:val="false"/>
+                <w:color w:val="000000"/>
+                <w:sz w:val="18"/>
+                <w:szCs w:val="20"/>
+                <w:lang w:eastAsia="es-CL"/>
+              </w:rPr>
+            </w:r>
+          </w:p>
+        </w:tc>
+        <w:tc>
+          <w:tcPr>
+            <w:tcW w:w="1580" w:type="dxa"/>
+            <w:tcBorders>
+              <w:top w:val="nil"/>
+              <w:start w:val="single" w:sz="4" w:space="0" w:color="FFFFFF"/>
+              <w:bottom w:val="single" w:sz="4" w:space="0" w:color="BFBFBF"/>
+              <w:end w:val="single" w:sz="4" w:space="0" w:color="BFBFBF"/>
+            </w:tcBorders>
+            <w:shd w:color="auto" w:fill="D9D9D9" w:themeFill="background1" w:themeFillShade="d9" w:val="clear"/>
+          </w:tcPr>
+          <w:p>
+            <w:pPr>
+              <w:pStyle w:val="Normal"/>
+              <w:widowControl/>
+              <w:suppressAutoHyphens w:val="true"/>
+              <w:bidi w:val="0"/>
+              <w:spacing w:before="0" w:after="160"/>
+              <w:jc w:val="start"/>
+              <w:rPr>
+                <w:rFonts w:ascii="Calibri" w:hAnsi="Calibri" w:cs="Arial"/>
+                <w:b w:val="false"/>
+                <w:bCs w:val="false"/>
+                <w:i w:val="false"/>
+                <w:iCs w:val="false"/>
+                <w:color w:val="000000"/>
+                <w:sz w:val="18"/>
+                <w:szCs w:val="20"/>
+                <w:lang w:eastAsia="es-CL"/>
+              </w:rPr>
+            </w:pPr>
+            <w:r>
+              <w:rPr>
+                <w:rFonts w:cs="Arial"/>
+                <w:b w:val="false"/>
+                <w:bCs w:val="false"/>
+                <w:i w:val="false"/>
+                <w:iCs w:val="false"/>
+                <w:color w:val="000000"/>
+                <w:sz w:val="18"/>
+                <w:szCs w:val="20"/>
+                <w:lang w:eastAsia="es-CL"/>
+              </w:rPr>
+            </w:r>
+          </w:p>
+        </w:tc>
+        <w:tc>
+          <w:tcPr>
+            <w:tcW w:w="1581" w:type="dxa"/>
+            <w:tcBorders>
+              <w:top w:val="nil"/>
+              <w:start w:val="single" w:sz="4" w:space="0" w:color="BFBFBF"/>
+              <w:bottom w:val="single" w:sz="4" w:space="0" w:color="BFBFBF"/>
+              <w:end w:val="single" w:sz="4" w:space="0" w:color="BFBFBF"/>
+            </w:tcBorders>
+          </w:tcPr>
+          <w:p>
+            <w:pPr>
+              <w:pStyle w:val="Normal"/>
+              <w:widowControl/>
+              <w:suppressAutoHyphens w:val="true"/>
+              <w:bidi w:val="0"/>
+              <w:spacing w:before="0" w:after="160"/>
+              <w:jc w:val="start"/>
+              <w:rPr>
+                <w:rFonts w:ascii="Calibri" w:hAnsi="Calibri" w:cs="Arial"/>
+                <w:b w:val="false"/>
+                <w:bCs w:val="false"/>
+                <w:i w:val="false"/>
+                <w:iCs w:val="false"/>
+                <w:color w:val="000000"/>
+                <w:sz w:val="18"/>
+                <w:szCs w:val="20"/>
+                <w:lang w:eastAsia="es-CL"/>
+              </w:rPr>
+            </w:pPr>
+            <w:r>
+              <w:rPr>
+                <w:rFonts w:cs="Arial"/>
+                <w:b w:val="false"/>
+                <w:bCs w:val="false"/>
+                <w:i w:val="false"/>
+                <w:iCs w:val="false"/>
+                <w:color w:val="000000"/>
+                <w:sz w:val="18"/>
+                <w:szCs w:val="20"/>
+                <w:lang w:eastAsia="es-CL"/>
+              </w:rPr>
+            </w:r>
+          </w:p>
+        </w:tc>
+      </w:tr>
+      <w:tr>
+        <w:trPr/>
+        <w:tc>
+          <w:tcPr>
+            <w:tcW w:w="1579" w:type="dxa"/>
+            <w:tcBorders>
+              <w:top w:val="nil"/>
+              <w:start w:val="single" w:sz="4" w:space="0" w:color="BFBFBF"/>
+              <w:bottom w:val="single" w:sz="4" w:space="0" w:color="BFBFBF"/>
+              <w:end w:val="single" w:sz="4" w:space="0" w:color="BFBFBF"/>
+            </w:tcBorders>
+          </w:tcPr>
+          <w:p>
+            <w:pPr>
+              <w:pStyle w:val="Normal"/>
+              <w:widowControl/>
+              <w:suppressAutoHyphens w:val="true"/>
+              <w:bidi w:val="0"/>
+              <w:spacing w:before="0" w:after="160"/>
+              <w:jc w:val="start"/>
+              <w:rPr>
+                <w:rFonts w:ascii="Calibri" w:hAnsi="Calibri" w:cs="Arial"/>
+                <w:b w:val="false"/>
+                <w:bCs w:val="false"/>
+                <w:i w:val="false"/>
+                <w:iCs w:val="false"/>
+                <w:color w:val="000000"/>
+                <w:sz w:val="18"/>
+                <w:szCs w:val="20"/>
+                <w:lang w:eastAsia="es-CL"/>
+              </w:rPr>
+            </w:pPr>
+            <w:r>
+              <w:rPr>
+                <w:rFonts w:cs="Arial"/>
+                <w:b w:val="false"/>
+                <w:bCs w:val="false"/>
+                <w:i w:val="false"/>
+                <w:iCs w:val="false"/>
+                <w:color w:val="000000"/>
+                <w:sz w:val="18"/>
+                <w:szCs w:val="20"/>
+                <w:lang w:eastAsia="es-CL"/>
+              </w:rPr>
+            </w:r>
+          </w:p>
+        </w:tc>
+        <w:tc>
+          <w:tcPr>
+            <w:tcW w:w="1370" w:type="dxa"/>
+            <w:tcBorders>
+              <w:top w:val="nil"/>
+              <w:start w:val="single" w:sz="4" w:space="0" w:color="BFBFBF"/>
+              <w:bottom w:val="single" w:sz="4" w:space="0" w:color="BFBFBF"/>
+              <w:end w:val="single" w:sz="4" w:space="0" w:color="BFBFBF"/>
+            </w:tcBorders>
+          </w:tcPr>
+          <w:p>
+            <w:pPr>
+              <w:pStyle w:val="Normal"/>
+              <w:widowControl/>
+              <w:suppressAutoHyphens w:val="true"/>
+              <w:bidi w:val="0"/>
+              <w:spacing w:before="0" w:after="160"/>
+              <w:jc w:val="start"/>
+              <w:rPr>
+                <w:rFonts w:ascii="Calibri" w:hAnsi="Calibri" w:cs="Arial"/>
+                <w:b w:val="false"/>
+                <w:bCs w:val="false"/>
+                <w:i w:val="false"/>
+                <w:iCs w:val="false"/>
+                <w:color w:val="000000"/>
+                <w:sz w:val="18"/>
+                <w:szCs w:val="20"/>
+                <w:lang w:eastAsia="es-CL"/>
+              </w:rPr>
+            </w:pPr>
+            <w:r>
+              <w:rPr>
+                <w:rFonts w:cs="Arial"/>
+                <w:b w:val="false"/>
+                <w:bCs w:val="false"/>
+                <w:i w:val="false"/>
+                <w:iCs w:val="false"/>
+                <w:color w:val="000000"/>
+                <w:sz w:val="18"/>
+                <w:szCs w:val="20"/>
+                <w:lang w:eastAsia="es-CL"/>
+              </w:rPr>
+              <w:t>Preparación de versión final y publicación</w:t>
+            </w:r>
+          </w:p>
+        </w:tc>
+        <w:tc>
+          <w:tcPr>
+            <w:tcW w:w="2150" w:type="dxa"/>
+            <w:tcBorders>
+              <w:top w:val="nil"/>
+              <w:start w:val="single" w:sz="4" w:space="0" w:color="BFBFBF"/>
+              <w:bottom w:val="single" w:sz="4" w:space="0" w:color="BFBFBF"/>
+              <w:end w:val="single" w:sz="4" w:space="0" w:color="BFBFBF"/>
+            </w:tcBorders>
+          </w:tcPr>
+          <w:p>
+            <w:pPr>
+              <w:pStyle w:val="Normal"/>
+              <w:widowControl/>
+              <w:suppressAutoHyphens w:val="true"/>
+              <w:bidi w:val="0"/>
+              <w:spacing w:before="0" w:after="160"/>
+              <w:jc w:val="start"/>
+              <w:rPr>
+                <w:rFonts w:ascii="Calibri" w:hAnsi="Calibri" w:cs="Arial"/>
+                <w:b w:val="false"/>
+                <w:bCs w:val="false"/>
+                <w:i w:val="false"/>
+                <w:iCs w:val="false"/>
+                <w:color w:val="000000"/>
+                <w:sz w:val="18"/>
+                <w:szCs w:val="20"/>
+                <w:lang w:eastAsia="es-CL"/>
+              </w:rPr>
+            </w:pPr>
+            <w:r>
+              <w:rPr>
+                <w:rFonts w:cs="Arial"/>
+                <w:b w:val="false"/>
+                <w:bCs w:val="false"/>
+                <w:i w:val="false"/>
+                <w:iCs w:val="false"/>
+                <w:color w:val="000000"/>
+                <w:sz w:val="18"/>
+                <w:szCs w:val="20"/>
+                <w:lang w:eastAsia="es-CL"/>
+              </w:rPr>
+            </w:r>
+          </w:p>
+        </w:tc>
+        <w:tc>
+          <w:tcPr>
+            <w:tcW w:w="1813" w:type="dxa"/>
+            <w:tcBorders>
+              <w:top w:val="nil"/>
+              <w:start w:val="single" w:sz="4" w:space="0" w:color="BFBFBF"/>
+              <w:bottom w:val="single" w:sz="4" w:space="0" w:color="BFBFBF"/>
+              <w:end w:val="single" w:sz="4" w:space="0" w:color="BFBFBF"/>
+            </w:tcBorders>
+          </w:tcPr>
+          <w:p>
+            <w:pPr>
+              <w:pStyle w:val="Normal"/>
+              <w:widowControl/>
+              <w:suppressAutoHyphens w:val="true"/>
+              <w:bidi w:val="0"/>
+              <w:spacing w:before="0" w:after="160"/>
+              <w:jc w:val="start"/>
+              <w:rPr>
+                <w:rFonts w:ascii="Calibri" w:hAnsi="Calibri" w:cs="Arial"/>
+                <w:b w:val="false"/>
+                <w:bCs w:val="false"/>
+                <w:i w:val="false"/>
+                <w:iCs w:val="false"/>
+                <w:color w:val="000000"/>
+                <w:sz w:val="18"/>
+                <w:szCs w:val="20"/>
+                <w:lang w:eastAsia="es-CL"/>
+              </w:rPr>
+            </w:pPr>
+            <w:r>
+              <w:rPr>
+                <w:rFonts w:cs="Arial"/>
+                <w:b w:val="false"/>
+                <w:bCs w:val="false"/>
+                <w:i w:val="false"/>
+                <w:iCs w:val="false"/>
+                <w:color w:val="000000"/>
+                <w:sz w:val="18"/>
+                <w:szCs w:val="20"/>
+                <w:lang w:eastAsia="es-CL"/>
+              </w:rPr>
+            </w:r>
+          </w:p>
+        </w:tc>
+        <w:tc>
+          <w:tcPr>
+            <w:tcW w:w="987" w:type="dxa"/>
+            <w:tcBorders>
+              <w:top w:val="nil"/>
+              <w:start w:val="single" w:sz="4" w:space="0" w:color="BFBFBF"/>
+              <w:bottom w:val="single" w:sz="4" w:space="0" w:color="BFBFBF"/>
+              <w:end w:val="single" w:sz="4" w:space="0" w:color="FFFFFF"/>
+            </w:tcBorders>
+          </w:tcPr>
+          <w:p>
+            <w:pPr>
+              <w:pStyle w:val="Normal"/>
+              <w:widowControl/>
+              <w:suppressAutoHyphens w:val="true"/>
+              <w:bidi w:val="0"/>
+              <w:spacing w:before="0" w:after="160"/>
+              <w:jc w:val="start"/>
+              <w:rPr>
+                <w:rFonts w:ascii="Calibri" w:hAnsi="Calibri" w:cs="Arial"/>
+                <w:b w:val="false"/>
+                <w:bCs w:val="false"/>
+                <w:i w:val="false"/>
+                <w:iCs w:val="false"/>
+                <w:color w:val="000000"/>
+                <w:sz w:val="18"/>
+                <w:szCs w:val="20"/>
+                <w:lang w:eastAsia="es-CL"/>
+              </w:rPr>
+            </w:pPr>
+            <w:r>
+              <w:rPr>
+                <w:rFonts w:cs="Arial"/>
+                <w:b w:val="false"/>
+                <w:bCs w:val="false"/>
+                <w:i w:val="false"/>
+                <w:iCs w:val="false"/>
+                <w:color w:val="000000"/>
+                <w:sz w:val="18"/>
+                <w:szCs w:val="20"/>
+                <w:lang w:eastAsia="es-CL"/>
+              </w:rPr>
+            </w:r>
+          </w:p>
+        </w:tc>
+        <w:tc>
+          <w:tcPr>
+            <w:tcW w:w="1580" w:type="dxa"/>
+            <w:tcBorders>
+              <w:top w:val="nil"/>
+              <w:start w:val="single" w:sz="4" w:space="0" w:color="FFFFFF"/>
+              <w:bottom w:val="single" w:sz="4" w:space="0" w:color="BFBFBF"/>
+              <w:end w:val="single" w:sz="4" w:space="0" w:color="BFBFBF"/>
+            </w:tcBorders>
+            <w:shd w:color="auto" w:fill="D9D9D9" w:themeFill="background1" w:themeFillShade="d9" w:val="clear"/>
+          </w:tcPr>
+          <w:p>
+            <w:pPr>
+              <w:pStyle w:val="Normal"/>
+              <w:widowControl/>
+              <w:suppressAutoHyphens w:val="true"/>
+              <w:bidi w:val="0"/>
+              <w:spacing w:before="0" w:after="160"/>
+              <w:jc w:val="start"/>
+              <w:rPr>
+                <w:rFonts w:ascii="Calibri" w:hAnsi="Calibri" w:cs="Arial"/>
+                <w:b w:val="false"/>
+                <w:bCs w:val="false"/>
+                <w:i w:val="false"/>
+                <w:iCs w:val="false"/>
+                <w:color w:val="000000"/>
+                <w:sz w:val="18"/>
+                <w:szCs w:val="20"/>
+                <w:lang w:eastAsia="es-CL"/>
+              </w:rPr>
+            </w:pPr>
+            <w:r>
+              <w:rPr>
+                <w:rFonts w:cs="Arial"/>
+                <w:b w:val="false"/>
+                <w:bCs w:val="false"/>
+                <w:i w:val="false"/>
+                <w:iCs w:val="false"/>
+                <w:color w:val="000000"/>
+                <w:sz w:val="18"/>
+                <w:szCs w:val="20"/>
+                <w:lang w:eastAsia="es-CL"/>
+              </w:rPr>
+            </w:r>
+          </w:p>
+        </w:tc>
+        <w:tc>
+          <w:tcPr>
+            <w:tcW w:w="1581" w:type="dxa"/>
+            <w:tcBorders>
+              <w:top w:val="nil"/>
+              <w:start w:val="single" w:sz="4" w:space="0" w:color="BFBFBF"/>
+              <w:bottom w:val="single" w:sz="4" w:space="0" w:color="BFBFBF"/>
+              <w:end w:val="single" w:sz="4" w:space="0" w:color="BFBFBF"/>
+            </w:tcBorders>
+          </w:tcPr>
+          <w:p>
+            <w:pPr>
+              <w:pStyle w:val="Normal"/>
+              <w:widowControl/>
+              <w:suppressAutoHyphens w:val="true"/>
+              <w:bidi w:val="0"/>
+              <w:spacing w:before="0" w:after="160"/>
+              <w:jc w:val="start"/>
+              <w:rPr>
+                <w:rFonts w:ascii="Calibri" w:hAnsi="Calibri" w:cs="Arial"/>
+                <w:b w:val="false"/>
+                <w:bCs w:val="false"/>
+                <w:i w:val="false"/>
+                <w:iCs w:val="false"/>
+                <w:color w:val="000000"/>
+                <w:sz w:val="18"/>
+                <w:szCs w:val="20"/>
+                <w:lang w:eastAsia="es-CL"/>
+              </w:rPr>
+            </w:pPr>
+            <w:r>
+              <w:rPr>
+                <w:rFonts w:cs="Arial"/>
+                <w:b w:val="false"/>
+                <w:bCs w:val="false"/>
+                <w:i w:val="false"/>
+                <w:iCs w:val="false"/>
+                <w:color w:val="000000"/>
+                <w:sz w:val="18"/>
+                <w:szCs w:val="20"/>
+                <w:lang w:eastAsia="es-CL"/>
+              </w:rPr>
+            </w:r>
+          </w:p>
+        </w:tc>
+      </w:tr>
+      <w:tr>
+        <w:trPr/>
+        <w:tc>
+          <w:tcPr>
+            <w:tcW w:w="1579" w:type="dxa"/>
+            <w:tcBorders>
+              <w:top w:val="nil"/>
+              <w:start w:val="single" w:sz="4" w:space="0" w:color="BFBFBF"/>
+              <w:bottom w:val="single" w:sz="4" w:space="0" w:color="BFBFBF"/>
+              <w:end w:val="single" w:sz="4" w:space="0" w:color="BFBFBF"/>
+            </w:tcBorders>
+          </w:tcPr>
+          <w:p>
+            <w:pPr>
+              <w:pStyle w:val="Normal"/>
+              <w:widowControl/>
+              <w:suppressAutoHyphens w:val="true"/>
+              <w:bidi w:val="0"/>
+              <w:spacing w:before="0" w:after="160"/>
+              <w:jc w:val="start"/>
+              <w:rPr>
+                <w:rFonts w:ascii="Calibri" w:hAnsi="Calibri" w:cs="Arial"/>
+                <w:b w:val="false"/>
+                <w:bCs w:val="false"/>
+                <w:i w:val="false"/>
+                <w:iCs w:val="false"/>
+                <w:color w:val="000000"/>
+                <w:sz w:val="18"/>
+                <w:szCs w:val="20"/>
+                <w:lang w:eastAsia="es-CL"/>
+              </w:rPr>
+            </w:pPr>
+            <w:r>
+              <w:rPr>
+                <w:rFonts w:cs="Arial"/>
+                <w:b w:val="false"/>
+                <w:bCs w:val="false"/>
+                <w:i w:val="false"/>
+                <w:iCs w:val="false"/>
+                <w:color w:val="000000"/>
+                <w:sz w:val="18"/>
+                <w:szCs w:val="20"/>
+                <w:lang w:eastAsia="es-CL"/>
+              </w:rPr>
+            </w:r>
+          </w:p>
+        </w:tc>
+        <w:tc>
+          <w:tcPr>
+            <w:tcW w:w="1370" w:type="dxa"/>
+            <w:tcBorders>
+              <w:top w:val="nil"/>
+              <w:start w:val="single" w:sz="4" w:space="0" w:color="BFBFBF"/>
+              <w:bottom w:val="single" w:sz="4" w:space="0" w:color="BFBFBF"/>
+              <w:end w:val="single" w:sz="4" w:space="0" w:color="BFBFBF"/>
+            </w:tcBorders>
+          </w:tcPr>
+          <w:p>
+            <w:pPr>
+              <w:pStyle w:val="Normal"/>
+              <w:widowControl/>
+              <w:suppressAutoHyphens w:val="true"/>
+              <w:bidi w:val="0"/>
+              <w:spacing w:before="0" w:after="160"/>
+              <w:jc w:val="start"/>
+              <w:rPr>
+                <w:rFonts w:ascii="Calibri" w:hAnsi="Calibri" w:cs="Arial"/>
+                <w:b w:val="false"/>
+                <w:bCs w:val="false"/>
+                <w:i w:val="false"/>
+                <w:iCs w:val="false"/>
+                <w:color w:val="000000"/>
+                <w:sz w:val="18"/>
+                <w:szCs w:val="20"/>
+                <w:lang w:eastAsia="es-CL"/>
+              </w:rPr>
+            </w:pPr>
+            <w:r>
+              <w:rPr>
+                <w:rFonts w:cs="Arial"/>
+                <w:b w:val="false"/>
+                <w:bCs w:val="false"/>
+                <w:i w:val="false"/>
+                <w:iCs w:val="false"/>
+                <w:color w:val="000000"/>
+                <w:sz w:val="18"/>
+                <w:szCs w:val="20"/>
+                <w:lang w:eastAsia="es-CL"/>
+              </w:rPr>
+              <w:t>Cierre, documentación y presentación del proyecto</w:t>
+            </w:r>
+          </w:p>
+        </w:tc>
+        <w:tc>
+          <w:tcPr>
+            <w:tcW w:w="2150" w:type="dxa"/>
+            <w:tcBorders>
+              <w:top w:val="nil"/>
+              <w:start w:val="single" w:sz="4" w:space="0" w:color="BFBFBF"/>
+              <w:bottom w:val="single" w:sz="4" w:space="0" w:color="BFBFBF"/>
+              <w:end w:val="single" w:sz="4" w:space="0" w:color="BFBFBF"/>
+            </w:tcBorders>
+          </w:tcPr>
+          <w:p>
+            <w:pPr>
+              <w:pStyle w:val="Normal"/>
+              <w:widowControl/>
+              <w:suppressAutoHyphens w:val="true"/>
+              <w:bidi w:val="0"/>
+              <w:spacing w:before="0" w:after="160"/>
+              <w:jc w:val="start"/>
+              <w:rPr>
+                <w:rFonts w:ascii="Calibri" w:hAnsi="Calibri" w:cs="Arial"/>
+                <w:b w:val="false"/>
+                <w:bCs w:val="false"/>
+                <w:i w:val="false"/>
+                <w:iCs w:val="false"/>
+                <w:color w:val="000000"/>
+                <w:sz w:val="18"/>
+                <w:szCs w:val="20"/>
+                <w:lang w:eastAsia="es-CL"/>
+              </w:rPr>
+            </w:pPr>
+            <w:r>
+              <w:rPr>
+                <w:rFonts w:cs="Arial"/>
+                <w:b w:val="false"/>
+                <w:bCs w:val="false"/>
+                <w:i w:val="false"/>
+                <w:iCs w:val="false"/>
+                <w:color w:val="000000"/>
+                <w:sz w:val="18"/>
+                <w:szCs w:val="20"/>
+                <w:lang w:eastAsia="es-CL"/>
+              </w:rPr>
+            </w:r>
+          </w:p>
+        </w:tc>
+        <w:tc>
+          <w:tcPr>
+            <w:tcW w:w="1813" w:type="dxa"/>
+            <w:tcBorders>
+              <w:top w:val="nil"/>
+              <w:start w:val="single" w:sz="4" w:space="0" w:color="BFBFBF"/>
+              <w:bottom w:val="single" w:sz="4" w:space="0" w:color="BFBFBF"/>
+              <w:end w:val="single" w:sz="4" w:space="0" w:color="BFBFBF"/>
+            </w:tcBorders>
+          </w:tcPr>
+          <w:p>
+            <w:pPr>
+              <w:pStyle w:val="Normal"/>
+              <w:widowControl/>
+              <w:suppressAutoHyphens w:val="true"/>
+              <w:bidi w:val="0"/>
+              <w:spacing w:before="0" w:after="160"/>
+              <w:jc w:val="start"/>
+              <w:rPr>
+                <w:rFonts w:ascii="Calibri" w:hAnsi="Calibri" w:cs="Arial"/>
+                <w:b w:val="false"/>
+                <w:bCs w:val="false"/>
+                <w:i w:val="false"/>
+                <w:iCs w:val="false"/>
+                <w:color w:val="000000"/>
+                <w:sz w:val="18"/>
+                <w:szCs w:val="20"/>
+                <w:lang w:eastAsia="es-CL"/>
+              </w:rPr>
+            </w:pPr>
+            <w:r>
+              <w:rPr>
+                <w:rFonts w:cs="Arial"/>
+                <w:b w:val="false"/>
+                <w:bCs w:val="false"/>
+                <w:i w:val="false"/>
+                <w:iCs w:val="false"/>
+                <w:color w:val="000000"/>
+                <w:sz w:val="18"/>
+                <w:szCs w:val="20"/>
+                <w:lang w:eastAsia="es-CL"/>
+              </w:rPr>
+            </w:r>
+          </w:p>
+        </w:tc>
+        <w:tc>
+          <w:tcPr>
+            <w:tcW w:w="987" w:type="dxa"/>
+            <w:tcBorders>
+              <w:top w:val="nil"/>
+              <w:start w:val="single" w:sz="4" w:space="0" w:color="BFBFBF"/>
+              <w:bottom w:val="single" w:sz="4" w:space="0" w:color="BFBFBF"/>
+              <w:end w:val="single" w:sz="4" w:space="0" w:color="FFFFFF"/>
+            </w:tcBorders>
+          </w:tcPr>
+          <w:p>
+            <w:pPr>
+              <w:pStyle w:val="Normal"/>
+              <w:widowControl/>
+              <w:suppressAutoHyphens w:val="true"/>
+              <w:bidi w:val="0"/>
+              <w:spacing w:before="0" w:after="160"/>
+              <w:jc w:val="start"/>
+              <w:rPr>
+                <w:rFonts w:ascii="Calibri" w:hAnsi="Calibri" w:cs="Arial"/>
+                <w:b w:val="false"/>
+                <w:bCs w:val="false"/>
+                <w:i w:val="false"/>
+                <w:iCs w:val="false"/>
+                <w:color w:val="000000"/>
+                <w:sz w:val="18"/>
+                <w:szCs w:val="20"/>
+                <w:lang w:eastAsia="es-CL"/>
+              </w:rPr>
+            </w:pPr>
+            <w:r>
+              <w:rPr>
+                <w:rFonts w:cs="Arial"/>
+                <w:b w:val="false"/>
+                <w:bCs w:val="false"/>
+                <w:i w:val="false"/>
+                <w:iCs w:val="false"/>
+                <w:color w:val="000000"/>
+                <w:sz w:val="18"/>
+                <w:szCs w:val="20"/>
+                <w:lang w:eastAsia="es-CL"/>
+              </w:rPr>
+            </w:r>
+          </w:p>
+        </w:tc>
+        <w:tc>
+          <w:tcPr>
+            <w:tcW w:w="1580" w:type="dxa"/>
+            <w:tcBorders>
+              <w:top w:val="nil"/>
+              <w:start w:val="single" w:sz="4" w:space="0" w:color="FFFFFF"/>
+              <w:bottom w:val="single" w:sz="4" w:space="0" w:color="BFBFBF"/>
+              <w:end w:val="single" w:sz="4" w:space="0" w:color="BFBFBF"/>
+            </w:tcBorders>
+            <w:shd w:color="auto" w:fill="D9D9D9" w:themeFill="background1" w:themeFillShade="d9" w:val="clear"/>
+          </w:tcPr>
+          <w:p>
+            <w:pPr>
+              <w:pStyle w:val="Normal"/>
+              <w:widowControl/>
+              <w:suppressAutoHyphens w:val="true"/>
+              <w:bidi w:val="0"/>
+              <w:spacing w:before="0" w:after="160"/>
+              <w:jc w:val="start"/>
+              <w:rPr>
+                <w:rFonts w:ascii="Calibri" w:hAnsi="Calibri" w:cs="Arial"/>
+                <w:b w:val="false"/>
+                <w:bCs w:val="false"/>
+                <w:i w:val="false"/>
+                <w:iCs w:val="false"/>
+                <w:color w:val="000000"/>
+                <w:sz w:val="18"/>
+                <w:szCs w:val="20"/>
+                <w:lang w:eastAsia="es-CL"/>
+              </w:rPr>
+            </w:pPr>
+            <w:r>
+              <w:rPr>
+                <w:rFonts w:cs="Arial"/>
+                <w:b w:val="false"/>
+                <w:bCs w:val="false"/>
+                <w:i w:val="false"/>
+                <w:iCs w:val="false"/>
+                <w:color w:val="000000"/>
+                <w:sz w:val="18"/>
+                <w:szCs w:val="20"/>
+                <w:lang w:eastAsia="es-CL"/>
+              </w:rPr>
+            </w:r>
+          </w:p>
+        </w:tc>
+        <w:tc>
+          <w:tcPr>
+            <w:tcW w:w="1581" w:type="dxa"/>
+            <w:tcBorders>
+              <w:top w:val="nil"/>
+              <w:start w:val="single" w:sz="4" w:space="0" w:color="BFBFBF"/>
+              <w:bottom w:val="single" w:sz="4" w:space="0" w:color="BFBFBF"/>
+              <w:end w:val="single" w:sz="4" w:space="0" w:color="BFBFBF"/>
+            </w:tcBorders>
+          </w:tcPr>
+          <w:p>
+            <w:pPr>
+              <w:pStyle w:val="Normal"/>
+              <w:widowControl/>
+              <w:suppressAutoHyphens w:val="true"/>
+              <w:bidi w:val="0"/>
               <w:spacing w:before="0" w:after="160"/>
               <w:jc w:val="start"/>
               <w:rPr>
@@ -5777,6 +8947,9 @@
           <w:sz w:val="24"/>
           <w:szCs w:val="24"/>
         </w:rPr>
+      </w:r>
+      <w:r>
+        <w:br w:type="page"/>
       </w:r>
     </w:p>
     <w:tbl>
@@ -5815,6 +8988,7 @@
           <w:p>
             <w:pPr>
               <w:pStyle w:val="Normal"/>
+              <w:pageBreakBefore/>
               <w:widowControl/>
               <w:suppressAutoHyphens w:val="true"/>
               <w:spacing w:before="0" w:after="160"/>
@@ -5841,66 +9015,7 @@
           </w:p>
         </w:tc>
       </w:tr>
-      <w:tr>
-        <w:trPr>
-          <w:trHeight w:val="440" w:hRule="atLeast"/>
-        </w:trPr>
-        <w:tc>
-          <w:tcPr>
-            <w:tcW w:w="9640" w:type="dxa"/>
-            <w:tcBorders>
-              <w:top w:val="single" w:sz="4" w:space="0" w:color="BFBFBF"/>
-              <w:start w:val="single" w:sz="4" w:space="0" w:color="BFBFBF"/>
-              <w:bottom w:val="single" w:sz="4" w:space="0" w:color="BFBFBF"/>
-              <w:end w:val="single" w:sz="4" w:space="0" w:color="BFBFBF"/>
-            </w:tcBorders>
-            <w:shd w:color="auto" w:fill="D9E2F3" w:themeFill="accent1" w:themeFillTint="33" w:val="clear"/>
-            <w:vAlign w:val="center"/>
-          </w:tcPr>
-          <w:p>
-            <w:pPr>
-              <w:pStyle w:val="Footer"/>
-              <w:widowControl/>
-              <w:suppressAutoHyphens w:val="true"/>
-              <w:spacing w:before="0" w:after="0"/>
-              <w:jc w:val="both"/>
-              <w:rPr>
-                <w:rFonts w:ascii="Calibri" w:hAnsi="Calibri"/>
-                <w:color w:themeColor="accent1" w:themeShade="80" w:val="1F3864"/>
-              </w:rPr>
-            </w:pPr>
-            <w:r>
-              <w:rPr>
-                <w:rFonts w:eastAsia="Calibri" w:cs=""/>
-                <w:color w:themeColor="accent1" w:themeShade="80" w:val="1F3864"/>
-                <w:kern w:val="0"/>
-                <w:lang w:val="es-CL" w:eastAsia="en-US" w:bidi="ar-SA"/>
-              </w:rPr>
-              <w:t>Busca un formato de Carta Gantt que te acomode y organiza en este las actividades planificadas en el punto anterior considerando el periodo asignado para el desarrollo de tu Proyecto APT. Debes mantener la temporalidad del periodo académico en el desarrollo de las tres fases que contempla la Asignatura de Portafolio de Título.</w:t>
-            </w:r>
-          </w:p>
-        </w:tc>
-      </w:tr>
     </w:tbl>
-    <w:p>
-      <w:pPr>
-        <w:pStyle w:val="Normal"/>
-        <w:spacing w:lineRule="auto" w:line="360" w:before="0" w:after="0"/>
-        <w:jc w:val="both"/>
-        <w:rPr>
-          <w:b/>
-          <w:sz w:val="24"/>
-          <w:szCs w:val="24"/>
-        </w:rPr>
-      </w:pPr>
-      <w:r>
-        <w:rPr>
-          <w:b/>
-          <w:sz w:val="24"/>
-          <w:szCs w:val="24"/>
-        </w:rPr>
-      </w:r>
-    </w:p>
     <w:p>
       <w:pPr>
         <w:pStyle w:val="Normal"/>
@@ -5938,22 +9053,22 @@
       <w:tblGrid>
         <w:gridCol w:w="1351"/>
         <w:gridCol w:w="536"/>
+        <w:gridCol w:w="518"/>
+        <w:gridCol w:w="524"/>
+        <w:gridCol w:w="525"/>
+        <w:gridCol w:w="526"/>
+        <w:gridCol w:w="524"/>
+        <w:gridCol w:w="523"/>
+        <w:gridCol w:w="523"/>
         <w:gridCol w:w="519"/>
         <w:gridCol w:w="523"/>
         <w:gridCol w:w="526"/>
-        <w:gridCol w:w="525"/>
-        <w:gridCol w:w="524"/>
-        <w:gridCol w:w="523"/>
-        <w:gridCol w:w="523"/>
-        <w:gridCol w:w="520"/>
-        <w:gridCol w:w="523"/>
-        <w:gridCol w:w="525"/>
         <w:gridCol w:w="524"/>
         <w:gridCol w:w="525"/>
         <w:gridCol w:w="525"/>
         <w:gridCol w:w="525"/>
-        <w:gridCol w:w="4"/>
-        <w:gridCol w:w="521"/>
+        <w:gridCol w:w="3"/>
+        <w:gridCol w:w="522"/>
         <w:gridCol w:w="525"/>
         <w:gridCol w:w="525"/>
         <w:gridCol w:w="10"/>
@@ -6001,7 +9116,7 @@
         </w:tc>
         <w:tc>
           <w:tcPr>
-            <w:tcW w:w="2104" w:type="dxa"/>
+            <w:tcW w:w="2103" w:type="dxa"/>
             <w:gridSpan w:val="4"/>
             <w:tcBorders>
               <w:top w:val="single" w:sz="4" w:space="0" w:color="BFBFBF"/>
@@ -6077,7 +9192,7 @@
         </w:tc>
         <w:tc>
           <w:tcPr>
-            <w:tcW w:w="1581" w:type="dxa"/>
+            <w:tcW w:w="1582" w:type="dxa"/>
             <w:gridSpan w:val="4"/>
             <w:tcBorders>
               <w:top w:val="single" w:sz="4" w:space="0" w:color="BFBFBF"/>
@@ -6190,7 +9305,7 @@
         </w:tc>
         <w:tc>
           <w:tcPr>
-            <w:tcW w:w="519" w:type="dxa"/>
+            <w:tcW w:w="518" w:type="dxa"/>
             <w:tcBorders>
               <w:top w:val="single" w:sz="4" w:space="0" w:color="BFBFBF"/>
               <w:start w:val="single" w:sz="4" w:space="0" w:color="BFBFBF"/>
@@ -6226,7 +9341,7 @@
         </w:tc>
         <w:tc>
           <w:tcPr>
-            <w:tcW w:w="523" w:type="dxa"/>
+            <w:tcW w:w="524" w:type="dxa"/>
             <w:tcBorders>
               <w:top w:val="single" w:sz="4" w:space="0" w:color="BFBFBF"/>
               <w:start w:val="single" w:sz="4" w:space="0" w:color="BFBFBF"/>
@@ -6262,7 +9377,7 @@
         </w:tc>
         <w:tc>
           <w:tcPr>
-            <w:tcW w:w="526" w:type="dxa"/>
+            <w:tcW w:w="525" w:type="dxa"/>
             <w:tcBorders>
               <w:top w:val="single" w:sz="4" w:space="0" w:color="BFBFBF"/>
               <w:start w:val="single" w:sz="4" w:space="0" w:color="BFBFBF"/>
@@ -6298,7 +9413,7 @@
         </w:tc>
         <w:tc>
           <w:tcPr>
-            <w:tcW w:w="525" w:type="dxa"/>
+            <w:tcW w:w="526" w:type="dxa"/>
             <w:tcBorders>
               <w:top w:val="single" w:sz="4" w:space="0" w:color="BFBFBF"/>
               <w:start w:val="single" w:sz="4" w:space="0" w:color="BFBFBF"/>
@@ -6442,7 +9557,7 @@
         </w:tc>
         <w:tc>
           <w:tcPr>
-            <w:tcW w:w="520" w:type="dxa"/>
+            <w:tcW w:w="519" w:type="dxa"/>
             <w:tcBorders>
               <w:top w:val="single" w:sz="4" w:space="0" w:color="BFBFBF"/>
               <w:start w:val="single" w:sz="4" w:space="0" w:color="BFBFBF"/>
@@ -6514,7 +9629,7 @@
         </w:tc>
         <w:tc>
           <w:tcPr>
-            <w:tcW w:w="525" w:type="dxa"/>
+            <w:tcW w:w="526" w:type="dxa"/>
             <w:tcBorders>
               <w:top w:val="single" w:sz="4" w:space="0" w:color="BFBFBF"/>
               <w:start w:val="single" w:sz="4" w:space="0" w:color="BFBFBF"/>
@@ -6905,7 +10020,7 @@
         </w:tc>
         <w:tc>
           <w:tcPr>
-            <w:tcW w:w="519" w:type="dxa"/>
+            <w:tcW w:w="518" w:type="dxa"/>
             <w:tcBorders>
               <w:top w:val="single" w:sz="4" w:space="0" w:color="BFBFBF"/>
               <w:start w:val="single" w:sz="4" w:space="0" w:color="BFBFBF"/>
@@ -6937,7 +10052,7 @@
         </w:tc>
         <w:tc>
           <w:tcPr>
-            <w:tcW w:w="523" w:type="dxa"/>
+            <w:tcW w:w="524" w:type="dxa"/>
             <w:tcBorders>
               <w:top w:val="single" w:sz="4" w:space="0" w:color="BFBFBF"/>
               <w:start w:val="single" w:sz="4" w:space="0" w:color="BFBFBF"/>
@@ -6969,7 +10084,7 @@
         </w:tc>
         <w:tc>
           <w:tcPr>
-            <w:tcW w:w="526" w:type="dxa"/>
+            <w:tcW w:w="525" w:type="dxa"/>
             <w:tcBorders>
               <w:top w:val="single" w:sz="4" w:space="0" w:color="BFBFBF"/>
               <w:start w:val="single" w:sz="4" w:space="0" w:color="BFBFBF"/>
@@ -7001,7 +10116,7 @@
         </w:tc>
         <w:tc>
           <w:tcPr>
-            <w:tcW w:w="525" w:type="dxa"/>
+            <w:tcW w:w="526" w:type="dxa"/>
             <w:tcBorders>
               <w:top w:val="single" w:sz="4" w:space="0" w:color="BFBFBF"/>
               <w:start w:val="single" w:sz="4" w:space="0" w:color="BFBFBF"/>
@@ -7129,7 +10244,7 @@
         </w:tc>
         <w:tc>
           <w:tcPr>
-            <w:tcW w:w="520" w:type="dxa"/>
+            <w:tcW w:w="519" w:type="dxa"/>
             <w:tcBorders>
               <w:top w:val="single" w:sz="4" w:space="0" w:color="BFBFBF"/>
               <w:start w:val="single" w:sz="4" w:space="0" w:color="BFBFBF"/>
@@ -7193,7 +10308,7 @@
         </w:tc>
         <w:tc>
           <w:tcPr>
-            <w:tcW w:w="525" w:type="dxa"/>
+            <w:tcW w:w="526" w:type="dxa"/>
             <w:tcBorders>
               <w:top w:val="single" w:sz="4" w:space="0" w:color="BFBFBF"/>
               <w:start w:val="single" w:sz="4" w:space="0" w:color="BFBFBF"/>
@@ -7547,7 +10662,7 @@
         </w:tc>
         <w:tc>
           <w:tcPr>
-            <w:tcW w:w="519" w:type="dxa"/>
+            <w:tcW w:w="518" w:type="dxa"/>
             <w:tcBorders>
               <w:top w:val="single" w:sz="4" w:space="0" w:color="BFBFBF"/>
               <w:start w:val="single" w:sz="4" w:space="0" w:color="BFBFBF"/>
@@ -7579,7 +10694,7 @@
         </w:tc>
         <w:tc>
           <w:tcPr>
-            <w:tcW w:w="523" w:type="dxa"/>
+            <w:tcW w:w="524" w:type="dxa"/>
             <w:tcBorders>
               <w:top w:val="single" w:sz="4" w:space="0" w:color="BFBFBF"/>
               <w:start w:val="single" w:sz="4" w:space="0" w:color="BFBFBF"/>
@@ -7611,7 +10726,7 @@
         </w:tc>
         <w:tc>
           <w:tcPr>
-            <w:tcW w:w="526" w:type="dxa"/>
+            <w:tcW w:w="525" w:type="dxa"/>
             <w:tcBorders>
               <w:top w:val="single" w:sz="4" w:space="0" w:color="BFBFBF"/>
               <w:start w:val="single" w:sz="4" w:space="0" w:color="BFBFBF"/>
@@ -7643,7 +10758,7 @@
         </w:tc>
         <w:tc>
           <w:tcPr>
-            <w:tcW w:w="525" w:type="dxa"/>
+            <w:tcW w:w="526" w:type="dxa"/>
             <w:tcBorders>
               <w:top w:val="single" w:sz="4" w:space="0" w:color="BFBFBF"/>
               <w:start w:val="single" w:sz="4" w:space="0" w:color="BFBFBF"/>
@@ -7771,7 +10886,7 @@
         </w:tc>
         <w:tc>
           <w:tcPr>
-            <w:tcW w:w="520" w:type="dxa"/>
+            <w:tcW w:w="519" w:type="dxa"/>
             <w:tcBorders>
               <w:top w:val="single" w:sz="4" w:space="0" w:color="BFBFBF"/>
               <w:start w:val="single" w:sz="4" w:space="0" w:color="BFBFBF"/>
@@ -7835,7 +10950,7 @@
         </w:tc>
         <w:tc>
           <w:tcPr>
-            <w:tcW w:w="525" w:type="dxa"/>
+            <w:tcW w:w="526" w:type="dxa"/>
             <w:tcBorders>
               <w:top w:val="single" w:sz="4" w:space="0" w:color="BFBFBF"/>
               <w:start w:val="single" w:sz="4" w:space="0" w:color="BFBFBF"/>
@@ -8189,7 +11304,7 @@
         </w:tc>
         <w:tc>
           <w:tcPr>
-            <w:tcW w:w="519" w:type="dxa"/>
+            <w:tcW w:w="518" w:type="dxa"/>
             <w:tcBorders>
               <w:top w:val="single" w:sz="4" w:space="0" w:color="BFBFBF"/>
               <w:start w:val="single" w:sz="4" w:space="0" w:color="BFBFBF"/>
@@ -8221,7 +11336,7 @@
         </w:tc>
         <w:tc>
           <w:tcPr>
-            <w:tcW w:w="523" w:type="dxa"/>
+            <w:tcW w:w="524" w:type="dxa"/>
             <w:tcBorders>
               <w:top w:val="single" w:sz="4" w:space="0" w:color="BFBFBF"/>
               <w:start w:val="single" w:sz="4" w:space="0" w:color="BFBFBF"/>
@@ -8253,7 +11368,7 @@
         </w:tc>
         <w:tc>
           <w:tcPr>
-            <w:tcW w:w="526" w:type="dxa"/>
+            <w:tcW w:w="525" w:type="dxa"/>
             <w:tcBorders>
               <w:top w:val="single" w:sz="4" w:space="0" w:color="BFBFBF"/>
               <w:start w:val="single" w:sz="4" w:space="0" w:color="BFBFBF"/>
@@ -8285,7 +11400,7 @@
         </w:tc>
         <w:tc>
           <w:tcPr>
-            <w:tcW w:w="525" w:type="dxa"/>
+            <w:tcW w:w="526" w:type="dxa"/>
             <w:tcBorders>
               <w:top w:val="single" w:sz="4" w:space="0" w:color="BFBFBF"/>
               <w:start w:val="single" w:sz="4" w:space="0" w:color="BFBFBF"/>
@@ -8413,7 +11528,7 @@
         </w:tc>
         <w:tc>
           <w:tcPr>
-            <w:tcW w:w="520" w:type="dxa"/>
+            <w:tcW w:w="519" w:type="dxa"/>
             <w:tcBorders>
               <w:top w:val="single" w:sz="4" w:space="0" w:color="BFBFBF"/>
               <w:start w:val="single" w:sz="4" w:space="0" w:color="BFBFBF"/>
@@ -8477,7 +11592,7 @@
         </w:tc>
         <w:tc>
           <w:tcPr>
-            <w:tcW w:w="525" w:type="dxa"/>
+            <w:tcW w:w="526" w:type="dxa"/>
             <w:tcBorders>
               <w:top w:val="single" w:sz="4" w:space="0" w:color="BFBFBF"/>
               <w:start w:val="single" w:sz="4" w:space="0" w:color="BFBFBF"/>
@@ -8873,8 +11988,8 @@
       <w:tblLook w:val="04a0" w:firstRow="1" w:noVBand="1" w:lastRow="0" w:firstColumn="1" w:lastColumn="0" w:noHBand="0"/>
     </w:tblPr>
     <w:tblGrid>
-      <w:gridCol w:w="5704"/>
-      <w:gridCol w:w="4219"/>
+      <w:gridCol w:w="5703"/>
+      <w:gridCol w:w="4220"/>
     </w:tblGrid>
     <w:tr>
       <w:trPr>
@@ -8882,7 +11997,7 @@
       </w:trPr>
       <w:tc>
         <w:tcPr>
-          <w:tcW w:w="5704" w:type="dxa"/>
+          <w:tcW w:w="5703" w:type="dxa"/>
           <w:tcBorders>
             <w:top w:val="nil"/>
             <w:start w:val="nil"/>
@@ -8949,7 +12064,7 @@
       </w:tc>
       <w:tc>
         <w:tcPr>
-          <w:tcW w:w="4219" w:type="dxa"/>
+          <w:tcW w:w="4220" w:type="dxa"/>
           <w:tcBorders>
             <w:top w:val="nil"/>
             <w:start w:val="nil"/>
@@ -9047,8 +12162,8 @@
       <w:tblLook w:val="04a0" w:firstRow="1" w:noVBand="1" w:lastRow="0" w:firstColumn="1" w:lastColumn="0" w:noHBand="0"/>
     </w:tblPr>
     <w:tblGrid>
-      <w:gridCol w:w="5704"/>
-      <w:gridCol w:w="4219"/>
+      <w:gridCol w:w="5703"/>
+      <w:gridCol w:w="4220"/>
     </w:tblGrid>
     <w:tr>
       <w:trPr>
@@ -9056,7 +12171,7 @@
       </w:trPr>
       <w:tc>
         <w:tcPr>
-          <w:tcW w:w="5704" w:type="dxa"/>
+          <w:tcW w:w="5703" w:type="dxa"/>
           <w:tcBorders>
             <w:top w:val="nil"/>
             <w:start w:val="nil"/>
@@ -9123,7 +12238,7 @@
       </w:tc>
       <w:tc>
         <w:tcPr>
-          <w:tcW w:w="4219" w:type="dxa"/>
+          <w:tcW w:w="4220" w:type="dxa"/>
           <w:tcBorders>
             <w:top w:val="nil"/>
             <w:start w:val="nil"/>
@@ -10060,16 +13175,16 @@
       <w:lang w:val="es-ES"/>
     </w:rPr>
   </w:style>
-  <w:style w:type="character" w:styleId="FootnoteCharacters">
-    <w:name w:val="Footnote Characters"/>
+  <w:style w:type="character" w:styleId="FootnoteCharactersuser">
+    <w:name w:val="Footnote Characters (user)"/>
     <w:unhideWhenUsed/>
     <w:rsid w:val="00d110ec"/>
     <w:rPr>
       <w:vertAlign w:val="superscript"/>
     </w:rPr>
   </w:style>
-  <w:style w:type="character" w:styleId="FootnoteCharactersuser">
-    <w:name w:val="Footnote Characters (user)"/>
+  <w:style w:type="character" w:styleId="FootnoteCharacters">
+    <w:name w:val="Footnote Characters"/>
     <w:rPr>
       <w:vertAlign w:val="superscript"/>
     </w:rPr>
@@ -10152,14 +13267,14 @@
     <w:name w:val="Numbering Symbols"/>
     <w:rPr/>
   </w:style>
-  <w:style w:type="character" w:styleId="EndnoteCharactersuser">
-    <w:name w:val="Endnote Characters (user)"/>
+  <w:style w:type="character" w:styleId="EndnoteCharacters">
+    <w:name w:val="Endnote Characters"/>
     <w:rPr>
       <w:vertAlign w:val="superscript"/>
     </w:rPr>
   </w:style>
-  <w:style w:type="character" w:styleId="EndnoteCharacters">
-    <w:name w:val="Endnote Characters"/>
+  <w:style w:type="character" w:styleId="EndnoteCharactersuser">
+    <w:name w:val="Endnote Characters (user)"/>
     <w:rPr/>
   </w:style>
   <w:style w:type="character" w:styleId="EndnoteReference">
@@ -10341,8 +13456,8 @@
       <w:bCs/>
     </w:rPr>
   </w:style>
-  <w:style w:type="paragraph" w:styleId="FrameContents">
-    <w:name w:val="Frame Contents"/>
+  <w:style w:type="paragraph" w:styleId="FrameContentsuser">
+    <w:name w:val="Frame Contents (user)"/>
     <w:basedOn w:val="Normal"/>
     <w:pPr/>
     <w:rPr/>
@@ -10368,8 +13483,8 @@
       <w:bCs/>
     </w:rPr>
   </w:style>
-  <w:style w:type="paragraph" w:styleId="FrameContentsuser">
-    <w:name w:val="Frame Contents (user)"/>
+  <w:style w:type="paragraph" w:styleId="FrameContents">
+    <w:name w:val="Frame Contents"/>
     <w:basedOn w:val="Normal"/>
     <w:pPr/>
     <w:rPr/>

</xml_diff>